<commit_message>
Added title page info
</commit_message>
<xml_diff>
--- a/paRsynth_methods_draft.docx
+++ b/paRsynth_methods_draft.docx
@@ -3,27 +3,598 @@
 <w:document xmlns:wpc="http://schemas.microsoft.com/office/word/2010/wordprocessingCanvas" xmlns:cx="http://schemas.microsoft.com/office/drawing/2014/chartex" xmlns:cx1="http://schemas.microsoft.com/office/drawing/2015/9/8/chartex" xmlns:cx2="http://schemas.microsoft.com/office/drawing/2015/10/21/chartex" xmlns:cx3="http://schemas.microsoft.com/office/drawing/2016/5/9/chartex" xmlns:cx4="http://schemas.microsoft.com/office/drawing/2016/5/10/chartex" xmlns:cx5="http://schemas.microsoft.com/office/drawing/2016/5/11/chartex" xmlns:cx6="http://schemas.microsoft.com/office/drawing/2016/5/12/chartex" xmlns:cx7="http://schemas.microsoft.com/office/drawing/2016/5/13/chartex" xmlns:cx8="http://schemas.microsoft.com/office/drawing/2016/5/14/chartex" xmlns:mc="http://schemas.openxmlformats.org/markup-compatibility/2006" xmlns:aink="http://schemas.microsoft.com/office/drawing/2016/ink" xmlns:am3d="http://schemas.microsoft.com/office/drawing/2017/model3d" xmlns:o="urn:schemas-microsoft-com:office:office" xmlns:oel="http://schemas.microsoft.com/office/2019/extlst" xmlns:r="http://schemas.openxmlformats.org/officeDocument/2006/relationships" xmlns:m="http://schemas.openxmlformats.org/officeDocument/2006/math" xmlns:v="urn:schemas-microsoft-com:vml" xmlns:wp14="http://schemas.microsoft.com/office/word/2010/wordprocessingDrawing" xmlns:wp="http://schemas.openxmlformats.org/drawingml/2006/wordprocessingDrawing" xmlns:w10="urn:schemas-microsoft-com:office:word" xmlns:w="http://schemas.openxmlformats.org/wordprocessingml/2006/main" xmlns:w14="http://schemas.microsoft.com/office/word/2010/wordml" xmlns:w15="http://schemas.microsoft.com/office/word/2012/wordml" xmlns:w16cex="http://schemas.microsoft.com/office/word/2018/wordml/cex" xmlns:w16cid="http://schemas.microsoft.com/office/word/2016/wordml/cid" xmlns:w16="http://schemas.microsoft.com/office/word/2018/wordml" xmlns:w16du="http://schemas.microsoft.com/office/word/2023/wordml/word16du" xmlns:w16sdtdh="http://schemas.microsoft.com/office/word/2020/wordml/sdtdatahash" xmlns:w16se="http://schemas.microsoft.com/office/word/2015/wordml/symex" xmlns:wpg="http://schemas.microsoft.com/office/word/2010/wordprocessingGroup" xmlns:wpi="http://schemas.microsoft.com/office/word/2010/wordprocessingInk" xmlns:wne="http://schemas.microsoft.com/office/word/2006/wordml" xmlns:wps="http://schemas.microsoft.com/office/word/2010/wordprocessingShape" mc:Ignorable="w14 w15 w16se w16cid w16 w16cex w16sdtdh w16du wp14">
   <w:body>
     <w:p>
-      <w:r>
-        <w:t>TKTKTKTKTK</w:t>
-      </w:r>
-    </w:p>
-    <w:p/>
-    <w:p>
-      <w:r>
-        <w:t>TKTKTKTK</w:t>
-      </w:r>
-    </w:p>
-    <w:p/>
-    <w:p>
-      <w:r>
-        <w:t>Anoth</w:t>
-      </w:r>
-      <w:r>
-        <w:t>e</w:t>
-      </w:r>
-      <w:r>
-        <w:t>r change</w:t>
-      </w:r>
+      <w:pPr>
+        <w:rPr>
+          <w:rFonts w:ascii="Arial" w:hAnsi="Arial" w:cs="Arial"/>
+        </w:rPr>
+      </w:pPr>
+      <w:r>
+        <w:rPr>
+          <w:rFonts w:ascii="Arial" w:hAnsi="Arial" w:cs="Arial"/>
+          <w:b/>
+          <w:bCs/>
+        </w:rPr>
+        <w:t>Title</w:t>
+      </w:r>
+      <w:r>
+        <w:rPr>
+          <w:rFonts w:ascii="Arial" w:hAnsi="Arial" w:cs="Arial"/>
+        </w:rPr>
+        <w:t>:</w:t>
+      </w:r>
+      <w:r>
+        <w:rPr>
+          <w:rFonts w:ascii="Arial" w:hAnsi="Arial" w:cs="Arial"/>
+        </w:rPr>
+        <w:t xml:space="preserve"> TKTK</w:t>
+      </w:r>
+    </w:p>
+    <w:p>
+      <w:pPr>
+        <w:rPr>
+          <w:rFonts w:ascii="Arial" w:hAnsi="Arial" w:cs="Arial"/>
+        </w:rPr>
+      </w:pPr>
+    </w:p>
+    <w:p>
+      <w:pPr>
+        <w:rPr>
+          <w:rFonts w:ascii="Arial" w:hAnsi="Arial" w:cs="Arial"/>
+        </w:rPr>
+      </w:pPr>
+      <w:r>
+        <w:rPr>
+          <w:rFonts w:ascii="Arial" w:hAnsi="Arial" w:cs="Arial"/>
+          <w:b/>
+          <w:bCs/>
+        </w:rPr>
+        <w:t>Running Title</w:t>
+      </w:r>
+      <w:r>
+        <w:rPr>
+          <w:rFonts w:ascii="Arial" w:hAnsi="Arial" w:cs="Arial"/>
+        </w:rPr>
+        <w:t>:</w:t>
+      </w:r>
+      <w:r>
+        <w:rPr>
+          <w:rFonts w:ascii="Arial" w:hAnsi="Arial" w:cs="Arial"/>
+        </w:rPr>
+        <w:t xml:space="preserve"> </w:t>
+      </w:r>
+      <w:r>
+        <w:rPr>
+          <w:rFonts w:ascii="Arial" w:hAnsi="Arial" w:cs="Arial"/>
+        </w:rPr>
+        <w:t>TKTK</w:t>
+      </w:r>
+      <w:r>
+        <w:rPr>
+          <w:rFonts w:ascii="Arial" w:hAnsi="Arial" w:cs="Arial"/>
+        </w:rPr>
+        <w:t xml:space="preserve"> </w:t>
+      </w:r>
+      <w:proofErr w:type="spellStart"/>
+      <w:r>
+        <w:rPr>
+          <w:rFonts w:ascii="Arial" w:hAnsi="Arial" w:cs="Arial"/>
+        </w:rPr>
+        <w:t>paRsynth</w:t>
+      </w:r>
+      <w:proofErr w:type="spellEnd"/>
+      <w:r>
+        <w:rPr>
+          <w:rFonts w:ascii="Arial" w:hAnsi="Arial" w:cs="Arial"/>
+        </w:rPr>
+        <w:t xml:space="preserve"> methods</w:t>
+      </w:r>
+    </w:p>
+    <w:p>
+      <w:pPr>
+        <w:rPr>
+          <w:rFonts w:ascii="Arial" w:hAnsi="Arial" w:cs="Arial"/>
+        </w:rPr>
+      </w:pPr>
+    </w:p>
+    <w:p>
+      <w:pPr>
+        <w:rPr>
+          <w:rFonts w:ascii="Arial" w:hAnsi="Arial" w:cs="Arial"/>
+        </w:rPr>
+      </w:pPr>
+      <w:r>
+        <w:rPr>
+          <w:rFonts w:ascii="Arial" w:hAnsi="Arial" w:cs="Arial"/>
+          <w:b/>
+          <w:bCs/>
+        </w:rPr>
+        <w:t>Authors</w:t>
+      </w:r>
+      <w:r>
+        <w:rPr>
+          <w:rFonts w:ascii="Arial" w:hAnsi="Arial" w:cs="Arial"/>
+        </w:rPr>
+        <w:t>:</w:t>
+      </w:r>
+      <w:r>
+        <w:rPr>
+          <w:rFonts w:ascii="Arial" w:hAnsi="Arial" w:cs="Arial"/>
+        </w:rPr>
+        <w:t xml:space="preserve"> Coppinger, B.A.</w:t>
+      </w:r>
+      <w:r>
+        <w:rPr>
+          <w:rFonts w:ascii="Arial" w:hAnsi="Arial" w:cs="Arial"/>
+        </w:rPr>
+        <w:t xml:space="preserve">, </w:t>
+      </w:r>
+      <w:r>
+        <w:rPr>
+          <w:rFonts w:ascii="Arial" w:hAnsi="Arial" w:cs="Arial"/>
+        </w:rPr>
+        <w:t>*Cross, A., *</w:t>
+      </w:r>
+      <w:r>
+        <w:rPr>
+          <w:rFonts w:ascii="Arial" w:hAnsi="Arial" w:cs="Arial"/>
+        </w:rPr>
+        <w:t xml:space="preserve">Samman, R., </w:t>
+      </w:r>
+      <w:r>
+        <w:rPr>
+          <w:rFonts w:ascii="Arial" w:hAnsi="Arial" w:cs="Arial"/>
+        </w:rPr>
+        <w:t>*</w:t>
+      </w:r>
+      <w:r>
+        <w:rPr>
+          <w:rFonts w:ascii="Arial" w:hAnsi="Arial" w:cs="Arial"/>
+        </w:rPr>
+        <w:t>Ju</w:t>
+      </w:r>
+      <w:r>
+        <w:rPr>
+          <w:rFonts w:ascii="Arial" w:hAnsi="Arial" w:cs="Arial"/>
+        </w:rPr>
+        <w:t>á</w:t>
+      </w:r>
+      <w:r>
+        <w:rPr>
+          <w:rFonts w:ascii="Arial" w:hAnsi="Arial" w:cs="Arial"/>
+        </w:rPr>
+        <w:t xml:space="preserve">rez, </w:t>
+      </w:r>
+      <w:r>
+        <w:rPr>
+          <w:rFonts w:ascii="Arial" w:hAnsi="Arial" w:cs="Arial"/>
+        </w:rPr>
+        <w:t xml:space="preserve">A., </w:t>
+      </w:r>
+      <w:r>
+        <w:rPr>
+          <w:rFonts w:ascii="Arial" w:hAnsi="Arial" w:cs="Arial"/>
+        </w:rPr>
+        <w:t xml:space="preserve">*Eckhardt, S.G., </w:t>
+      </w:r>
+      <w:r>
+        <w:rPr>
+          <w:rFonts w:ascii="Arial" w:hAnsi="Arial" w:cs="Arial"/>
+        </w:rPr>
+        <w:t>*</w:t>
+      </w:r>
+      <w:r>
+        <w:rPr>
+          <w:rFonts w:ascii="Arial" w:hAnsi="Arial" w:cs="Arial"/>
+        </w:rPr>
+        <w:t xml:space="preserve">Ferdinand, V., </w:t>
+      </w:r>
+      <w:r>
+        <w:rPr>
+          <w:rFonts w:ascii="Arial" w:hAnsi="Arial" w:cs="Arial"/>
+        </w:rPr>
+        <w:t>Smith-Vidaurre, G.</w:t>
+      </w:r>
+    </w:p>
+    <w:p>
+      <w:pPr>
+        <w:rPr>
+          <w:rFonts w:ascii="Arial" w:hAnsi="Arial" w:cs="Arial"/>
+        </w:rPr>
+      </w:pPr>
+    </w:p>
+    <w:p>
+      <w:pPr>
+        <w:rPr>
+          <w:rFonts w:ascii="Arial" w:hAnsi="Arial" w:cs="Arial"/>
+        </w:rPr>
+      </w:pPr>
+      <w:r>
+        <w:rPr>
+          <w:rFonts w:ascii="Arial" w:hAnsi="Arial" w:cs="Arial"/>
+          <w:b/>
+          <w:bCs/>
+        </w:rPr>
+        <w:t>Affiliations</w:t>
+      </w:r>
+      <w:r>
+        <w:rPr>
+          <w:rFonts w:ascii="Arial" w:hAnsi="Arial" w:cs="Arial"/>
+        </w:rPr>
+        <w:t>:</w:t>
+      </w:r>
+      <w:r>
+        <w:rPr>
+          <w:rFonts w:ascii="Arial" w:hAnsi="Arial" w:cs="Arial"/>
+        </w:rPr>
+        <w:t xml:space="preserve"> TKTK update</w:t>
+      </w:r>
+    </w:p>
+    <w:p>
+      <w:pPr>
+        <w:rPr>
+          <w:rFonts w:ascii="Arial" w:hAnsi="Arial" w:cs="Arial"/>
+        </w:rPr>
+      </w:pPr>
+    </w:p>
+    <w:p>
+      <w:pPr>
+        <w:pStyle w:val="BodyA"/>
+        <w:rPr>
+          <w:rFonts w:ascii="Arial" w:eastAsia="Arial" w:hAnsi="Arial" w:cs="Arial"/>
+          <w:sz w:val="24"/>
+          <w:szCs w:val="24"/>
+        </w:rPr>
+      </w:pPr>
+      <w:r>
+        <w:rPr>
+          <w:rFonts w:ascii="Arial" w:hAnsi="Arial" w:cs="Arial"/>
+          <w:sz w:val="24"/>
+          <w:szCs w:val="24"/>
+          <w:vertAlign w:val="superscript"/>
+        </w:rPr>
+        <w:t>1</w:t>
+      </w:r>
+      <w:r>
+        <w:rPr>
+          <w:rFonts w:ascii="Arial" w:hAnsi="Arial" w:cs="Arial"/>
+          <w:sz w:val="24"/>
+          <w:szCs w:val="24"/>
+        </w:rPr>
+        <w:t>Department of Integrative Biology</w:t>
+      </w:r>
+      <w:r>
+        <w:rPr>
+          <w:rFonts w:ascii="Arial" w:hAnsi="Arial" w:cs="Arial"/>
+          <w:sz w:val="24"/>
+          <w:szCs w:val="24"/>
+        </w:rPr>
+        <w:t xml:space="preserve">, </w:t>
+      </w:r>
+      <w:r>
+        <w:rPr>
+          <w:rFonts w:ascii="Arial" w:hAnsi="Arial" w:cs="Arial"/>
+          <w:sz w:val="24"/>
+          <w:szCs w:val="24"/>
+        </w:rPr>
+        <w:t>Michigan State University, East Lansing, MI USA</w:t>
+      </w:r>
+    </w:p>
+    <w:p>
+      <w:pPr>
+        <w:pStyle w:val="BodyA"/>
+        <w:rPr>
+          <w:rFonts w:ascii="Arial" w:eastAsia="Arial" w:hAnsi="Arial" w:cs="Arial"/>
+          <w:sz w:val="24"/>
+          <w:szCs w:val="24"/>
+        </w:rPr>
+      </w:pPr>
+      <w:r>
+        <w:rPr>
+          <w:rFonts w:ascii="Arial" w:hAnsi="Arial" w:cs="Arial"/>
+          <w:sz w:val="24"/>
+          <w:szCs w:val="24"/>
+          <w:vertAlign w:val="superscript"/>
+        </w:rPr>
+        <w:t>2</w:t>
+      </w:r>
+      <w:r>
+        <w:rPr>
+          <w:rFonts w:ascii="Arial" w:hAnsi="Arial" w:cs="Arial"/>
+          <w:sz w:val="24"/>
+          <w:szCs w:val="24"/>
+        </w:rPr>
+        <w:t>Department of Computational Mathematics, Science, and Engineering</w:t>
+      </w:r>
+      <w:r>
+        <w:rPr>
+          <w:rFonts w:ascii="Arial" w:hAnsi="Arial" w:cs="Arial"/>
+          <w:sz w:val="24"/>
+          <w:szCs w:val="24"/>
+        </w:rPr>
+        <w:t xml:space="preserve">, </w:t>
+      </w:r>
+      <w:r>
+        <w:rPr>
+          <w:rFonts w:ascii="Arial" w:hAnsi="Arial" w:cs="Arial"/>
+          <w:sz w:val="24"/>
+          <w:szCs w:val="24"/>
+        </w:rPr>
+        <w:t>Michigan State University, East Lansing, MI USA</w:t>
+      </w:r>
+    </w:p>
+    <w:p>
+      <w:pPr>
+        <w:pStyle w:val="BodyA"/>
+        <w:rPr>
+          <w:rFonts w:ascii="Arial" w:eastAsia="Arial" w:hAnsi="Arial" w:cs="Arial"/>
+          <w:sz w:val="24"/>
+          <w:szCs w:val="24"/>
+        </w:rPr>
+      </w:pPr>
+      <w:r>
+        <w:rPr>
+          <w:rFonts w:ascii="Arial" w:hAnsi="Arial" w:cs="Arial"/>
+          <w:sz w:val="24"/>
+          <w:szCs w:val="24"/>
+          <w:vertAlign w:val="superscript"/>
+        </w:rPr>
+        <w:t>3</w:t>
+      </w:r>
+      <w:r>
+        <w:rPr>
+          <w:rFonts w:ascii="Arial" w:hAnsi="Arial" w:cs="Arial"/>
+          <w:sz w:val="24"/>
+          <w:szCs w:val="24"/>
+        </w:rPr>
+        <w:t>Ecology, Evolution, and Behavior Program</w:t>
+      </w:r>
+      <w:r>
+        <w:rPr>
+          <w:rFonts w:ascii="Arial" w:eastAsia="Arial" w:hAnsi="Arial" w:cs="Arial"/>
+          <w:sz w:val="24"/>
+          <w:szCs w:val="24"/>
+        </w:rPr>
+        <w:t xml:space="preserve">, </w:t>
+      </w:r>
+      <w:r>
+        <w:rPr>
+          <w:rFonts w:ascii="Arial" w:hAnsi="Arial" w:cs="Arial"/>
+          <w:sz w:val="24"/>
+          <w:szCs w:val="24"/>
+        </w:rPr>
+        <w:t>Michigan State University, East Lansing, MI USA</w:t>
+      </w:r>
+    </w:p>
+    <w:p>
+      <w:pPr>
+        <w:rPr>
+          <w:rFonts w:ascii="Arial" w:hAnsi="Arial" w:cs="Arial"/>
+        </w:rPr>
+      </w:pPr>
+    </w:p>
+    <w:p>
+      <w:pPr>
+        <w:rPr>
+          <w:rFonts w:ascii="Arial" w:hAnsi="Arial" w:cs="Arial"/>
+        </w:rPr>
+      </w:pPr>
+      <w:r>
+        <w:rPr>
+          <w:rFonts w:ascii="Arial" w:hAnsi="Arial" w:cs="Arial"/>
+          <w:b/>
+          <w:bCs/>
+        </w:rPr>
+        <w:t>Target Journal</w:t>
+      </w:r>
+      <w:r>
+        <w:rPr>
+          <w:rFonts w:ascii="Arial" w:hAnsi="Arial" w:cs="Arial"/>
+        </w:rPr>
+        <w:t>:</w:t>
+      </w:r>
+      <w:r>
+        <w:rPr>
+          <w:rFonts w:ascii="Arial" w:hAnsi="Arial" w:cs="Arial"/>
+        </w:rPr>
+        <w:t xml:space="preserve"> </w:t>
+      </w:r>
+      <w:hyperlink r:id="rId4" w:history="1">
+        <w:r>
+          <w:rPr>
+            <w:rStyle w:val="Hyperlink"/>
+            <w:rFonts w:ascii="Arial" w:hAnsi="Arial" w:cs="Arial"/>
+          </w:rPr>
+          <w:t>Methods in Ecology and Evolution</w:t>
+        </w:r>
+      </w:hyperlink>
+    </w:p>
+    <w:p>
+      <w:pPr>
+        <w:rPr>
+          <w:rFonts w:ascii="Arial" w:hAnsi="Arial" w:cs="Arial"/>
+        </w:rPr>
+      </w:pPr>
+    </w:p>
+    <w:p>
+      <w:pPr>
+        <w:rPr>
+          <w:rFonts w:ascii="Arial" w:hAnsi="Arial" w:cs="Arial"/>
+        </w:rPr>
+      </w:pPr>
+      <w:r>
+        <w:rPr>
+          <w:rFonts w:ascii="Arial" w:hAnsi="Arial" w:cs="Arial"/>
+          <w:b/>
+          <w:bCs/>
+        </w:rPr>
+        <w:t>Article Type</w:t>
+      </w:r>
+      <w:r>
+        <w:rPr>
+          <w:rFonts w:ascii="Arial" w:hAnsi="Arial" w:cs="Arial"/>
+        </w:rPr>
+        <w:t>: Research Article</w:t>
+      </w:r>
+    </w:p>
+    <w:p>
+      <w:pPr>
+        <w:rPr>
+          <w:rFonts w:ascii="Arial" w:hAnsi="Arial" w:cs="Arial"/>
+        </w:rPr>
+      </w:pPr>
+    </w:p>
+    <w:p>
+      <w:pPr>
+        <w:rPr>
+          <w:rFonts w:ascii="Arial" w:hAnsi="Arial" w:cs="Arial"/>
+        </w:rPr>
+      </w:pPr>
+      <w:r>
+        <w:rPr>
+          <w:rFonts w:ascii="Arial" w:hAnsi="Arial" w:cs="Arial"/>
+          <w:b/>
+          <w:bCs/>
+        </w:rPr>
+        <w:t>Word Count</w:t>
+      </w:r>
+      <w:r>
+        <w:rPr>
+          <w:rFonts w:ascii="Arial" w:hAnsi="Arial" w:cs="Arial"/>
+        </w:rPr>
+        <w:t xml:space="preserve">: </w:t>
+      </w:r>
+      <w:r>
+        <w:rPr>
+          <w:rFonts w:ascii="Arial" w:hAnsi="Arial" w:cs="Arial"/>
+        </w:rPr>
+        <w:t>8</w:t>
+      </w:r>
+      <w:r>
+        <w:rPr>
+          <w:rFonts w:ascii="Arial" w:hAnsi="Arial" w:cs="Arial"/>
+        </w:rPr>
+        <w:t xml:space="preserve">000 </w:t>
+      </w:r>
+      <w:r>
+        <w:rPr>
+          <w:rFonts w:ascii="Arial" w:hAnsi="Arial" w:cs="Arial"/>
+        </w:rPr>
+        <w:t xml:space="preserve">word </w:t>
+      </w:r>
+      <w:r>
+        <w:rPr>
+          <w:rFonts w:ascii="Arial" w:hAnsi="Arial" w:cs="Arial"/>
+        </w:rPr>
+        <w:t>limit</w:t>
+      </w:r>
+      <w:r>
+        <w:rPr>
+          <w:rFonts w:ascii="Arial" w:hAnsi="Arial" w:cs="Arial"/>
+        </w:rPr>
+        <w:t xml:space="preserve"> (</w:t>
+      </w:r>
+      <w:r>
+        <w:rPr>
+          <w:rFonts w:ascii="Arial" w:hAnsi="Arial" w:cs="Arial"/>
+        </w:rPr>
+        <w:t>includes references</w:t>
+      </w:r>
+      <w:r>
+        <w:rPr>
+          <w:rFonts w:ascii="Arial" w:hAnsi="Arial" w:cs="Arial"/>
+        </w:rPr>
+        <w:t xml:space="preserve">, </w:t>
+      </w:r>
+      <w:r>
+        <w:rPr>
+          <w:rFonts w:ascii="Arial" w:hAnsi="Arial" w:cs="Arial"/>
+        </w:rPr>
+        <w:t>fi</w:t>
+      </w:r>
+      <w:r>
+        <w:rPr>
+          <w:rFonts w:ascii="Arial" w:hAnsi="Arial" w:cs="Arial"/>
+        </w:rPr>
+        <w:t>g</w:t>
+      </w:r>
+      <w:r>
+        <w:rPr>
+          <w:rFonts w:ascii="Arial" w:hAnsi="Arial" w:cs="Arial"/>
+        </w:rPr>
+        <w:t xml:space="preserve">ure captions, </w:t>
+      </w:r>
+      <w:r>
+        <w:rPr>
+          <w:rFonts w:ascii="Arial" w:hAnsi="Arial" w:cs="Arial"/>
+        </w:rPr>
+        <w:t>tables)</w:t>
+      </w:r>
+    </w:p>
+    <w:p>
+      <w:pPr>
+        <w:rPr>
+          <w:rFonts w:ascii="Arial" w:hAnsi="Arial" w:cs="Arial"/>
+        </w:rPr>
+      </w:pPr>
+    </w:p>
+    <w:p>
+      <w:pPr>
+        <w:rPr>
+          <w:rFonts w:ascii="Arial" w:hAnsi="Arial" w:cs="Arial"/>
+        </w:rPr>
+      </w:pPr>
+      <w:r>
+        <w:rPr>
+          <w:rFonts w:ascii="Arial" w:hAnsi="Arial" w:cs="Arial"/>
+          <w:b/>
+          <w:bCs/>
+        </w:rPr>
+        <w:t>M</w:t>
+      </w:r>
+      <w:r>
+        <w:rPr>
+          <w:rFonts w:ascii="Arial" w:hAnsi="Arial" w:cs="Arial"/>
+          <w:b/>
+          <w:bCs/>
+        </w:rPr>
+        <w:t xml:space="preserve">anuscript </w:t>
+      </w:r>
+      <w:r>
+        <w:rPr>
+          <w:rFonts w:ascii="Arial" w:hAnsi="Arial" w:cs="Arial"/>
+          <w:b/>
+          <w:bCs/>
+        </w:rPr>
+        <w:t>O</w:t>
+      </w:r>
+      <w:r>
+        <w:rPr>
+          <w:rFonts w:ascii="Arial" w:hAnsi="Arial" w:cs="Arial"/>
+          <w:b/>
+          <w:bCs/>
+        </w:rPr>
+        <w:t>utline</w:t>
+      </w:r>
+      <w:r>
+        <w:rPr>
+          <w:rFonts w:ascii="Arial" w:hAnsi="Arial" w:cs="Arial"/>
+        </w:rPr>
+        <w:t>: TKTK</w:t>
+      </w:r>
+    </w:p>
+    <w:p>
+      <w:pPr>
+        <w:rPr>
+          <w:rFonts w:ascii="Arial" w:hAnsi="Arial" w:cs="Arial"/>
+        </w:rPr>
+      </w:pPr>
+    </w:p>
+    <w:p>
+      <w:pPr>
+        <w:rPr>
+          <w:rFonts w:ascii="Arial" w:hAnsi="Arial" w:cs="Arial"/>
+        </w:rPr>
+      </w:pPr>
     </w:p>
     <w:sectPr>
       <w:pgSz w:w="12240" w:h="15840"/>
@@ -947,6 +1518,48 @@
       <w:spacing w:val="5"/>
     </w:rPr>
   </w:style>
+  <w:style w:type="paragraph" w:customStyle="1" w:styleId="BodyA">
+    <w:name w:val="Body A"/>
+    <w:qFormat/>
+    <w:rsid w:val="00BC03A3"/>
+    <w:rPr>
+      <w:rFonts w:ascii="Helvetica Neue" w:eastAsia="Arial Unicode MS" w:hAnsi="Helvetica Neue" w:cs="Arial Unicode MS"/>
+      <w:color w:val="000000"/>
+      <w:kern w:val="0"/>
+      <w:sz w:val="22"/>
+      <w:szCs w:val="22"/>
+      <w:u w:color="000000"/>
+      <w14:textOutline w14:w="12700" w14:cap="flat" w14:cmpd="sng" w14:algn="ctr">
+        <w14:noFill/>
+        <w14:prstDash w14:val="solid"/>
+        <w14:miter w14:lim="400000"/>
+      </w14:textOutline>
+      <w14:ligatures w14:val="none"/>
+    </w:rPr>
+  </w:style>
+  <w:style w:type="character" w:styleId="Hyperlink">
+    <w:name w:val="Hyperlink"/>
+    <w:basedOn w:val="DefaultParagraphFont"/>
+    <w:uiPriority w:val="99"/>
+    <w:unhideWhenUsed/>
+    <w:rsid w:val="00760E29"/>
+    <w:rPr>
+      <w:color w:val="467886" w:themeColor="hyperlink"/>
+      <w:u w:val="single"/>
+    </w:rPr>
+  </w:style>
+  <w:style w:type="character" w:styleId="UnresolvedMention">
+    <w:name w:val="Unresolved Mention"/>
+    <w:basedOn w:val="DefaultParagraphFont"/>
+    <w:uiPriority w:val="99"/>
+    <w:semiHidden/>
+    <w:unhideWhenUsed/>
+    <w:rsid w:val="00760E29"/>
+    <w:rPr>
+      <w:color w:val="605E5C"/>
+      <w:shd w:val="clear" w:color="auto" w:fill="E1DFDD"/>
+    </w:rPr>
+  </w:style>
 </w:styles>
 </file>
 

</xml_diff>

<commit_message>
Added code from Ari Cross' repo
Code from the synthetic experiments I ran for Ari's REU poster
</commit_message>
<xml_diff>
--- a/paRsynth_methods_draft.docx
+++ b/paRsynth_methods_draft.docx
@@ -262,15 +262,7 @@
           <w:sz w:val="24"/>
           <w:szCs w:val="24"/>
         </w:rPr>
-        <w:t xml:space="preserve">, </w:t>
-      </w:r>
-      <w:r>
-        <w:rPr>
-          <w:rFonts w:ascii="Arial" w:hAnsi="Arial" w:cs="Arial"/>
-          <w:sz w:val="24"/>
-          <w:szCs w:val="24"/>
-        </w:rPr>
-        <w:t>Michigan State University, East Lansing, MI USA</w:t>
+        <w:t>, Michigan State University, East Lansing, MI USA</w:t>
       </w:r>
     </w:p>
     <w:p>
@@ -305,15 +297,7 @@
           <w:sz w:val="24"/>
           <w:szCs w:val="24"/>
         </w:rPr>
-        <w:t xml:space="preserve">, </w:t>
-      </w:r>
-      <w:r>
-        <w:rPr>
-          <w:rFonts w:ascii="Arial" w:hAnsi="Arial" w:cs="Arial"/>
-          <w:sz w:val="24"/>
-          <w:szCs w:val="24"/>
-        </w:rPr>
-        <w:t>Michigan State University, East Lansing, MI USA</w:t>
+        <w:t>, Michigan State University, East Lansing, MI USA</w:t>
       </w:r>
     </w:p>
     <w:p>
@@ -392,7 +376,7 @@
         </w:rPr>
         <w:t xml:space="preserve"> </w:t>
       </w:r>
-      <w:hyperlink r:id="rId4" w:history="1">
+      <w:hyperlink r:id="rId5" w:history="1">
         <w:r>
           <w:rPr>
             <w:rStyle w:val="Hyperlink"/>
@@ -457,6 +441,7 @@
         </w:rPr>
         <w:t xml:space="preserve">: </w:t>
       </w:r>
+      <w:proofErr w:type="gramStart"/>
       <w:r>
         <w:rPr>
           <w:rFonts w:ascii="Arial" w:hAnsi="Arial" w:cs="Arial"/>
@@ -473,7 +458,14 @@
         <w:rPr>
           <w:rFonts w:ascii="Arial" w:hAnsi="Arial" w:cs="Arial"/>
         </w:rPr>
-        <w:t xml:space="preserve">word </w:t>
+        <w:t>word</w:t>
+      </w:r>
+      <w:proofErr w:type="gramEnd"/>
+      <w:r>
+        <w:rPr>
+          <w:rFonts w:ascii="Arial" w:hAnsi="Arial" w:cs="Arial"/>
+        </w:rPr>
+        <w:t xml:space="preserve"> </w:t>
       </w:r>
       <w:r>
         <w:rPr>
@@ -532,47 +524,256 @@
       </w:pPr>
     </w:p>
     <w:p>
-      <w:r>
+      <w:pPr>
+        <w:rPr>
+          <w:rFonts w:ascii="Arial" w:hAnsi="Arial" w:cs="Arial"/>
+        </w:rPr>
+      </w:pPr>
+      <w:r>
+        <w:rPr>
+          <w:rFonts w:ascii="Arial" w:hAnsi="Arial" w:cs="Arial"/>
+        </w:rPr>
         <w:br w:type="page"/>
       </w:r>
     </w:p>
     <w:p>
-      <w:r>
+      <w:pPr>
+        <w:rPr>
+          <w:rFonts w:ascii="Arial" w:hAnsi="Arial" w:cs="Arial"/>
+        </w:rPr>
+      </w:pPr>
+      <w:r>
+        <w:rPr>
+          <w:rFonts w:ascii="Arial" w:hAnsi="Arial" w:cs="Arial"/>
+        </w:rPr>
         <w:lastRenderedPageBreak/>
         <w:t>Abstract: TKTK unknown if needed TKTK</w:t>
       </w:r>
     </w:p>
     <w:p>
-      <w:r>
-        <w:t>Keywords:</w:t>
-      </w:r>
-      <w:r>
-        <w:t xml:space="preserve"> </w:t>
-      </w:r>
-      <w:r>
-        <w:t>TKTK unknown if needed TKTK</w:t>
-      </w:r>
-    </w:p>
-    <w:p/>
-    <w:p>
-      <w:r>
+      <w:pPr>
+        <w:rPr>
+          <w:rFonts w:ascii="Arial" w:hAnsi="Arial" w:cs="Arial"/>
+        </w:rPr>
+      </w:pPr>
+      <w:r>
+        <w:rPr>
+          <w:rFonts w:ascii="Arial" w:hAnsi="Arial" w:cs="Arial"/>
+        </w:rPr>
+        <w:t>Keywords: TKTK unknown if needed TKTK</w:t>
+      </w:r>
+    </w:p>
+    <w:p>
+      <w:pPr>
+        <w:rPr>
+          <w:rFonts w:ascii="Arial" w:hAnsi="Arial" w:cs="Arial"/>
+        </w:rPr>
+      </w:pPr>
+    </w:p>
+    <w:p>
+      <w:pPr>
+        <w:rPr>
+          <w:rFonts w:ascii="Arial" w:hAnsi="Arial" w:cs="Arial"/>
+        </w:rPr>
+      </w:pPr>
+      <w:r>
+        <w:rPr>
+          <w:rFonts w:ascii="Arial" w:hAnsi="Arial" w:cs="Arial"/>
+        </w:rPr>
         <w:br w:type="page"/>
       </w:r>
     </w:p>
     <w:p>
-      <w:r>
+      <w:pPr>
+        <w:rPr>
+          <w:rFonts w:ascii="Arial" w:hAnsi="Arial" w:cs="Arial"/>
+        </w:rPr>
+      </w:pPr>
+      <w:r>
+        <w:rPr>
+          <w:rFonts w:ascii="Arial" w:hAnsi="Arial" w:cs="Arial"/>
+          <w:b/>
+        </w:rPr>
         <w:lastRenderedPageBreak/>
         <w:t>Introduction</w:t>
       </w:r>
-    </w:p>
-    <w:p/>
-    <w:p>
-      <w:r>
+      <w:r>
+        <w:rPr>
+          <w:rFonts w:ascii="Arial" w:hAnsi="Arial" w:cs="Arial"/>
+        </w:rPr>
+        <w:t>:</w:t>
+      </w:r>
+    </w:p>
+    <w:p>
+      <w:pPr>
+        <w:rPr>
+          <w:rFonts w:ascii="Arial" w:hAnsi="Arial" w:cs="Arial"/>
+        </w:rPr>
+      </w:pPr>
+    </w:p>
+    <w:p>
+      <w:pPr>
+        <w:rPr>
+          <w:rFonts w:ascii="Arial" w:hAnsi="Arial" w:cs="Arial"/>
+        </w:rPr>
+      </w:pPr>
+    </w:p>
+    <w:p>
+      <w:pPr>
+        <w:pStyle w:val="ListParagraph"/>
+        <w:numPr>
+          <w:ilvl w:val="0"/>
+          <w:numId w:val="2"/>
+        </w:numPr>
+        <w:rPr>
+          <w:rFonts w:ascii="Arial" w:hAnsi="Arial" w:cs="Arial"/>
+        </w:rPr>
+      </w:pPr>
+      <w:r>
+        <w:rPr>
+          <w:rFonts w:ascii="Arial" w:hAnsi="Arial" w:cs="Arial"/>
+        </w:rPr>
+        <w:t>Information encoding in vocal signals</w:t>
+      </w:r>
+    </w:p>
+    <w:p>
+      <w:pPr>
+        <w:pStyle w:val="ListParagraph"/>
+        <w:numPr>
+          <w:ilvl w:val="0"/>
+          <w:numId w:val="2"/>
+        </w:numPr>
+        <w:rPr>
+          <w:rFonts w:ascii="Arial" w:hAnsi="Arial" w:cs="Arial"/>
+        </w:rPr>
+      </w:pPr>
+      <w:r>
+        <w:rPr>
+          <w:rFonts w:ascii="Arial" w:hAnsi="Arial" w:cs="Arial"/>
+        </w:rPr>
+        <w:t xml:space="preserve">Information theory perspective and </w:t>
+      </w:r>
+      <w:proofErr w:type="gramStart"/>
+      <w:r>
+        <w:rPr>
+          <w:rFonts w:ascii="Arial" w:hAnsi="Arial" w:cs="Arial"/>
+        </w:rPr>
+        <w:t>Parsons</w:t>
+      </w:r>
+      <w:proofErr w:type="gramEnd"/>
+      <w:r>
+        <w:rPr>
+          <w:rFonts w:ascii="Arial" w:hAnsi="Arial" w:cs="Arial"/>
+        </w:rPr>
+        <w:t xml:space="preserve"> code</w:t>
+      </w:r>
+      <w:r>
+        <w:rPr>
+          <w:rFonts w:ascii="Arial" w:hAnsi="Arial" w:cs="Arial"/>
+        </w:rPr>
+        <w:t xml:space="preserve"> for encoding, not just decoding (</w:t>
+      </w:r>
+      <w:proofErr w:type="spellStart"/>
+      <w:r>
+        <w:rPr>
+          <w:rFonts w:ascii="Arial" w:hAnsi="Arial" w:cs="Arial"/>
+        </w:rPr>
+        <w:t>Kershenbaum</w:t>
+      </w:r>
+      <w:proofErr w:type="spellEnd"/>
+      <w:r>
+        <w:rPr>
+          <w:rFonts w:ascii="Arial" w:hAnsi="Arial" w:cs="Arial"/>
+        </w:rPr>
+        <w:t>)</w:t>
+      </w:r>
+    </w:p>
+    <w:p>
+      <w:pPr>
+        <w:pStyle w:val="ListParagraph"/>
+        <w:numPr>
+          <w:ilvl w:val="0"/>
+          <w:numId w:val="2"/>
+        </w:numPr>
+        <w:rPr>
+          <w:rFonts w:ascii="Arial" w:hAnsi="Arial" w:cs="Arial"/>
+        </w:rPr>
+      </w:pPr>
+      <w:r>
+        <w:rPr>
+          <w:rFonts w:ascii="Arial" w:hAnsi="Arial" w:cs="Arial"/>
+        </w:rPr>
+        <w:t xml:space="preserve">We need tools to both encode information and accurately </w:t>
+      </w:r>
+      <w:r>
+        <w:rPr>
+          <w:rFonts w:ascii="Arial" w:hAnsi="Arial" w:cs="Arial"/>
+        </w:rPr>
+        <w:t>recover that information in vocal signals</w:t>
+      </w:r>
+    </w:p>
+    <w:p>
+      <w:pPr>
+        <w:pStyle w:val="ListParagraph"/>
+        <w:numPr>
+          <w:ilvl w:val="1"/>
+          <w:numId w:val="2"/>
+        </w:numPr>
+        <w:rPr>
+          <w:rFonts w:ascii="Arial" w:hAnsi="Arial" w:cs="Arial"/>
+        </w:rPr>
+      </w:pPr>
+      <w:r>
+        <w:rPr>
+          <w:rFonts w:ascii="Arial" w:hAnsi="Arial" w:cs="Arial"/>
+        </w:rPr>
+        <w:t>Explain the goals of the paper</w:t>
+      </w:r>
+    </w:p>
+    <w:p>
+      <w:pPr>
+        <w:rPr>
+          <w:rFonts w:ascii="Arial" w:hAnsi="Arial" w:cs="Arial"/>
+        </w:rPr>
+      </w:pPr>
+    </w:p>
+    <w:p>
+      <w:pPr>
+        <w:rPr>
+          <w:rFonts w:ascii="Arial" w:hAnsi="Arial" w:cs="Arial"/>
+        </w:rPr>
+      </w:pPr>
+    </w:p>
+    <w:p>
+      <w:pPr>
+        <w:rPr>
+          <w:rFonts w:ascii="Arial" w:hAnsi="Arial" w:cs="Arial"/>
+        </w:rPr>
+      </w:pPr>
+    </w:p>
+    <w:p>
+      <w:pPr>
+        <w:rPr>
+          <w:rFonts w:ascii="Arial" w:hAnsi="Arial" w:cs="Arial"/>
+        </w:rPr>
+      </w:pPr>
+      <w:r>
+        <w:rPr>
+          <w:rFonts w:ascii="Arial" w:hAnsi="Arial" w:cs="Arial"/>
+        </w:rPr>
         <w:t xml:space="preserve">Thesis statement: Here, we present </w:t>
       </w:r>
     </w:p>
     <w:p>
-      <w:r>
+      <w:pPr>
+        <w:rPr>
+          <w:rFonts w:ascii="Arial" w:hAnsi="Arial" w:cs="Arial"/>
+        </w:rPr>
+      </w:pPr>
+      <w:r>
+        <w:rPr>
+          <w:rFonts w:ascii="Arial" w:hAnsi="Arial" w:cs="Arial"/>
+        </w:rPr>
         <w:t xml:space="preserve">Goals of manuscript: In this manuscript, first we </w:t>
       </w:r>
     </w:p>
@@ -582,6 +783,549 @@
           <w:rFonts w:ascii="Arial" w:hAnsi="Arial" w:cs="Arial"/>
         </w:rPr>
       </w:pPr>
+    </w:p>
+    <w:p>
+      <w:pPr>
+        <w:pStyle w:val="ListParagraph"/>
+        <w:numPr>
+          <w:ilvl w:val="0"/>
+          <w:numId w:val="1"/>
+        </w:numPr>
+        <w:rPr>
+          <w:rFonts w:ascii="Arial" w:hAnsi="Arial" w:cs="Arial"/>
+        </w:rPr>
+      </w:pPr>
+      <w:r>
+        <w:rPr>
+          <w:rFonts w:ascii="Arial" w:hAnsi="Arial" w:cs="Arial"/>
+        </w:rPr>
+        <w:t>Linking an information theory perspective to creating synthetic signals and controlling types and amounts of information encoded in these signals (</w:t>
+      </w:r>
+      <w:proofErr w:type="spellStart"/>
+      <w:r>
+        <w:rPr>
+          <w:rFonts w:ascii="Arial" w:hAnsi="Arial" w:cs="Arial"/>
+        </w:rPr>
+        <w:t>paRsynth</w:t>
+      </w:r>
+      <w:proofErr w:type="spellEnd"/>
+      <w:r>
+        <w:rPr>
+          <w:rFonts w:ascii="Arial" w:hAnsi="Arial" w:cs="Arial"/>
+        </w:rPr>
+        <w:t xml:space="preserve"> package)</w:t>
+      </w:r>
+    </w:p>
+    <w:p>
+      <w:pPr>
+        <w:pStyle w:val="ListParagraph"/>
+        <w:numPr>
+          <w:ilvl w:val="1"/>
+          <w:numId w:val="1"/>
+        </w:numPr>
+        <w:rPr>
+          <w:rFonts w:ascii="Arial" w:hAnsi="Arial" w:cs="Arial"/>
+        </w:rPr>
+      </w:pPr>
+      <w:r>
+        <w:rPr>
+          <w:rFonts w:ascii="Arial" w:hAnsi="Arial" w:cs="Arial"/>
+        </w:rPr>
+        <w:t xml:space="preserve">Be careful about pitching </w:t>
+      </w:r>
+      <w:proofErr w:type="spellStart"/>
+      <w:r>
+        <w:rPr>
+          <w:rFonts w:ascii="Arial" w:hAnsi="Arial" w:cs="Arial"/>
+        </w:rPr>
+        <w:t>paRsynth</w:t>
+      </w:r>
+      <w:proofErr w:type="spellEnd"/>
+      <w:r>
+        <w:rPr>
+          <w:rFonts w:ascii="Arial" w:hAnsi="Arial" w:cs="Arial"/>
+        </w:rPr>
+        <w:t xml:space="preserve"> too broadly, right now this is an in-house tool/set of functions</w:t>
+      </w:r>
+    </w:p>
+    <w:p>
+      <w:pPr>
+        <w:pStyle w:val="ListParagraph"/>
+        <w:numPr>
+          <w:ilvl w:val="1"/>
+          <w:numId w:val="1"/>
+        </w:numPr>
+        <w:rPr>
+          <w:rFonts w:ascii="Arial" w:hAnsi="Arial" w:cs="Arial"/>
+        </w:rPr>
+      </w:pPr>
+      <w:r>
+        <w:rPr>
+          <w:rFonts w:ascii="Arial" w:hAnsi="Arial" w:cs="Arial"/>
+        </w:rPr>
+        <w:t>Short statements about unit testing to show rigor</w:t>
+      </w:r>
+      <w:r>
+        <w:rPr>
+          <w:rFonts w:ascii="Arial" w:hAnsi="Arial" w:cs="Arial"/>
+        </w:rPr>
+        <w:t xml:space="preserve">, add details to the supplement </w:t>
+      </w:r>
+      <w:r>
+        <w:rPr>
+          <w:rFonts w:ascii="Arial" w:hAnsi="Arial" w:cs="Arial"/>
+        </w:rPr>
+        <w:t>(</w:t>
+      </w:r>
+      <w:r>
+        <w:rPr>
+          <w:rFonts w:ascii="Arial" w:hAnsi="Arial" w:cs="Arial"/>
+        </w:rPr>
+        <w:t>tested functionality and error handling</w:t>
+      </w:r>
+      <w:r>
+        <w:rPr>
+          <w:rFonts w:ascii="Arial" w:hAnsi="Arial" w:cs="Arial"/>
+        </w:rPr>
+        <w:t>)</w:t>
+      </w:r>
+    </w:p>
+    <w:p>
+      <w:pPr>
+        <w:pStyle w:val="ListParagraph"/>
+        <w:rPr>
+          <w:rFonts w:ascii="Arial" w:hAnsi="Arial" w:cs="Arial"/>
+        </w:rPr>
+      </w:pPr>
+    </w:p>
+    <w:p>
+      <w:pPr>
+        <w:pStyle w:val="ListParagraph"/>
+        <w:numPr>
+          <w:ilvl w:val="0"/>
+          <w:numId w:val="1"/>
+        </w:numPr>
+        <w:rPr>
+          <w:rFonts w:ascii="Arial" w:hAnsi="Arial" w:cs="Arial"/>
+        </w:rPr>
+      </w:pPr>
+      <w:r>
+        <w:rPr>
+          <w:rFonts w:ascii="Arial" w:hAnsi="Arial" w:cs="Arial"/>
+        </w:rPr>
+        <w:t>Using traditional bioacoustics analyses as “information recovery pipeline”, in other words, do traditional tools recover the information that was originally encoded in these signals?</w:t>
+      </w:r>
+      <w:r>
+        <w:rPr>
+          <w:rFonts w:ascii="Arial" w:hAnsi="Arial" w:cs="Arial"/>
+        </w:rPr>
+        <w:t xml:space="preserve"> </w:t>
+      </w:r>
+      <w:r>
+        <w:rPr>
+          <w:rFonts w:ascii="Arial" w:hAnsi="Arial" w:cs="Arial"/>
+        </w:rPr>
+        <w:t>An internal validation</w:t>
+      </w:r>
+      <w:r>
+        <w:rPr>
+          <w:rFonts w:ascii="Arial" w:hAnsi="Arial" w:cs="Arial"/>
+        </w:rPr>
+        <w:t>, also a way of validating tools that are commonly used in the bioacoustics community</w:t>
+      </w:r>
+      <w:r>
+        <w:rPr>
+          <w:rFonts w:ascii="Arial" w:hAnsi="Arial" w:cs="Arial"/>
+        </w:rPr>
+        <w:t>. The reason we can do this is that we’re using synthetic signals</w:t>
+      </w:r>
+    </w:p>
+    <w:p>
+      <w:pPr>
+        <w:rPr>
+          <w:rFonts w:ascii="Arial" w:hAnsi="Arial" w:cs="Arial"/>
+        </w:rPr>
+      </w:pPr>
+    </w:p>
+    <w:p>
+      <w:pPr>
+        <w:rPr>
+          <w:rFonts w:ascii="Arial" w:hAnsi="Arial" w:cs="Arial"/>
+        </w:rPr>
+      </w:pPr>
+    </w:p>
+    <w:p>
+      <w:pPr>
+        <w:rPr>
+          <w:rFonts w:ascii="Arial" w:hAnsi="Arial" w:cs="Arial"/>
+        </w:rPr>
+      </w:pPr>
+      <w:r>
+        <w:rPr>
+          <w:rFonts w:ascii="Arial" w:hAnsi="Arial" w:cs="Arial"/>
+          <w:b/>
+          <w:bCs/>
+        </w:rPr>
+        <w:t>Methods</w:t>
+      </w:r>
+      <w:r>
+        <w:rPr>
+          <w:rFonts w:ascii="Arial" w:hAnsi="Arial" w:cs="Arial"/>
+        </w:rPr>
+        <w:t>:</w:t>
+      </w:r>
+    </w:p>
+    <w:p>
+      <w:pPr>
+        <w:rPr>
+          <w:rFonts w:ascii="Arial" w:hAnsi="Arial" w:cs="Arial"/>
+        </w:rPr>
+      </w:pPr>
+    </w:p>
+    <w:p>
+      <w:pPr>
+        <w:pStyle w:val="ListParagraph"/>
+        <w:numPr>
+          <w:ilvl w:val="0"/>
+          <w:numId w:val="3"/>
+        </w:numPr>
+        <w:rPr>
+          <w:rFonts w:ascii="Arial" w:hAnsi="Arial" w:cs="Arial"/>
+        </w:rPr>
+      </w:pPr>
+      <w:proofErr w:type="spellStart"/>
+      <w:r>
+        <w:rPr>
+          <w:rFonts w:ascii="Arial" w:hAnsi="Arial" w:cs="Arial"/>
+        </w:rPr>
+        <w:t>paRsynth</w:t>
+      </w:r>
+      <w:proofErr w:type="spellEnd"/>
+      <w:r>
+        <w:rPr>
+          <w:rFonts w:ascii="Arial" w:hAnsi="Arial" w:cs="Arial"/>
+        </w:rPr>
+        <w:t xml:space="preserve"> functions</w:t>
+      </w:r>
+    </w:p>
+    <w:p>
+      <w:pPr>
+        <w:pStyle w:val="ListParagraph"/>
+        <w:numPr>
+          <w:ilvl w:val="0"/>
+          <w:numId w:val="3"/>
+        </w:numPr>
+        <w:rPr>
+          <w:rFonts w:ascii="Arial" w:hAnsi="Arial" w:cs="Arial"/>
+        </w:rPr>
+      </w:pPr>
+      <w:r>
+        <w:rPr>
+          <w:rFonts w:ascii="Arial" w:hAnsi="Arial" w:cs="Arial"/>
+        </w:rPr>
+        <w:t>I</w:t>
+      </w:r>
+      <w:r>
+        <w:rPr>
+          <w:rFonts w:ascii="Arial" w:hAnsi="Arial" w:cs="Arial"/>
+        </w:rPr>
+        <w:t>nformation “</w:t>
+      </w:r>
+      <w:proofErr w:type="spellStart"/>
+      <w:r>
+        <w:rPr>
+          <w:rFonts w:ascii="Arial" w:hAnsi="Arial" w:cs="Arial"/>
+        </w:rPr>
+        <w:t>trits</w:t>
+      </w:r>
+      <w:proofErr w:type="spellEnd"/>
+      <w:r>
+        <w:rPr>
+          <w:rFonts w:ascii="Arial" w:hAnsi="Arial" w:cs="Arial"/>
+        </w:rPr>
+        <w:t>”</w:t>
+      </w:r>
+      <w:r>
+        <w:rPr>
+          <w:rFonts w:ascii="Arial" w:hAnsi="Arial" w:cs="Arial"/>
+        </w:rPr>
+        <w:t xml:space="preserve"> and base-3 </w:t>
+      </w:r>
+      <w:proofErr w:type="gramStart"/>
+      <w:r>
+        <w:rPr>
+          <w:rFonts w:ascii="Arial" w:hAnsi="Arial" w:cs="Arial"/>
+        </w:rPr>
+        <w:t>Parsons</w:t>
+      </w:r>
+      <w:proofErr w:type="gramEnd"/>
+      <w:r>
+        <w:rPr>
+          <w:rFonts w:ascii="Arial" w:hAnsi="Arial" w:cs="Arial"/>
+        </w:rPr>
+        <w:t xml:space="preserve"> </w:t>
+      </w:r>
+      <w:r>
+        <w:rPr>
+          <w:rFonts w:ascii="Arial" w:hAnsi="Arial" w:cs="Arial"/>
+        </w:rPr>
+        <w:t>code</w:t>
+      </w:r>
+    </w:p>
+    <w:p>
+      <w:pPr>
+        <w:pStyle w:val="ListParagraph"/>
+        <w:numPr>
+          <w:ilvl w:val="0"/>
+          <w:numId w:val="3"/>
+        </w:numPr>
+        <w:rPr>
+          <w:rFonts w:ascii="Arial" w:hAnsi="Arial" w:cs="Arial"/>
+        </w:rPr>
+      </w:pPr>
+      <w:r>
+        <w:rPr>
+          <w:rFonts w:ascii="Arial" w:hAnsi="Arial" w:cs="Arial"/>
+        </w:rPr>
+        <w:t>“Information recovery pipeline”</w:t>
+      </w:r>
+    </w:p>
+    <w:p>
+      <w:pPr>
+        <w:pStyle w:val="ListParagraph"/>
+        <w:numPr>
+          <w:ilvl w:val="1"/>
+          <w:numId w:val="3"/>
+        </w:numPr>
+        <w:rPr>
+          <w:rFonts w:ascii="Arial" w:hAnsi="Arial" w:cs="Arial"/>
+        </w:rPr>
+      </w:pPr>
+      <w:r>
+        <w:rPr>
+          <w:rFonts w:ascii="Arial" w:hAnsi="Arial" w:cs="Arial"/>
+        </w:rPr>
+        <w:t xml:space="preserve">We have code to do the majority of all of this, and will need to </w:t>
+      </w:r>
+      <w:r>
+        <w:rPr>
+          <w:rFonts w:ascii="Arial" w:hAnsi="Arial" w:cs="Arial"/>
+        </w:rPr>
+        <w:t>put the pieces together</w:t>
+      </w:r>
+    </w:p>
+    <w:p>
+      <w:pPr>
+        <w:pStyle w:val="ListParagraph"/>
+        <w:numPr>
+          <w:ilvl w:val="1"/>
+          <w:numId w:val="3"/>
+        </w:numPr>
+        <w:rPr>
+          <w:rFonts w:ascii="Arial" w:hAnsi="Arial" w:cs="Arial"/>
+        </w:rPr>
+      </w:pPr>
+      <w:r>
+        <w:rPr>
+          <w:rFonts w:ascii="Arial" w:hAnsi="Arial" w:cs="Arial"/>
+        </w:rPr>
+        <w:t>SPCC</w:t>
+      </w:r>
+      <w:r>
+        <w:rPr>
+          <w:rFonts w:ascii="Arial" w:hAnsi="Arial" w:cs="Arial"/>
+        </w:rPr>
+        <w:t>-based:</w:t>
+      </w:r>
+    </w:p>
+    <w:p>
+      <w:pPr>
+        <w:pStyle w:val="ListParagraph"/>
+        <w:numPr>
+          <w:ilvl w:val="2"/>
+          <w:numId w:val="3"/>
+        </w:numPr>
+        <w:rPr>
+          <w:rFonts w:ascii="Arial" w:hAnsi="Arial" w:cs="Arial"/>
+        </w:rPr>
+      </w:pPr>
+      <w:r>
+        <w:rPr>
+          <w:rFonts w:ascii="Arial" w:hAnsi="Arial" w:cs="Arial"/>
+        </w:rPr>
+        <w:t>Multi-</w:t>
+      </w:r>
+      <w:proofErr w:type="spellStart"/>
+      <w:r>
+        <w:rPr>
+          <w:rFonts w:ascii="Arial" w:hAnsi="Arial" w:cs="Arial"/>
+        </w:rPr>
+        <w:t>dimensional scalin</w:t>
+      </w:r>
+      <w:proofErr w:type="spellEnd"/>
+      <w:r>
+        <w:rPr>
+          <w:rFonts w:ascii="Arial" w:hAnsi="Arial" w:cs="Arial"/>
+        </w:rPr>
+        <w:t xml:space="preserve">g </w:t>
+      </w:r>
+      <w:r>
+        <w:rPr>
+          <w:rFonts w:ascii="Arial" w:hAnsi="Arial" w:cs="Arial"/>
+        </w:rPr>
+        <w:t>acoustic space</w:t>
+      </w:r>
+      <w:r>
+        <w:rPr>
+          <w:rFonts w:ascii="Arial" w:hAnsi="Arial" w:cs="Arial"/>
+        </w:rPr>
+        <w:t>, clustering and Normalized Mutual</w:t>
+      </w:r>
+      <w:r>
+        <w:rPr>
+          <w:rFonts w:ascii="Arial" w:hAnsi="Arial" w:cs="Arial"/>
+        </w:rPr>
+        <w:t xml:space="preserve"> Information (a mix of traditional bioacoustics tools and information theory perspective)</w:t>
+      </w:r>
+      <w:r>
+        <w:rPr>
+          <w:rFonts w:ascii="Arial" w:hAnsi="Arial" w:cs="Arial"/>
+        </w:rPr>
+        <w:t>,</w:t>
+      </w:r>
+      <w:r>
+        <w:rPr>
+          <w:rFonts w:ascii="Arial" w:hAnsi="Arial" w:cs="Arial"/>
+        </w:rPr>
+        <w:t xml:space="preserve"> Bayesian hierarchical models (mix of traditional tools plus newer tools for inferential statistics)</w:t>
+      </w:r>
+    </w:p>
+    <w:p>
+      <w:pPr>
+        <w:pStyle w:val="ListParagraph"/>
+        <w:numPr>
+          <w:ilvl w:val="1"/>
+          <w:numId w:val="3"/>
+        </w:numPr>
+        <w:rPr>
+          <w:rFonts w:ascii="Arial" w:hAnsi="Arial" w:cs="Arial"/>
+        </w:rPr>
+      </w:pPr>
+      <w:r>
+        <w:rPr>
+          <w:rFonts w:ascii="Arial" w:hAnsi="Arial" w:cs="Arial"/>
+        </w:rPr>
+        <w:t>Frequency contour tracing</w:t>
+      </w:r>
+      <w:r>
+        <w:rPr>
+          <w:rFonts w:ascii="Arial" w:hAnsi="Arial" w:cs="Arial"/>
+        </w:rPr>
+        <w:t xml:space="preserve"> based</w:t>
+      </w:r>
+      <w:r>
+        <w:rPr>
+          <w:rFonts w:ascii="Arial" w:hAnsi="Arial" w:cs="Arial"/>
+        </w:rPr>
+        <w:t xml:space="preserve"> (</w:t>
+      </w:r>
+      <w:r>
+        <w:rPr>
+          <w:rFonts w:ascii="Arial" w:hAnsi="Arial" w:cs="Arial"/>
+        </w:rPr>
+        <w:t>b</w:t>
+      </w:r>
+      <w:r>
+        <w:rPr>
+          <w:rFonts w:ascii="Arial" w:hAnsi="Arial" w:cs="Arial"/>
+        </w:rPr>
+        <w:t>ecause we are encoding information in frequency modulation patterns</w:t>
+      </w:r>
+      <w:r>
+        <w:rPr>
+          <w:rFonts w:ascii="Arial" w:hAnsi="Arial" w:cs="Arial"/>
+        </w:rPr>
+        <w:t>)</w:t>
+      </w:r>
+    </w:p>
+    <w:p>
+      <w:pPr>
+        <w:pStyle w:val="ListParagraph"/>
+        <w:numPr>
+          <w:ilvl w:val="2"/>
+          <w:numId w:val="3"/>
+        </w:numPr>
+        <w:rPr>
+          <w:rFonts w:ascii="Arial" w:hAnsi="Arial" w:cs="Arial"/>
+        </w:rPr>
+      </w:pPr>
+      <w:r>
+        <w:rPr>
+          <w:rFonts w:ascii="Arial" w:hAnsi="Arial" w:cs="Arial"/>
+        </w:rPr>
+        <w:t>Frequency contour extraction</w:t>
+      </w:r>
+      <w:r>
+        <w:rPr>
+          <w:rFonts w:ascii="Arial" w:hAnsi="Arial" w:cs="Arial"/>
+        </w:rPr>
+        <w:t xml:space="preserve"> with semi-automated approaches</w:t>
+      </w:r>
+    </w:p>
+    <w:p>
+      <w:pPr>
+        <w:pStyle w:val="ListParagraph"/>
+        <w:numPr>
+          <w:ilvl w:val="2"/>
+          <w:numId w:val="3"/>
+        </w:numPr>
+        <w:rPr>
+          <w:rFonts w:ascii="Arial" w:hAnsi="Arial" w:cs="Arial"/>
+        </w:rPr>
+      </w:pPr>
+      <w:r>
+        <w:rPr>
+          <w:rFonts w:ascii="Arial" w:hAnsi="Arial" w:cs="Arial"/>
+        </w:rPr>
+        <w:lastRenderedPageBreak/>
+        <w:t>Dynamic time warping to compare the time series of the frequency contours</w:t>
+      </w:r>
+    </w:p>
+    <w:p>
+      <w:pPr>
+        <w:pStyle w:val="ListParagraph"/>
+        <w:numPr>
+          <w:ilvl w:val="2"/>
+          <w:numId w:val="3"/>
+        </w:numPr>
+        <w:rPr>
+          <w:rFonts w:ascii="Arial" w:hAnsi="Arial" w:cs="Arial"/>
+        </w:rPr>
+      </w:pPr>
+      <w:r>
+        <w:rPr>
+          <w:rFonts w:ascii="Arial" w:hAnsi="Arial" w:cs="Arial"/>
+        </w:rPr>
+        <w:t>Multi-dimensional scaling acoustic space, clustering and Normalized Mutual Information</w:t>
+      </w:r>
+      <w:r>
+        <w:rPr>
+          <w:rFonts w:ascii="Arial" w:hAnsi="Arial" w:cs="Arial"/>
+        </w:rPr>
+        <w:t xml:space="preserve">, </w:t>
+      </w:r>
+      <w:r>
+        <w:rPr>
+          <w:rFonts w:ascii="Arial" w:hAnsi="Arial" w:cs="Arial"/>
+        </w:rPr>
+        <w:t xml:space="preserve">Bayesian hierarchical </w:t>
+      </w:r>
+      <w:r>
+        <w:rPr>
+          <w:rFonts w:ascii="Arial" w:hAnsi="Arial" w:cs="Arial"/>
+        </w:rPr>
+        <w:t>models</w:t>
+      </w:r>
     </w:p>
     <w:sectPr>
       <w:pgSz w:w="12240" w:h="15840"/>
@@ -591,6 +1335,287 @@
     </w:sectPr>
   </w:body>
 </w:document>
+</file>
+
+<file path=word/numbering.xml><?xml version="1.0" encoding="utf-8"?>
+<w:numbering xmlns:wpc="http://schemas.microsoft.com/office/word/2010/wordprocessingCanvas" xmlns:cx="http://schemas.microsoft.com/office/drawing/2014/chartex" xmlns:cx1="http://schemas.microsoft.com/office/drawing/2015/9/8/chartex" xmlns:cx2="http://schemas.microsoft.com/office/drawing/2015/10/21/chartex" xmlns:cx3="http://schemas.microsoft.com/office/drawing/2016/5/9/chartex" xmlns:cx4="http://schemas.microsoft.com/office/drawing/2016/5/10/chartex" xmlns:cx5="http://schemas.microsoft.com/office/drawing/2016/5/11/chartex" xmlns:cx6="http://schemas.microsoft.com/office/drawing/2016/5/12/chartex" xmlns:cx7="http://schemas.microsoft.com/office/drawing/2016/5/13/chartex" xmlns:cx8="http://schemas.microsoft.com/office/drawing/2016/5/14/chartex" xmlns:mc="http://schemas.openxmlformats.org/markup-compatibility/2006" xmlns:aink="http://schemas.microsoft.com/office/drawing/2016/ink" xmlns:am3d="http://schemas.microsoft.com/office/drawing/2017/model3d" xmlns:o="urn:schemas-microsoft-com:office:office" xmlns:oel="http://schemas.microsoft.com/office/2019/extlst" xmlns:r="http://schemas.openxmlformats.org/officeDocument/2006/relationships" xmlns:m="http://schemas.openxmlformats.org/officeDocument/2006/math" xmlns:v="urn:schemas-microsoft-com:vml" xmlns:wp14="http://schemas.microsoft.com/office/word/2010/wordprocessingDrawing" xmlns:wp="http://schemas.openxmlformats.org/drawingml/2006/wordprocessingDrawing" xmlns:w10="urn:schemas-microsoft-com:office:word" xmlns:w="http://schemas.openxmlformats.org/wordprocessingml/2006/main" xmlns:w14="http://schemas.microsoft.com/office/word/2010/wordml" xmlns:w15="http://schemas.microsoft.com/office/word/2012/wordml" xmlns:w16cex="http://schemas.microsoft.com/office/word/2018/wordml/cex" xmlns:w16cid="http://schemas.microsoft.com/office/word/2016/wordml/cid" xmlns:w16="http://schemas.microsoft.com/office/word/2018/wordml" xmlns:w16du="http://schemas.microsoft.com/office/word/2023/wordml/word16du" xmlns:w16sdtdh="http://schemas.microsoft.com/office/word/2020/wordml/sdtdatahash" xmlns:w16se="http://schemas.microsoft.com/office/word/2015/wordml/symex" xmlns:wpg="http://schemas.microsoft.com/office/word/2010/wordprocessingGroup" xmlns:wpi="http://schemas.microsoft.com/office/word/2010/wordprocessingInk" xmlns:wne="http://schemas.microsoft.com/office/word/2006/wordml" xmlns:wps="http://schemas.microsoft.com/office/word/2010/wordprocessingShape" mc:Ignorable="w14 w15 w16se w16cid w16 w16cex w16sdtdh w16du wp14">
+  <w:abstractNum w:abstractNumId="0" w15:restartNumberingAfterBreak="0">
+    <w:nsid w:val="2F5D2CA7"/>
+    <w:multiLevelType w:val="hybridMultilevel"/>
+    <w:tmpl w:val="35BAADC0"/>
+    <w:lvl w:ilvl="0" w:tplc="0409000F">
+      <w:start w:val="1"/>
+      <w:numFmt w:val="decimal"/>
+      <w:lvlText w:val="%1."/>
+      <w:lvlJc w:val="left"/>
+      <w:pPr>
+        <w:ind w:left="720" w:hanging="360"/>
+      </w:pPr>
+      <w:rPr>
+        <w:rFonts w:hint="default"/>
+      </w:rPr>
+    </w:lvl>
+    <w:lvl w:ilvl="1" w:tplc="04090019">
+      <w:start w:val="1"/>
+      <w:numFmt w:val="lowerLetter"/>
+      <w:lvlText w:val="%2."/>
+      <w:lvlJc w:val="left"/>
+      <w:pPr>
+        <w:ind w:left="1440" w:hanging="360"/>
+      </w:pPr>
+    </w:lvl>
+    <w:lvl w:ilvl="2" w:tplc="0409001B" w:tentative="1">
+      <w:start w:val="1"/>
+      <w:numFmt w:val="lowerRoman"/>
+      <w:lvlText w:val="%3."/>
+      <w:lvlJc w:val="right"/>
+      <w:pPr>
+        <w:ind w:left="2160" w:hanging="180"/>
+      </w:pPr>
+    </w:lvl>
+    <w:lvl w:ilvl="3" w:tplc="0409000F" w:tentative="1">
+      <w:start w:val="1"/>
+      <w:numFmt w:val="decimal"/>
+      <w:lvlText w:val="%4."/>
+      <w:lvlJc w:val="left"/>
+      <w:pPr>
+        <w:ind w:left="2880" w:hanging="360"/>
+      </w:pPr>
+    </w:lvl>
+    <w:lvl w:ilvl="4" w:tplc="04090019" w:tentative="1">
+      <w:start w:val="1"/>
+      <w:numFmt w:val="lowerLetter"/>
+      <w:lvlText w:val="%5."/>
+      <w:lvlJc w:val="left"/>
+      <w:pPr>
+        <w:ind w:left="3600" w:hanging="360"/>
+      </w:pPr>
+    </w:lvl>
+    <w:lvl w:ilvl="5" w:tplc="0409001B" w:tentative="1">
+      <w:start w:val="1"/>
+      <w:numFmt w:val="lowerRoman"/>
+      <w:lvlText w:val="%6."/>
+      <w:lvlJc w:val="right"/>
+      <w:pPr>
+        <w:ind w:left="4320" w:hanging="180"/>
+      </w:pPr>
+    </w:lvl>
+    <w:lvl w:ilvl="6" w:tplc="0409000F" w:tentative="1">
+      <w:start w:val="1"/>
+      <w:numFmt w:val="decimal"/>
+      <w:lvlText w:val="%7."/>
+      <w:lvlJc w:val="left"/>
+      <w:pPr>
+        <w:ind w:left="5040" w:hanging="360"/>
+      </w:pPr>
+    </w:lvl>
+    <w:lvl w:ilvl="7" w:tplc="04090019" w:tentative="1">
+      <w:start w:val="1"/>
+      <w:numFmt w:val="lowerLetter"/>
+      <w:lvlText w:val="%8."/>
+      <w:lvlJc w:val="left"/>
+      <w:pPr>
+        <w:ind w:left="5760" w:hanging="360"/>
+      </w:pPr>
+    </w:lvl>
+    <w:lvl w:ilvl="8" w:tplc="0409001B" w:tentative="1">
+      <w:start w:val="1"/>
+      <w:numFmt w:val="lowerRoman"/>
+      <w:lvlText w:val="%9."/>
+      <w:lvlJc w:val="right"/>
+      <w:pPr>
+        <w:ind w:left="6480" w:hanging="180"/>
+      </w:pPr>
+    </w:lvl>
+  </w:abstractNum>
+  <w:abstractNum w:abstractNumId="1" w15:restartNumberingAfterBreak="0">
+    <w:nsid w:val="369A006E"/>
+    <w:multiLevelType w:val="hybridMultilevel"/>
+    <w:tmpl w:val="C15807F0"/>
+    <w:lvl w:ilvl="0" w:tplc="0409000F">
+      <w:start w:val="1"/>
+      <w:numFmt w:val="decimal"/>
+      <w:lvlText w:val="%1."/>
+      <w:lvlJc w:val="left"/>
+      <w:pPr>
+        <w:ind w:left="720" w:hanging="360"/>
+      </w:pPr>
+      <w:rPr>
+        <w:rFonts w:hint="default"/>
+      </w:rPr>
+    </w:lvl>
+    <w:lvl w:ilvl="1" w:tplc="04090019">
+      <w:start w:val="1"/>
+      <w:numFmt w:val="lowerLetter"/>
+      <w:lvlText w:val="%2."/>
+      <w:lvlJc w:val="left"/>
+      <w:pPr>
+        <w:ind w:left="1440" w:hanging="360"/>
+      </w:pPr>
+    </w:lvl>
+    <w:lvl w:ilvl="2" w:tplc="0409001B" w:tentative="1">
+      <w:start w:val="1"/>
+      <w:numFmt w:val="lowerRoman"/>
+      <w:lvlText w:val="%3."/>
+      <w:lvlJc w:val="right"/>
+      <w:pPr>
+        <w:ind w:left="2160" w:hanging="180"/>
+      </w:pPr>
+    </w:lvl>
+    <w:lvl w:ilvl="3" w:tplc="0409000F" w:tentative="1">
+      <w:start w:val="1"/>
+      <w:numFmt w:val="decimal"/>
+      <w:lvlText w:val="%4."/>
+      <w:lvlJc w:val="left"/>
+      <w:pPr>
+        <w:ind w:left="2880" w:hanging="360"/>
+      </w:pPr>
+    </w:lvl>
+    <w:lvl w:ilvl="4" w:tplc="04090019" w:tentative="1">
+      <w:start w:val="1"/>
+      <w:numFmt w:val="lowerLetter"/>
+      <w:lvlText w:val="%5."/>
+      <w:lvlJc w:val="left"/>
+      <w:pPr>
+        <w:ind w:left="3600" w:hanging="360"/>
+      </w:pPr>
+    </w:lvl>
+    <w:lvl w:ilvl="5" w:tplc="0409001B" w:tentative="1">
+      <w:start w:val="1"/>
+      <w:numFmt w:val="lowerRoman"/>
+      <w:lvlText w:val="%6."/>
+      <w:lvlJc w:val="right"/>
+      <w:pPr>
+        <w:ind w:left="4320" w:hanging="180"/>
+      </w:pPr>
+    </w:lvl>
+    <w:lvl w:ilvl="6" w:tplc="0409000F" w:tentative="1">
+      <w:start w:val="1"/>
+      <w:numFmt w:val="decimal"/>
+      <w:lvlText w:val="%7."/>
+      <w:lvlJc w:val="left"/>
+      <w:pPr>
+        <w:ind w:left="5040" w:hanging="360"/>
+      </w:pPr>
+    </w:lvl>
+    <w:lvl w:ilvl="7" w:tplc="04090019" w:tentative="1">
+      <w:start w:val="1"/>
+      <w:numFmt w:val="lowerLetter"/>
+      <w:lvlText w:val="%8."/>
+      <w:lvlJc w:val="left"/>
+      <w:pPr>
+        <w:ind w:left="5760" w:hanging="360"/>
+      </w:pPr>
+    </w:lvl>
+    <w:lvl w:ilvl="8" w:tplc="0409001B" w:tentative="1">
+      <w:start w:val="1"/>
+      <w:numFmt w:val="lowerRoman"/>
+      <w:lvlText w:val="%9."/>
+      <w:lvlJc w:val="right"/>
+      <w:pPr>
+        <w:ind w:left="6480" w:hanging="180"/>
+      </w:pPr>
+    </w:lvl>
+  </w:abstractNum>
+  <w:abstractNum w:abstractNumId="2" w15:restartNumberingAfterBreak="0">
+    <w:nsid w:val="394B33D4"/>
+    <w:multiLevelType w:val="hybridMultilevel"/>
+    <w:tmpl w:val="15B886D8"/>
+    <w:lvl w:ilvl="0" w:tplc="0409000F">
+      <w:start w:val="1"/>
+      <w:numFmt w:val="decimal"/>
+      <w:lvlText w:val="%1."/>
+      <w:lvlJc w:val="left"/>
+      <w:pPr>
+        <w:ind w:left="720" w:hanging="360"/>
+      </w:pPr>
+      <w:rPr>
+        <w:rFonts w:hint="default"/>
+      </w:rPr>
+    </w:lvl>
+    <w:lvl w:ilvl="1" w:tplc="04090019">
+      <w:start w:val="1"/>
+      <w:numFmt w:val="lowerLetter"/>
+      <w:lvlText w:val="%2."/>
+      <w:lvlJc w:val="left"/>
+      <w:pPr>
+        <w:ind w:left="1440" w:hanging="360"/>
+      </w:pPr>
+    </w:lvl>
+    <w:lvl w:ilvl="2" w:tplc="0409001B">
+      <w:start w:val="1"/>
+      <w:numFmt w:val="lowerRoman"/>
+      <w:lvlText w:val="%3."/>
+      <w:lvlJc w:val="right"/>
+      <w:pPr>
+        <w:ind w:left="2160" w:hanging="180"/>
+      </w:pPr>
+    </w:lvl>
+    <w:lvl w:ilvl="3" w:tplc="0409000F" w:tentative="1">
+      <w:start w:val="1"/>
+      <w:numFmt w:val="decimal"/>
+      <w:lvlText w:val="%4."/>
+      <w:lvlJc w:val="left"/>
+      <w:pPr>
+        <w:ind w:left="2880" w:hanging="360"/>
+      </w:pPr>
+    </w:lvl>
+    <w:lvl w:ilvl="4" w:tplc="04090019" w:tentative="1">
+      <w:start w:val="1"/>
+      <w:numFmt w:val="lowerLetter"/>
+      <w:lvlText w:val="%5."/>
+      <w:lvlJc w:val="left"/>
+      <w:pPr>
+        <w:ind w:left="3600" w:hanging="360"/>
+      </w:pPr>
+    </w:lvl>
+    <w:lvl w:ilvl="5" w:tplc="0409001B" w:tentative="1">
+      <w:start w:val="1"/>
+      <w:numFmt w:val="lowerRoman"/>
+      <w:lvlText w:val="%6."/>
+      <w:lvlJc w:val="right"/>
+      <w:pPr>
+        <w:ind w:left="4320" w:hanging="180"/>
+      </w:pPr>
+    </w:lvl>
+    <w:lvl w:ilvl="6" w:tplc="0409000F" w:tentative="1">
+      <w:start w:val="1"/>
+      <w:numFmt w:val="decimal"/>
+      <w:lvlText w:val="%7."/>
+      <w:lvlJc w:val="left"/>
+      <w:pPr>
+        <w:ind w:left="5040" w:hanging="360"/>
+      </w:pPr>
+    </w:lvl>
+    <w:lvl w:ilvl="7" w:tplc="04090019" w:tentative="1">
+      <w:start w:val="1"/>
+      <w:numFmt w:val="lowerLetter"/>
+      <w:lvlText w:val="%8."/>
+      <w:lvlJc w:val="left"/>
+      <w:pPr>
+        <w:ind w:left="5760" w:hanging="360"/>
+      </w:pPr>
+    </w:lvl>
+    <w:lvl w:ilvl="8" w:tplc="0409001B" w:tentative="1">
+      <w:start w:val="1"/>
+      <w:numFmt w:val="lowerRoman"/>
+      <w:lvlText w:val="%9."/>
+      <w:lvlJc w:val="right"/>
+      <w:pPr>
+        <w:ind w:left="6480" w:hanging="180"/>
+      </w:pPr>
+    </w:lvl>
+  </w:abstractNum>
+  <w:num w:numId="1" w16cid:durableId="1660646443">
+    <w:abstractNumId w:val="1"/>
+  </w:num>
+  <w:num w:numId="2" w16cid:durableId="650646282">
+    <w:abstractNumId w:val="0"/>
+  </w:num>
+  <w:num w:numId="3" w16cid:durableId="1029796945">
+    <w:abstractNumId w:val="2"/>
+  </w:num>
+</w:numbering>
 </file>
 
 <file path=word/styles.xml><?xml version="1.0" encoding="utf-8"?>

</xml_diff>

<commit_message>
Coding session with Brittany
Added notes from our meeting, the code structure is still rough and needs a lot of updates
</commit_message>
<xml_diff>
--- a/paRsynth_methods_draft.docx
+++ b/paRsynth_methods_draft.docx
@@ -66,21 +66,7 @@
         <w:rPr>
           <w:rFonts w:ascii="Arial" w:hAnsi="Arial" w:cs="Arial"/>
         </w:rPr>
-        <w:t xml:space="preserve"> </w:t>
-      </w:r>
-      <w:proofErr w:type="spellStart"/>
-      <w:r>
-        <w:rPr>
-          <w:rFonts w:ascii="Arial" w:hAnsi="Arial" w:cs="Arial"/>
-        </w:rPr>
-        <w:t>paRsynth</w:t>
-      </w:r>
-      <w:proofErr w:type="spellEnd"/>
-      <w:r>
-        <w:rPr>
-          <w:rFonts w:ascii="Arial" w:hAnsi="Arial" w:cs="Arial"/>
-        </w:rPr>
-        <w:t xml:space="preserve"> methods</w:t>
+        <w:t xml:space="preserve"> paRsynth methods</w:t>
       </w:r>
     </w:p>
     <w:p>
@@ -441,7 +427,6 @@
         </w:rPr>
         <w:t xml:space="preserve">: </w:t>
       </w:r>
-      <w:proofErr w:type="gramStart"/>
       <w:r>
         <w:rPr>
           <w:rFonts w:ascii="Arial" w:hAnsi="Arial" w:cs="Arial"/>
@@ -458,14 +443,7 @@
         <w:rPr>
           <w:rFonts w:ascii="Arial" w:hAnsi="Arial" w:cs="Arial"/>
         </w:rPr>
-        <w:t>word</w:t>
-      </w:r>
-      <w:proofErr w:type="gramEnd"/>
-      <w:r>
-        <w:rPr>
-          <w:rFonts w:ascii="Arial" w:hAnsi="Arial" w:cs="Arial"/>
-        </w:rPr>
-        <w:t xml:space="preserve"> </w:t>
+        <w:t xml:space="preserve">word </w:t>
       </w:r>
       <w:r>
         <w:rPr>
@@ -651,41 +629,13 @@
         <w:rPr>
           <w:rFonts w:ascii="Arial" w:hAnsi="Arial" w:cs="Arial"/>
         </w:rPr>
-        <w:t xml:space="preserve">Information theory perspective and </w:t>
-      </w:r>
-      <w:proofErr w:type="gramStart"/>
-      <w:r>
-        <w:rPr>
-          <w:rFonts w:ascii="Arial" w:hAnsi="Arial" w:cs="Arial"/>
-        </w:rPr>
-        <w:t>Parsons</w:t>
-      </w:r>
-      <w:proofErr w:type="gramEnd"/>
-      <w:r>
-        <w:rPr>
-          <w:rFonts w:ascii="Arial" w:hAnsi="Arial" w:cs="Arial"/>
-        </w:rPr>
-        <w:t xml:space="preserve"> code</w:t>
-      </w:r>
-      <w:r>
-        <w:rPr>
-          <w:rFonts w:ascii="Arial" w:hAnsi="Arial" w:cs="Arial"/>
-        </w:rPr>
-        <w:t xml:space="preserve"> for encoding, not just decoding (</w:t>
-      </w:r>
-      <w:proofErr w:type="spellStart"/>
-      <w:r>
-        <w:rPr>
-          <w:rFonts w:ascii="Arial" w:hAnsi="Arial" w:cs="Arial"/>
-        </w:rPr>
-        <w:t>Kershenbaum</w:t>
-      </w:r>
-      <w:proofErr w:type="spellEnd"/>
-      <w:r>
-        <w:rPr>
-          <w:rFonts w:ascii="Arial" w:hAnsi="Arial" w:cs="Arial"/>
-        </w:rPr>
-        <w:t>)</w:t>
+        <w:t>Information theory perspective and Parsons code</w:t>
+      </w:r>
+      <w:r>
+        <w:rPr>
+          <w:rFonts w:ascii="Arial" w:hAnsi="Arial" w:cs="Arial"/>
+        </w:rPr>
+        <w:t xml:space="preserve"> for encoding, not just decoding (Kershenbaum)</w:t>
       </w:r>
     </w:p>
     <w:p>
@@ -799,21 +749,7 @@
         <w:rPr>
           <w:rFonts w:ascii="Arial" w:hAnsi="Arial" w:cs="Arial"/>
         </w:rPr>
-        <w:t>Linking an information theory perspective to creating synthetic signals and controlling types and amounts of information encoded in these signals (</w:t>
-      </w:r>
-      <w:proofErr w:type="spellStart"/>
-      <w:r>
-        <w:rPr>
-          <w:rFonts w:ascii="Arial" w:hAnsi="Arial" w:cs="Arial"/>
-        </w:rPr>
-        <w:t>paRsynth</w:t>
-      </w:r>
-      <w:proofErr w:type="spellEnd"/>
-      <w:r>
-        <w:rPr>
-          <w:rFonts w:ascii="Arial" w:hAnsi="Arial" w:cs="Arial"/>
-        </w:rPr>
-        <w:t xml:space="preserve"> package)</w:t>
+        <w:t>Linking an information theory perspective to creating synthetic signals and controlling types and amounts of information encoded in these signals (paRsynth package)</w:t>
       </w:r>
     </w:p>
     <w:p>
@@ -831,21 +767,7 @@
         <w:rPr>
           <w:rFonts w:ascii="Arial" w:hAnsi="Arial" w:cs="Arial"/>
         </w:rPr>
-        <w:t xml:space="preserve">Be careful about pitching </w:t>
-      </w:r>
-      <w:proofErr w:type="spellStart"/>
-      <w:r>
-        <w:rPr>
-          <w:rFonts w:ascii="Arial" w:hAnsi="Arial" w:cs="Arial"/>
-        </w:rPr>
-        <w:t>paRsynth</w:t>
-      </w:r>
-      <w:proofErr w:type="spellEnd"/>
-      <w:r>
-        <w:rPr>
-          <w:rFonts w:ascii="Arial" w:hAnsi="Arial" w:cs="Arial"/>
-        </w:rPr>
-        <w:t xml:space="preserve"> too broadly, right now this is an in-house tool/set of functions</w:t>
+        <w:t>Be careful about pitching paRsynth too broadly, right now this is an in-house tool/set of functions</w:t>
       </w:r>
     </w:p>
     <w:p>
@@ -993,19 +915,11 @@
           <w:rFonts w:ascii="Arial" w:hAnsi="Arial" w:cs="Arial"/>
         </w:rPr>
       </w:pPr>
-      <w:proofErr w:type="spellStart"/>
-      <w:r>
-        <w:rPr>
-          <w:rFonts w:ascii="Arial" w:hAnsi="Arial" w:cs="Arial"/>
-        </w:rPr>
-        <w:t>paRsynth</w:t>
-      </w:r>
-      <w:proofErr w:type="spellEnd"/>
-      <w:r>
-        <w:rPr>
-          <w:rFonts w:ascii="Arial" w:hAnsi="Arial" w:cs="Arial"/>
-        </w:rPr>
-        <w:t xml:space="preserve"> functions</w:t>
+      <w:r>
+        <w:rPr>
+          <w:rFonts w:ascii="Arial" w:hAnsi="Arial" w:cs="Arial"/>
+        </w:rPr>
+        <w:t>paRsynth functions</w:t>
       </w:r>
     </w:p>
     <w:p>
@@ -1029,41 +943,13 @@
         <w:rPr>
           <w:rFonts w:ascii="Arial" w:hAnsi="Arial" w:cs="Arial"/>
         </w:rPr>
-        <w:t>nformation “</w:t>
-      </w:r>
-      <w:proofErr w:type="spellStart"/>
-      <w:r>
-        <w:rPr>
-          <w:rFonts w:ascii="Arial" w:hAnsi="Arial" w:cs="Arial"/>
-        </w:rPr>
-        <w:t>trits</w:t>
-      </w:r>
-      <w:proofErr w:type="spellEnd"/>
-      <w:r>
-        <w:rPr>
-          <w:rFonts w:ascii="Arial" w:hAnsi="Arial" w:cs="Arial"/>
-        </w:rPr>
-        <w:t>”</w:t>
-      </w:r>
-      <w:r>
-        <w:rPr>
-          <w:rFonts w:ascii="Arial" w:hAnsi="Arial" w:cs="Arial"/>
-        </w:rPr>
-        <w:t xml:space="preserve"> and base-3 </w:t>
-      </w:r>
-      <w:proofErr w:type="gramStart"/>
-      <w:r>
-        <w:rPr>
-          <w:rFonts w:ascii="Arial" w:hAnsi="Arial" w:cs="Arial"/>
-        </w:rPr>
-        <w:t>Parsons</w:t>
-      </w:r>
-      <w:proofErr w:type="gramEnd"/>
-      <w:r>
-        <w:rPr>
-          <w:rFonts w:ascii="Arial" w:hAnsi="Arial" w:cs="Arial"/>
-        </w:rPr>
-        <w:t xml:space="preserve"> </w:t>
+        <w:t>nformation “trits”</w:t>
+      </w:r>
+      <w:r>
+        <w:rPr>
+          <w:rFonts w:ascii="Arial" w:hAnsi="Arial" w:cs="Arial"/>
+        </w:rPr>
+        <w:t xml:space="preserve"> and base-3 Parsons </w:t>
       </w:r>
       <w:r>
         <w:rPr>
@@ -1087,6 +973,12 @@
         <w:rPr>
           <w:rFonts w:ascii="Arial" w:hAnsi="Arial" w:cs="Arial"/>
         </w:rPr>
+        <w:t xml:space="preserve">Pseudocode for our </w:t>
+      </w:r>
+      <w:r>
+        <w:rPr>
+          <w:rFonts w:ascii="Arial" w:hAnsi="Arial" w:cs="Arial"/>
+        </w:rPr>
         <w:t>“Information recovery pipeline”</w:t>
       </w:r>
     </w:p>
@@ -1129,6 +1021,30 @@
         <w:rPr>
           <w:rFonts w:ascii="Arial" w:hAnsi="Arial" w:cs="Arial"/>
         </w:rPr>
+        <w:t>Create the synthetic call datasets</w:t>
+      </w:r>
+      <w:r>
+        <w:rPr>
+          <w:rFonts w:ascii="Arial" w:hAnsi="Arial" w:cs="Arial"/>
+        </w:rPr>
+        <w:t xml:space="preserve"> and the treatments for experiments of information recovery</w:t>
+      </w:r>
+    </w:p>
+    <w:p>
+      <w:pPr>
+        <w:pStyle w:val="ListParagraph"/>
+        <w:numPr>
+          <w:ilvl w:val="1"/>
+          <w:numId w:val="3"/>
+        </w:numPr>
+        <w:rPr>
+          <w:rFonts w:ascii="Arial" w:hAnsi="Arial" w:cs="Arial"/>
+        </w:rPr>
+      </w:pPr>
+      <w:r>
+        <w:rPr>
+          <w:rFonts w:ascii="Arial" w:hAnsi="Arial" w:cs="Arial"/>
+        </w:rPr>
         <w:t>SPCC</w:t>
       </w:r>
       <w:r>
@@ -1153,21 +1069,7 @@
         <w:rPr>
           <w:rFonts w:ascii="Arial" w:hAnsi="Arial" w:cs="Arial"/>
         </w:rPr>
-        <w:t>Multi-</w:t>
-      </w:r>
-      <w:proofErr w:type="spellStart"/>
-      <w:r>
-        <w:rPr>
-          <w:rFonts w:ascii="Arial" w:hAnsi="Arial" w:cs="Arial"/>
-        </w:rPr>
-        <w:t>dimensional scalin</w:t>
-      </w:r>
-      <w:proofErr w:type="spellEnd"/>
-      <w:r>
-        <w:rPr>
-          <w:rFonts w:ascii="Arial" w:hAnsi="Arial" w:cs="Arial"/>
-        </w:rPr>
-        <w:t xml:space="preserve">g </w:t>
+        <w:t xml:space="preserve">Multi-dimensional scaling </w:t>
       </w:r>
       <w:r>
         <w:rPr>
@@ -1215,6 +1117,7 @@
         <w:rPr>
           <w:rFonts w:ascii="Arial" w:hAnsi="Arial" w:cs="Arial"/>
         </w:rPr>
+        <w:lastRenderedPageBreak/>
         <w:t>Frequency contour tracing</w:t>
       </w:r>
       <w:r>
@@ -1287,7 +1190,6 @@
         <w:rPr>
           <w:rFonts w:ascii="Arial" w:hAnsi="Arial" w:cs="Arial"/>
         </w:rPr>
-        <w:lastRenderedPageBreak/>
         <w:t>Dynamic time warping to compare the time series of the frequency contours</w:t>
       </w:r>
     </w:p>

</xml_diff>

<commit_message>
Title candidates, plan B journals
</commit_message>
<xml_diff>
--- a/paRsynth_methods_draft.docx
+++ b/paRsynth_methods_draft.docx
@@ -26,7 +26,89 @@
         <w:rPr>
           <w:rFonts w:ascii="Arial" w:hAnsi="Arial" w:cs="Arial"/>
         </w:rPr>
-        <w:t xml:space="preserve"> TKTK</w:t>
+        <w:t xml:space="preserve"> </w:t>
+      </w:r>
+    </w:p>
+    <w:p>
+      <w:pPr>
+        <w:rPr>
+          <w:rFonts w:ascii="Arial" w:hAnsi="Arial" w:cs="Arial"/>
+        </w:rPr>
+      </w:pPr>
+    </w:p>
+    <w:p>
+      <w:pPr>
+        <w:rPr>
+          <w:rFonts w:ascii="Arial" w:hAnsi="Arial" w:cs="Arial"/>
+        </w:rPr>
+      </w:pPr>
+      <w:r>
+        <w:rPr>
+          <w:rFonts w:ascii="Arial" w:hAnsi="Arial" w:cs="Arial"/>
+        </w:rPr>
+        <w:t xml:space="preserve">An information theoretic approach </w:t>
+      </w:r>
+      <w:r>
+        <w:rPr>
+          <w:rFonts w:ascii="Arial" w:hAnsi="Arial" w:cs="Arial"/>
+        </w:rPr>
+        <w:t>to generate synthetic vocalizations</w:t>
+      </w:r>
+    </w:p>
+    <w:p>
+      <w:pPr>
+        <w:rPr>
+          <w:rFonts w:ascii="Arial" w:hAnsi="Arial" w:cs="Arial"/>
+        </w:rPr>
+      </w:pPr>
+      <w:r>
+        <w:rPr>
+          <w:rFonts w:ascii="Arial" w:hAnsi="Arial" w:cs="Arial"/>
+        </w:rPr>
+        <w:t>Simulat</w:t>
+      </w:r>
+      <w:r>
+        <w:rPr>
+          <w:rFonts w:ascii="Arial" w:hAnsi="Arial" w:cs="Arial"/>
+        </w:rPr>
+        <w:t>ing complex</w:t>
+      </w:r>
+      <w:r>
+        <w:rPr>
+          <w:rFonts w:ascii="Arial" w:hAnsi="Arial" w:cs="Arial"/>
+        </w:rPr>
+        <w:t xml:space="preserve"> information encoding</w:t>
+      </w:r>
+      <w:r>
+        <w:rPr>
+          <w:rFonts w:ascii="Arial" w:hAnsi="Arial" w:cs="Arial"/>
+        </w:rPr>
+        <w:t xml:space="preserve"> in synthetic vocalizations</w:t>
+      </w:r>
+    </w:p>
+    <w:p>
+      <w:pPr>
+        <w:rPr>
+          <w:rFonts w:ascii="Arial" w:hAnsi="Arial" w:cs="Arial"/>
+        </w:rPr>
+      </w:pPr>
+      <w:r>
+        <w:rPr>
+          <w:rFonts w:ascii="Arial" w:hAnsi="Arial" w:cs="Arial"/>
+        </w:rPr>
+        <w:t xml:space="preserve">Simulations of </w:t>
+      </w:r>
+      <w:r>
+        <w:rPr>
+          <w:rFonts w:ascii="Arial" w:hAnsi="Arial" w:cs="Arial"/>
+        </w:rPr>
+        <w:t>social information encoding in synthetic vocalizations</w:t>
+      </w:r>
+      <w:r>
+        <w:rPr>
+          <w:rFonts w:ascii="Arial" w:hAnsi="Arial" w:cs="Arial"/>
+        </w:rPr>
+        <w:t xml:space="preserve"> </w:t>
       </w:r>
     </w:p>
     <w:p>
@@ -60,27 +142,19 @@
         <w:rPr>
           <w:rFonts w:ascii="Arial" w:hAnsi="Arial" w:cs="Arial"/>
         </w:rPr>
-        <w:t xml:space="preserve"> TKTK</w:t>
-      </w:r>
-      <w:r>
-        <w:rPr>
-          <w:rFonts w:ascii="Arial" w:hAnsi="Arial" w:cs="Arial"/>
-        </w:rPr>
-        <w:t xml:space="preserve"> </w:t>
-      </w:r>
-      <w:proofErr w:type="spellStart"/>
-      <w:r>
-        <w:rPr>
-          <w:rFonts w:ascii="Arial" w:hAnsi="Arial" w:cs="Arial"/>
-        </w:rPr>
-        <w:t>paRsynth</w:t>
-      </w:r>
-      <w:proofErr w:type="spellEnd"/>
-      <w:r>
-        <w:rPr>
-          <w:rFonts w:ascii="Arial" w:hAnsi="Arial" w:cs="Arial"/>
-        </w:rPr>
-        <w:t xml:space="preserve"> methods</w:t>
+        <w:t xml:space="preserve"> T</w:t>
+      </w:r>
+      <w:r>
+        <w:rPr>
+          <w:rFonts w:ascii="Arial" w:hAnsi="Arial" w:cs="Arial"/>
+        </w:rPr>
+        <w:t xml:space="preserve">KTK </w:t>
+      </w:r>
+      <w:r>
+        <w:rPr>
+          <w:rFonts w:ascii="Arial" w:hAnsi="Arial" w:cs="Arial"/>
+        </w:rPr>
+        <w:t>paRsynth methods</w:t>
       </w:r>
     </w:p>
     <w:p>
@@ -433,6 +507,40 @@
           <w:b/>
           <w:bCs/>
         </w:rPr>
+        <w:t>Submission Plan B</w:t>
+      </w:r>
+      <w:r>
+        <w:rPr>
+          <w:rFonts w:ascii="Arial" w:hAnsi="Arial" w:cs="Arial"/>
+        </w:rPr>
+        <w:t>: PLOS Computational Biology?</w:t>
+      </w:r>
+      <w:r>
+        <w:rPr>
+          <w:rFonts w:ascii="Arial" w:hAnsi="Arial" w:cs="Arial"/>
+        </w:rPr>
+        <w:t xml:space="preserve"> Maybe NPJ Complexity?</w:t>
+      </w:r>
+    </w:p>
+    <w:p>
+      <w:pPr>
+        <w:rPr>
+          <w:rFonts w:ascii="Arial" w:hAnsi="Arial" w:cs="Arial"/>
+        </w:rPr>
+      </w:pPr>
+    </w:p>
+    <w:p>
+      <w:pPr>
+        <w:rPr>
+          <w:rFonts w:ascii="Arial" w:hAnsi="Arial" w:cs="Arial"/>
+        </w:rPr>
+      </w:pPr>
+      <w:r>
+        <w:rPr>
+          <w:rFonts w:ascii="Arial" w:hAnsi="Arial" w:cs="Arial"/>
+          <w:b/>
+          <w:bCs/>
+        </w:rPr>
         <w:t>Word Count</w:t>
       </w:r>
       <w:r>
@@ -441,7 +549,6 @@
         </w:rPr>
         <w:t xml:space="preserve">: </w:t>
       </w:r>
-      <w:proofErr w:type="gramStart"/>
       <w:r>
         <w:rPr>
           <w:rFonts w:ascii="Arial" w:hAnsi="Arial" w:cs="Arial"/>
@@ -458,14 +565,7 @@
         <w:rPr>
           <w:rFonts w:ascii="Arial" w:hAnsi="Arial" w:cs="Arial"/>
         </w:rPr>
-        <w:t>word</w:t>
-      </w:r>
-      <w:proofErr w:type="gramEnd"/>
-      <w:r>
-        <w:rPr>
-          <w:rFonts w:ascii="Arial" w:hAnsi="Arial" w:cs="Arial"/>
-        </w:rPr>
-        <w:t xml:space="preserve"> </w:t>
+        <w:t xml:space="preserve">word </w:t>
       </w:r>
       <w:r>
         <w:rPr>
@@ -651,41 +751,13 @@
         <w:rPr>
           <w:rFonts w:ascii="Arial" w:hAnsi="Arial" w:cs="Arial"/>
         </w:rPr>
-        <w:t xml:space="preserve">Information theory perspective and </w:t>
-      </w:r>
-      <w:proofErr w:type="gramStart"/>
-      <w:r>
-        <w:rPr>
-          <w:rFonts w:ascii="Arial" w:hAnsi="Arial" w:cs="Arial"/>
-        </w:rPr>
-        <w:t>Parsons</w:t>
-      </w:r>
-      <w:proofErr w:type="gramEnd"/>
-      <w:r>
-        <w:rPr>
-          <w:rFonts w:ascii="Arial" w:hAnsi="Arial" w:cs="Arial"/>
-        </w:rPr>
-        <w:t xml:space="preserve"> code</w:t>
-      </w:r>
-      <w:r>
-        <w:rPr>
-          <w:rFonts w:ascii="Arial" w:hAnsi="Arial" w:cs="Arial"/>
-        </w:rPr>
-        <w:t xml:space="preserve"> for encoding, not just decoding (</w:t>
-      </w:r>
-      <w:proofErr w:type="spellStart"/>
-      <w:r>
-        <w:rPr>
-          <w:rFonts w:ascii="Arial" w:hAnsi="Arial" w:cs="Arial"/>
-        </w:rPr>
-        <w:t>Kershenbaum</w:t>
-      </w:r>
-      <w:proofErr w:type="spellEnd"/>
-      <w:r>
-        <w:rPr>
-          <w:rFonts w:ascii="Arial" w:hAnsi="Arial" w:cs="Arial"/>
-        </w:rPr>
-        <w:t>)</w:t>
+        <w:t>Information theory perspective and Parsons code</w:t>
+      </w:r>
+      <w:r>
+        <w:rPr>
+          <w:rFonts w:ascii="Arial" w:hAnsi="Arial" w:cs="Arial"/>
+        </w:rPr>
+        <w:t xml:space="preserve"> for encoding, not just decoding (Kershenbaum)</w:t>
       </w:r>
     </w:p>
     <w:p>
@@ -799,21 +871,7 @@
         <w:rPr>
           <w:rFonts w:ascii="Arial" w:hAnsi="Arial" w:cs="Arial"/>
         </w:rPr>
-        <w:t>Linking an information theory perspective to creating synthetic signals and controlling types and amounts of information encoded in these signals (</w:t>
-      </w:r>
-      <w:proofErr w:type="spellStart"/>
-      <w:r>
-        <w:rPr>
-          <w:rFonts w:ascii="Arial" w:hAnsi="Arial" w:cs="Arial"/>
-        </w:rPr>
-        <w:t>paRsynth</w:t>
-      </w:r>
-      <w:proofErr w:type="spellEnd"/>
-      <w:r>
-        <w:rPr>
-          <w:rFonts w:ascii="Arial" w:hAnsi="Arial" w:cs="Arial"/>
-        </w:rPr>
-        <w:t xml:space="preserve"> package)</w:t>
+        <w:t>Linking an information theory perspective to creating synthetic signals and controlling types and amounts of information encoded in these signals (paRsynth package)</w:t>
       </w:r>
     </w:p>
     <w:p>
@@ -831,21 +889,7 @@
         <w:rPr>
           <w:rFonts w:ascii="Arial" w:hAnsi="Arial" w:cs="Arial"/>
         </w:rPr>
-        <w:t xml:space="preserve">Be careful about pitching </w:t>
-      </w:r>
-      <w:proofErr w:type="spellStart"/>
-      <w:r>
-        <w:rPr>
-          <w:rFonts w:ascii="Arial" w:hAnsi="Arial" w:cs="Arial"/>
-        </w:rPr>
-        <w:t>paRsynth</w:t>
-      </w:r>
-      <w:proofErr w:type="spellEnd"/>
-      <w:r>
-        <w:rPr>
-          <w:rFonts w:ascii="Arial" w:hAnsi="Arial" w:cs="Arial"/>
-        </w:rPr>
-        <w:t xml:space="preserve"> too broadly, right now this is an in-house tool/set of functions</w:t>
+        <w:t>Be careful about pitching paRsynth too broadly, right now this is an in-house tool/set of functions</w:t>
       </w:r>
     </w:p>
     <w:p>
@@ -995,19 +1039,11 @@
           <w:rFonts w:ascii="Arial" w:hAnsi="Arial" w:cs="Arial"/>
         </w:rPr>
       </w:pPr>
-      <w:proofErr w:type="spellStart"/>
-      <w:r>
-        <w:rPr>
-          <w:rFonts w:ascii="Arial" w:hAnsi="Arial" w:cs="Arial"/>
-        </w:rPr>
-        <w:t>paRsynth</w:t>
-      </w:r>
-      <w:proofErr w:type="spellEnd"/>
-      <w:r>
-        <w:rPr>
-          <w:rFonts w:ascii="Arial" w:hAnsi="Arial" w:cs="Arial"/>
-        </w:rPr>
-        <w:t xml:space="preserve"> functions</w:t>
+      <w:r>
+        <w:rPr>
+          <w:rFonts w:ascii="Arial" w:hAnsi="Arial" w:cs="Arial"/>
+        </w:rPr>
+        <w:t>paRsynth functions</w:t>
       </w:r>
     </w:p>
     <w:p>
@@ -1033,41 +1069,13 @@
         <w:rPr>
           <w:rFonts w:ascii="Arial" w:hAnsi="Arial" w:cs="Arial"/>
         </w:rPr>
-        <w:t>nformation “</w:t>
-      </w:r>
-      <w:proofErr w:type="spellStart"/>
-      <w:r>
-        <w:rPr>
-          <w:rFonts w:ascii="Arial" w:hAnsi="Arial" w:cs="Arial"/>
-        </w:rPr>
-        <w:t>trits</w:t>
-      </w:r>
-      <w:proofErr w:type="spellEnd"/>
-      <w:r>
-        <w:rPr>
-          <w:rFonts w:ascii="Arial" w:hAnsi="Arial" w:cs="Arial"/>
-        </w:rPr>
-        <w:t>”</w:t>
-      </w:r>
-      <w:r>
-        <w:rPr>
-          <w:rFonts w:ascii="Arial" w:hAnsi="Arial" w:cs="Arial"/>
-        </w:rPr>
-        <w:t xml:space="preserve"> and base-3 </w:t>
-      </w:r>
-      <w:proofErr w:type="gramStart"/>
-      <w:r>
-        <w:rPr>
-          <w:rFonts w:ascii="Arial" w:hAnsi="Arial" w:cs="Arial"/>
-        </w:rPr>
-        <w:t>Parsons</w:t>
-      </w:r>
-      <w:proofErr w:type="gramEnd"/>
-      <w:r>
-        <w:rPr>
-          <w:rFonts w:ascii="Arial" w:hAnsi="Arial" w:cs="Arial"/>
-        </w:rPr>
-        <w:t xml:space="preserve"> </w:t>
+        <w:t>nformation “trits”</w:t>
+      </w:r>
+      <w:r>
+        <w:rPr>
+          <w:rFonts w:ascii="Arial" w:hAnsi="Arial" w:cs="Arial"/>
+        </w:rPr>
+        <w:t xml:space="preserve"> and base-3 Parsons </w:t>
       </w:r>
       <w:r>
         <w:rPr>
@@ -1210,21 +1218,7 @@
           <w:rFonts w:ascii="Arial" w:hAnsi="Arial" w:cs="Arial"/>
         </w:rPr>
         <w:lastRenderedPageBreak/>
-        <w:t xml:space="preserve">Or add a subsampling approach to this paper? Keep thinking about this, because Bayesian modeling of group and individual level variation is </w:t>
-      </w:r>
-      <w:proofErr w:type="gramStart"/>
-      <w:r>
-        <w:rPr>
-          <w:rFonts w:ascii="Arial" w:hAnsi="Arial" w:cs="Arial"/>
-        </w:rPr>
-        <w:t>really useful</w:t>
-      </w:r>
-      <w:proofErr w:type="gramEnd"/>
-      <w:r>
-        <w:rPr>
-          <w:rFonts w:ascii="Arial" w:hAnsi="Arial" w:cs="Arial"/>
-        </w:rPr>
-        <w:t xml:space="preserve"> and use fewer numbers of groups and individuals in the social environment</w:t>
+        <w:t>Or add a subsampling approach to this paper? Keep thinking about this, because Bayesian modeling of group and individual level variation is really useful and use fewer numbers of groups and individuals in the social environment</w:t>
       </w:r>
     </w:p>
     <w:p>
@@ -1256,16 +1250,8 @@
         <w:rPr>
           <w:rFonts w:ascii="Arial" w:hAnsi="Arial" w:cs="Arial"/>
         </w:rPr>
-        <w:t xml:space="preserve">with </w:t>
-      </w:r>
-      <w:proofErr w:type="spellStart"/>
-      <w:r>
-        <w:rPr>
-          <w:rFonts w:ascii="Arial" w:hAnsi="Arial" w:cs="Arial"/>
-        </w:rPr>
-        <w:t>paRsynth</w:t>
-      </w:r>
-      <w:proofErr w:type="spellEnd"/>
+        <w:t>with paRsynth</w:t>
+      </w:r>
       <w:r>
         <w:rPr>
           <w:rFonts w:ascii="Arial" w:hAnsi="Arial" w:cs="Arial"/>
@@ -1670,21 +1656,7 @@
         <w:rPr>
           <w:rFonts w:ascii="Arial" w:hAnsi="Arial" w:cs="Arial"/>
         </w:rPr>
-        <w:t xml:space="preserve">Analysis questions: How similar are an individual’s calls to its own calls, compared to calls of other individuals? And the same </w:t>
-      </w:r>
-      <w:proofErr w:type="spellStart"/>
-      <w:r>
-        <w:rPr>
-          <w:rFonts w:ascii="Arial" w:hAnsi="Arial" w:cs="Arial"/>
-        </w:rPr>
-        <w:t>for</w:t>
-      </w:r>
-      <w:proofErr w:type="spellEnd"/>
-      <w:r>
-        <w:rPr>
-          <w:rFonts w:ascii="Arial" w:hAnsi="Arial" w:cs="Arial"/>
-        </w:rPr>
-        <w:t xml:space="preserve"> groups</w:t>
+        <w:t>Analysis questions: How similar are an individual’s calls to its own calls, compared to calls of other individuals? And the same for groups</w:t>
       </w:r>
     </w:p>
     <w:p>
@@ -1717,21 +1689,7 @@
         <w:rPr>
           <w:rFonts w:ascii="Arial" w:hAnsi="Arial" w:cs="Arial"/>
         </w:rPr>
-        <w:t xml:space="preserve"> (which we originally encoded using </w:t>
-      </w:r>
-      <w:proofErr w:type="spellStart"/>
-      <w:r>
-        <w:rPr>
-          <w:rFonts w:ascii="Arial" w:hAnsi="Arial" w:cs="Arial"/>
-        </w:rPr>
-        <w:t>paRsynth</w:t>
-      </w:r>
-      <w:proofErr w:type="spellEnd"/>
-      <w:r>
-        <w:rPr>
-          <w:rFonts w:ascii="Arial" w:hAnsi="Arial" w:cs="Arial"/>
-        </w:rPr>
-        <w:t>)</w:t>
+        <w:t xml:space="preserve"> (which we originally encoded using paRsynth)</w:t>
       </w:r>
       <w:r>
         <w:rPr>
@@ -1775,21 +1733,7 @@
         <w:rPr>
           <w:rFonts w:ascii="Arial" w:hAnsi="Arial" w:cs="Arial"/>
         </w:rPr>
-        <w:t xml:space="preserve">. Does the variation that we encoded </w:t>
-      </w:r>
-      <w:proofErr w:type="gramStart"/>
-      <w:r>
-        <w:rPr>
-          <w:rFonts w:ascii="Arial" w:hAnsi="Arial" w:cs="Arial"/>
-        </w:rPr>
-        <w:t>actually matter</w:t>
-      </w:r>
-      <w:proofErr w:type="gramEnd"/>
-      <w:r>
-        <w:rPr>
-          <w:rFonts w:ascii="Arial" w:hAnsi="Arial" w:cs="Arial"/>
-        </w:rPr>
-        <w:t>???</w:t>
+        <w:t>. Does the variation that we encoded actually matter???</w:t>
       </w:r>
     </w:p>
     <w:p>
@@ -1815,21 +1759,7 @@
         <w:rPr>
           <w:rFonts w:ascii="Arial" w:hAnsi="Arial" w:cs="Arial"/>
         </w:rPr>
-        <w:t xml:space="preserve">individuals, we can </w:t>
-      </w:r>
-      <w:proofErr w:type="gramStart"/>
-      <w:r>
-        <w:rPr>
-          <w:rFonts w:ascii="Arial" w:hAnsi="Arial" w:cs="Arial"/>
-        </w:rPr>
-        <w:t>actually model</w:t>
-      </w:r>
-      <w:proofErr w:type="gramEnd"/>
-      <w:r>
-        <w:rPr>
-          <w:rFonts w:ascii="Arial" w:hAnsi="Arial" w:cs="Arial"/>
-        </w:rPr>
-        <w:t xml:space="preserve"> variation in convergence within and between categories (individuals, groups) </w:t>
+        <w:t xml:space="preserve">individuals, we can actually model variation in convergence within and between categories (individuals, groups) </w:t>
       </w:r>
       <w:r>
         <w:rPr>
@@ -1979,35 +1909,11 @@
           <w:rFonts w:ascii="Arial" w:hAnsi="Arial" w:cs="Arial"/>
         </w:rPr>
       </w:pPr>
-      <w:proofErr w:type="spellStart"/>
-      <w:proofErr w:type="gramStart"/>
-      <w:r>
-        <w:rPr>
-          <w:rFonts w:ascii="Arial" w:hAnsi="Arial" w:cs="Arial"/>
-        </w:rPr>
-        <w:t>soundgen</w:t>
-      </w:r>
-      <w:proofErr w:type="spellEnd"/>
-      <w:r>
-        <w:rPr>
-          <w:rFonts w:ascii="Arial" w:hAnsi="Arial" w:cs="Arial"/>
-        </w:rPr>
-        <w:t>::</w:t>
-      </w:r>
-      <w:proofErr w:type="spellStart"/>
-      <w:proofErr w:type="gramEnd"/>
-      <w:r>
-        <w:rPr>
-          <w:rFonts w:ascii="Arial" w:hAnsi="Arial" w:cs="Arial"/>
-        </w:rPr>
-        <w:t>soundgen</w:t>
-      </w:r>
-      <w:proofErr w:type="spellEnd"/>
-      <w:r>
-        <w:rPr>
-          <w:rFonts w:ascii="Arial" w:hAnsi="Arial" w:cs="Arial"/>
-        </w:rPr>
-        <w:t>()</w:t>
+      <w:r>
+        <w:rPr>
+          <w:rFonts w:ascii="Arial" w:hAnsi="Arial" w:cs="Arial"/>
+        </w:rPr>
+        <w:t>soundgen::soundgen()</w:t>
       </w:r>
       <w:r>
         <w:rPr>
@@ -2033,21 +1939,7 @@
         <w:rPr>
           <w:rFonts w:ascii="Arial" w:hAnsi="Arial" w:cs="Arial"/>
         </w:rPr>
-        <w:t xml:space="preserve">Create spectrograms for 50 audio files, feed them to </w:t>
-      </w:r>
-      <w:proofErr w:type="spellStart"/>
-      <w:r>
-        <w:rPr>
-          <w:rFonts w:ascii="Arial" w:hAnsi="Arial" w:cs="Arial"/>
-        </w:rPr>
-        <w:t>soundgen</w:t>
-      </w:r>
-      <w:proofErr w:type="spellEnd"/>
-      <w:r>
-        <w:rPr>
-          <w:rFonts w:ascii="Arial" w:hAnsi="Arial" w:cs="Arial"/>
-        </w:rPr>
-        <w:t xml:space="preserve"> using code that Grace has already to pull out the estimated fundamental frequency contour, create spectrograms again with the frequency contour overlaid to check the accuracy of the tracing</w:t>
+        <w:t>Create spectrograms for 50 audio files, feed them to soundgen using code that Grace has already to pull out the estimated fundamental frequency contour, create spectrograms again with the frequency contour overlaid to check the accuracy of the tracing</w:t>
       </w:r>
     </w:p>
     <w:p>
@@ -2087,21 +1979,7 @@
         <w:rPr>
           <w:rFonts w:ascii="Arial" w:hAnsi="Arial" w:cs="Arial"/>
         </w:rPr>
-        <w:t xml:space="preserve">But when I create spectrograms in </w:t>
-      </w:r>
-      <w:proofErr w:type="spellStart"/>
-      <w:r>
-        <w:rPr>
-          <w:rFonts w:ascii="Arial" w:hAnsi="Arial" w:cs="Arial"/>
-        </w:rPr>
-        <w:t>soundgen</w:t>
-      </w:r>
-      <w:proofErr w:type="spellEnd"/>
-      <w:r>
-        <w:rPr>
-          <w:rFonts w:ascii="Arial" w:hAnsi="Arial" w:cs="Arial"/>
-        </w:rPr>
-        <w:t>, the contours look great</w:t>
+        <w:t>But when I create spectrograms in soundgen, the contours look great</w:t>
       </w:r>
     </w:p>
     <w:p>
@@ -2117,19 +1995,11 @@
           <w:rFonts w:ascii="Arial" w:hAnsi="Arial" w:cs="Arial"/>
         </w:rPr>
       </w:pPr>
-      <w:proofErr w:type="spellStart"/>
-      <w:r>
-        <w:rPr>
-          <w:rFonts w:ascii="Arial" w:hAnsi="Arial" w:cs="Arial"/>
-        </w:rPr>
-        <w:t>Soundgen</w:t>
-      </w:r>
-      <w:proofErr w:type="spellEnd"/>
-      <w:r>
-        <w:rPr>
-          <w:rFonts w:ascii="Arial" w:hAnsi="Arial" w:cs="Arial"/>
-        </w:rPr>
-        <w:t xml:space="preserve"> has a Shiny app in which you can upload audio files and do manual correction of the frequency contour online</w:t>
+      <w:r>
+        <w:rPr>
+          <w:rFonts w:ascii="Arial" w:hAnsi="Arial" w:cs="Arial"/>
+        </w:rPr>
+        <w:t>Soundgen has a Shiny app in which you can upload audio files and do manual correction of the frequency contour online</w:t>
       </w:r>
       <w:r>
         <w:rPr>
@@ -2218,21 +2088,7 @@
         <w:rPr>
           <w:rFonts w:ascii="Arial" w:hAnsi="Arial" w:cs="Arial"/>
         </w:rPr>
-        <w:t xml:space="preserve">used with the </w:t>
-      </w:r>
-      <w:proofErr w:type="spellStart"/>
-      <w:r>
-        <w:rPr>
-          <w:rFonts w:ascii="Arial" w:hAnsi="Arial" w:cs="Arial"/>
-        </w:rPr>
-        <w:t>dtw</w:t>
-      </w:r>
-      <w:proofErr w:type="spellEnd"/>
-      <w:r>
-        <w:rPr>
-          <w:rFonts w:ascii="Arial" w:hAnsi="Arial" w:cs="Arial"/>
-        </w:rPr>
-        <w:t xml:space="preserve"> package in R</w:t>
+        <w:t>used with the dtw package in R</w:t>
       </w:r>
     </w:p>
     <w:p>

</xml_diff>

<commit_message>
Notes about multilevel modeling
</commit_message>
<xml_diff>
--- a/paRsynth_methods_draft.docx
+++ b/paRsynth_methods_draft.docx
@@ -150,11 +150,19 @@
         </w:rPr>
         <w:t xml:space="preserve">KTK </w:t>
       </w:r>
-      <w:r>
-        <w:rPr>
-          <w:rFonts w:ascii="Arial" w:hAnsi="Arial" w:cs="Arial"/>
-        </w:rPr>
-        <w:t>paRsynth methods</w:t>
+      <w:proofErr w:type="spellStart"/>
+      <w:r>
+        <w:rPr>
+          <w:rFonts w:ascii="Arial" w:hAnsi="Arial" w:cs="Arial"/>
+        </w:rPr>
+        <w:t>paRsynth</w:t>
+      </w:r>
+      <w:proofErr w:type="spellEnd"/>
+      <w:r>
+        <w:rPr>
+          <w:rFonts w:ascii="Arial" w:hAnsi="Arial" w:cs="Arial"/>
+        </w:rPr>
+        <w:t xml:space="preserve"> methods</w:t>
       </w:r>
     </w:p>
     <w:p>
@@ -549,6 +557,7 @@
         </w:rPr>
         <w:t xml:space="preserve">: </w:t>
       </w:r>
+      <w:proofErr w:type="gramStart"/>
       <w:r>
         <w:rPr>
           <w:rFonts w:ascii="Arial" w:hAnsi="Arial" w:cs="Arial"/>
@@ -565,7 +574,14 @@
         <w:rPr>
           <w:rFonts w:ascii="Arial" w:hAnsi="Arial" w:cs="Arial"/>
         </w:rPr>
-        <w:t xml:space="preserve">word </w:t>
+        <w:t>word</w:t>
+      </w:r>
+      <w:proofErr w:type="gramEnd"/>
+      <w:r>
+        <w:rPr>
+          <w:rFonts w:ascii="Arial" w:hAnsi="Arial" w:cs="Arial"/>
+        </w:rPr>
+        <w:t xml:space="preserve"> </w:t>
       </w:r>
       <w:r>
         <w:rPr>
@@ -751,13 +767,41 @@
         <w:rPr>
           <w:rFonts w:ascii="Arial" w:hAnsi="Arial" w:cs="Arial"/>
         </w:rPr>
-        <w:t>Information theory perspective and Parsons code</w:t>
-      </w:r>
-      <w:r>
-        <w:rPr>
-          <w:rFonts w:ascii="Arial" w:hAnsi="Arial" w:cs="Arial"/>
-        </w:rPr>
-        <w:t xml:space="preserve"> for encoding, not just decoding (Kershenbaum)</w:t>
+        <w:t xml:space="preserve">Information theory perspective and </w:t>
+      </w:r>
+      <w:proofErr w:type="gramStart"/>
+      <w:r>
+        <w:rPr>
+          <w:rFonts w:ascii="Arial" w:hAnsi="Arial" w:cs="Arial"/>
+        </w:rPr>
+        <w:t>Parsons</w:t>
+      </w:r>
+      <w:proofErr w:type="gramEnd"/>
+      <w:r>
+        <w:rPr>
+          <w:rFonts w:ascii="Arial" w:hAnsi="Arial" w:cs="Arial"/>
+        </w:rPr>
+        <w:t xml:space="preserve"> code</w:t>
+      </w:r>
+      <w:r>
+        <w:rPr>
+          <w:rFonts w:ascii="Arial" w:hAnsi="Arial" w:cs="Arial"/>
+        </w:rPr>
+        <w:t xml:space="preserve"> for encoding, not just decoding (</w:t>
+      </w:r>
+      <w:proofErr w:type="spellStart"/>
+      <w:r>
+        <w:rPr>
+          <w:rFonts w:ascii="Arial" w:hAnsi="Arial" w:cs="Arial"/>
+        </w:rPr>
+        <w:t>Kershenbaum</w:t>
+      </w:r>
+      <w:proofErr w:type="spellEnd"/>
+      <w:r>
+        <w:rPr>
+          <w:rFonts w:ascii="Arial" w:hAnsi="Arial" w:cs="Arial"/>
+        </w:rPr>
+        <w:t>)</w:t>
       </w:r>
     </w:p>
     <w:p>
@@ -871,7 +915,21 @@
         <w:rPr>
           <w:rFonts w:ascii="Arial" w:hAnsi="Arial" w:cs="Arial"/>
         </w:rPr>
-        <w:t>Linking an information theory perspective to creating synthetic signals and controlling types and amounts of information encoded in these signals (paRsynth package)</w:t>
+        <w:t>Linking an information theory perspective to creating synthetic signals and controlling types and amounts of information encoded in these signals (</w:t>
+      </w:r>
+      <w:proofErr w:type="spellStart"/>
+      <w:r>
+        <w:rPr>
+          <w:rFonts w:ascii="Arial" w:hAnsi="Arial" w:cs="Arial"/>
+        </w:rPr>
+        <w:t>paRsynth</w:t>
+      </w:r>
+      <w:proofErr w:type="spellEnd"/>
+      <w:r>
+        <w:rPr>
+          <w:rFonts w:ascii="Arial" w:hAnsi="Arial" w:cs="Arial"/>
+        </w:rPr>
+        <w:t xml:space="preserve"> package)</w:t>
       </w:r>
     </w:p>
     <w:p>
@@ -889,7 +947,21 @@
         <w:rPr>
           <w:rFonts w:ascii="Arial" w:hAnsi="Arial" w:cs="Arial"/>
         </w:rPr>
-        <w:t>Be careful about pitching paRsynth too broadly, right now this is an in-house tool/set of functions</w:t>
+        <w:t xml:space="preserve">Be careful about pitching </w:t>
+      </w:r>
+      <w:proofErr w:type="spellStart"/>
+      <w:r>
+        <w:rPr>
+          <w:rFonts w:ascii="Arial" w:hAnsi="Arial" w:cs="Arial"/>
+        </w:rPr>
+        <w:t>paRsynth</w:t>
+      </w:r>
+      <w:proofErr w:type="spellEnd"/>
+      <w:r>
+        <w:rPr>
+          <w:rFonts w:ascii="Arial" w:hAnsi="Arial" w:cs="Arial"/>
+        </w:rPr>
+        <w:t xml:space="preserve"> too broadly, right now this is an in-house tool/set of functions</w:t>
       </w:r>
     </w:p>
     <w:p>
@@ -1039,11 +1111,19 @@
           <w:rFonts w:ascii="Arial" w:hAnsi="Arial" w:cs="Arial"/>
         </w:rPr>
       </w:pPr>
-      <w:r>
-        <w:rPr>
-          <w:rFonts w:ascii="Arial" w:hAnsi="Arial" w:cs="Arial"/>
-        </w:rPr>
-        <w:t>paRsynth functions</w:t>
+      <w:proofErr w:type="spellStart"/>
+      <w:r>
+        <w:rPr>
+          <w:rFonts w:ascii="Arial" w:hAnsi="Arial" w:cs="Arial"/>
+        </w:rPr>
+        <w:t>paRsynth</w:t>
+      </w:r>
+      <w:proofErr w:type="spellEnd"/>
+      <w:r>
+        <w:rPr>
+          <w:rFonts w:ascii="Arial" w:hAnsi="Arial" w:cs="Arial"/>
+        </w:rPr>
+        <w:t xml:space="preserve"> functions</w:t>
       </w:r>
     </w:p>
     <w:p>
@@ -1069,13 +1149,41 @@
         <w:rPr>
           <w:rFonts w:ascii="Arial" w:hAnsi="Arial" w:cs="Arial"/>
         </w:rPr>
-        <w:t>nformation “trits”</w:t>
-      </w:r>
-      <w:r>
-        <w:rPr>
-          <w:rFonts w:ascii="Arial" w:hAnsi="Arial" w:cs="Arial"/>
-        </w:rPr>
-        <w:t xml:space="preserve"> and base-3 Parsons </w:t>
+        <w:t>nformation “</w:t>
+      </w:r>
+      <w:proofErr w:type="spellStart"/>
+      <w:r>
+        <w:rPr>
+          <w:rFonts w:ascii="Arial" w:hAnsi="Arial" w:cs="Arial"/>
+        </w:rPr>
+        <w:t>trits</w:t>
+      </w:r>
+      <w:proofErr w:type="spellEnd"/>
+      <w:r>
+        <w:rPr>
+          <w:rFonts w:ascii="Arial" w:hAnsi="Arial" w:cs="Arial"/>
+        </w:rPr>
+        <w:t>”</w:t>
+      </w:r>
+      <w:r>
+        <w:rPr>
+          <w:rFonts w:ascii="Arial" w:hAnsi="Arial" w:cs="Arial"/>
+        </w:rPr>
+        <w:t xml:space="preserve"> and base-3 </w:t>
+      </w:r>
+      <w:proofErr w:type="gramStart"/>
+      <w:r>
+        <w:rPr>
+          <w:rFonts w:ascii="Arial" w:hAnsi="Arial" w:cs="Arial"/>
+        </w:rPr>
+        <w:t>Parsons</w:t>
+      </w:r>
+      <w:proofErr w:type="gramEnd"/>
+      <w:r>
+        <w:rPr>
+          <w:rFonts w:ascii="Arial" w:hAnsi="Arial" w:cs="Arial"/>
+        </w:rPr>
+        <w:t xml:space="preserve"> </w:t>
       </w:r>
       <w:r>
         <w:rPr>
@@ -1212,7 +1320,21 @@
           <w:rFonts w:ascii="Arial" w:hAnsi="Arial" w:cs="Arial"/>
         </w:rPr>
         <w:lastRenderedPageBreak/>
-        <w:t>Or add a subsampling approach to this paper? Keep thinking about this, because Bayesian modeling of group and individual level variation is really useful and use fewer numbers of groups and individuals in the social environment</w:t>
+        <w:t xml:space="preserve">Or add a subsampling approach to this paper? Keep thinking about this, because Bayesian modeling of group and individual level variation is </w:t>
+      </w:r>
+      <w:proofErr w:type="gramStart"/>
+      <w:r>
+        <w:rPr>
+          <w:rFonts w:ascii="Arial" w:hAnsi="Arial" w:cs="Arial"/>
+        </w:rPr>
+        <w:t>really useful</w:t>
+      </w:r>
+      <w:proofErr w:type="gramEnd"/>
+      <w:r>
+        <w:rPr>
+          <w:rFonts w:ascii="Arial" w:hAnsi="Arial" w:cs="Arial"/>
+        </w:rPr>
+        <w:t xml:space="preserve"> and use fewer numbers of groups and individuals in the social environment</w:t>
       </w:r>
     </w:p>
     <w:p>
@@ -1244,8 +1366,16 @@
         <w:rPr>
           <w:rFonts w:ascii="Arial" w:hAnsi="Arial" w:cs="Arial"/>
         </w:rPr>
-        <w:t>with paRsynth</w:t>
-      </w:r>
+        <w:t xml:space="preserve">with </w:t>
+      </w:r>
+      <w:proofErr w:type="spellStart"/>
+      <w:r>
+        <w:rPr>
+          <w:rFonts w:ascii="Arial" w:hAnsi="Arial" w:cs="Arial"/>
+        </w:rPr>
+        <w:t>paRsynth</w:t>
+      </w:r>
+      <w:proofErr w:type="spellEnd"/>
       <w:r>
         <w:rPr>
           <w:rFonts w:ascii="Arial" w:hAnsi="Arial" w:cs="Arial"/>
@@ -1670,14 +1800,42 @@
         <w:rPr>
           <w:rFonts w:ascii="Arial" w:hAnsi="Arial" w:cs="Arial"/>
         </w:rPr>
-        <w:t xml:space="preserve">Consider using a Bayesian approach to model based clustering, since the analysis question </w:t>
+        <w:t xml:space="preserve">Consider using a Bayesian approach to </w:t>
+      </w:r>
+      <w:proofErr w:type="gramStart"/>
+      <w:r>
+        <w:rPr>
+          <w:rFonts w:ascii="Arial" w:hAnsi="Arial" w:cs="Arial"/>
+        </w:rPr>
+        <w:t>model based</w:t>
+      </w:r>
+      <w:proofErr w:type="gramEnd"/>
+      <w:r>
+        <w:rPr>
+          <w:rFonts w:ascii="Arial" w:hAnsi="Arial" w:cs="Arial"/>
+        </w:rPr>
+        <w:t xml:space="preserve"> clustering, since the analysis question </w:t>
       </w:r>
       <w:r>
         <w:rPr>
           <w:rFonts w:ascii="Arial" w:hAnsi="Arial" w:cs="Arial"/>
         </w:rPr>
         <w:lastRenderedPageBreak/>
-        <w:t>above is directly related to clustering. Use an approach that allows us to measure the posterior (read Ch. 13 in McElreath book) as the magnitude of acoustic convergence at each social level</w:t>
+        <w:t xml:space="preserve">above is directly related to clustering. Use an approach that allows us to measure the posterior (read Ch. 13 in </w:t>
+      </w:r>
+      <w:proofErr w:type="spellStart"/>
+      <w:r>
+        <w:rPr>
+          <w:rFonts w:ascii="Arial" w:hAnsi="Arial" w:cs="Arial"/>
+        </w:rPr>
+        <w:t>McElreath</w:t>
+      </w:r>
+      <w:proofErr w:type="spellEnd"/>
+      <w:r>
+        <w:rPr>
+          <w:rFonts w:ascii="Arial" w:hAnsi="Arial" w:cs="Arial"/>
+        </w:rPr>
+        <w:t xml:space="preserve"> book) as the magnitude of acoustic convergence at each social level</w:t>
       </w:r>
       <w:r>
         <w:rPr>
@@ -1685,11 +1843,25 @@
         </w:rPr>
         <w:t xml:space="preserve"> (possibly the Ch. 14 and 15 as well)</w:t>
       </w:r>
-      <w:r>
-        <w:rPr>
-          <w:rFonts w:ascii="Arial" w:hAnsi="Arial" w:cs="Arial"/>
-        </w:rPr>
-        <w:t xml:space="preserve"> </w:t>
+    </w:p>
+    <w:p>
+      <w:pPr>
+        <w:pStyle w:val="ListParagraph"/>
+        <w:numPr>
+          <w:ilvl w:val="5"/>
+          <w:numId w:val="3"/>
+        </w:numPr>
+        <w:spacing w:after="240"/>
+        <w:contextualSpacing w:val="0"/>
+        <w:rPr>
+          <w:rFonts w:ascii="Arial" w:hAnsi="Arial" w:cs="Arial"/>
+        </w:rPr>
+      </w:pPr>
+      <w:r>
+        <w:rPr>
+          <w:rFonts w:ascii="Arial" w:hAnsi="Arial" w:cs="Arial"/>
+        </w:rPr>
+        <w:t>How to get SPCC values into non-independent format for multilevel models? Is MDS appropriate? Rather than standard handpicked acoustic ,measurements and then PCA</w:t>
       </w:r>
     </w:p>
     <w:p>
@@ -1715,7 +1887,21 @@
         <w:rPr>
           <w:rFonts w:ascii="Arial" w:hAnsi="Arial" w:cs="Arial"/>
         </w:rPr>
-        <w:t xml:space="preserve"> (which we originally encoded using paRsynth)</w:t>
+        <w:t xml:space="preserve"> (which we originally encoded using </w:t>
+      </w:r>
+      <w:proofErr w:type="spellStart"/>
+      <w:r>
+        <w:rPr>
+          <w:rFonts w:ascii="Arial" w:hAnsi="Arial" w:cs="Arial"/>
+        </w:rPr>
+        <w:t>paRsynth</w:t>
+      </w:r>
+      <w:proofErr w:type="spellEnd"/>
+      <w:r>
+        <w:rPr>
+          <w:rFonts w:ascii="Arial" w:hAnsi="Arial" w:cs="Arial"/>
+        </w:rPr>
+        <w:t>)</w:t>
       </w:r>
       <w:r>
         <w:rPr>
@@ -1759,7 +1945,21 @@
         <w:rPr>
           <w:rFonts w:ascii="Arial" w:hAnsi="Arial" w:cs="Arial"/>
         </w:rPr>
-        <w:t>. Does the variation that we encoded actually matter???</w:t>
+        <w:t xml:space="preserve">. Does the variation that we encoded </w:t>
+      </w:r>
+      <w:proofErr w:type="gramStart"/>
+      <w:r>
+        <w:rPr>
+          <w:rFonts w:ascii="Arial" w:hAnsi="Arial" w:cs="Arial"/>
+        </w:rPr>
+        <w:t>actually matter</w:t>
+      </w:r>
+      <w:proofErr w:type="gramEnd"/>
+      <w:r>
+        <w:rPr>
+          <w:rFonts w:ascii="Arial" w:hAnsi="Arial" w:cs="Arial"/>
+        </w:rPr>
+        <w:t>???</w:t>
       </w:r>
     </w:p>
     <w:p>
@@ -1785,7 +1985,21 @@
         <w:rPr>
           <w:rFonts w:ascii="Arial" w:hAnsi="Arial" w:cs="Arial"/>
         </w:rPr>
-        <w:t xml:space="preserve">individuals, we can actually model variation in convergence within and between categories (individuals, groups) </w:t>
+        <w:t xml:space="preserve">individuals, we can </w:t>
+      </w:r>
+      <w:proofErr w:type="gramStart"/>
+      <w:r>
+        <w:rPr>
+          <w:rFonts w:ascii="Arial" w:hAnsi="Arial" w:cs="Arial"/>
+        </w:rPr>
+        <w:t>actually model</w:t>
+      </w:r>
+      <w:proofErr w:type="gramEnd"/>
+      <w:r>
+        <w:rPr>
+          <w:rFonts w:ascii="Arial" w:hAnsi="Arial" w:cs="Arial"/>
+        </w:rPr>
+        <w:t xml:space="preserve"> variation in convergence within and between categories (individuals, groups) </w:t>
       </w:r>
       <w:r>
         <w:rPr>
@@ -1929,11 +2143,35 @@
           <w:rFonts w:ascii="Arial" w:hAnsi="Arial" w:cs="Arial"/>
         </w:rPr>
       </w:pPr>
-      <w:r>
-        <w:rPr>
-          <w:rFonts w:ascii="Arial" w:hAnsi="Arial" w:cs="Arial"/>
-        </w:rPr>
-        <w:t>soundgen::soundgen()</w:t>
+      <w:proofErr w:type="spellStart"/>
+      <w:proofErr w:type="gramStart"/>
+      <w:r>
+        <w:rPr>
+          <w:rFonts w:ascii="Arial" w:hAnsi="Arial" w:cs="Arial"/>
+        </w:rPr>
+        <w:t>soundgen</w:t>
+      </w:r>
+      <w:proofErr w:type="spellEnd"/>
+      <w:r>
+        <w:rPr>
+          <w:rFonts w:ascii="Arial" w:hAnsi="Arial" w:cs="Arial"/>
+        </w:rPr>
+        <w:t>::</w:t>
+      </w:r>
+      <w:proofErr w:type="spellStart"/>
+      <w:proofErr w:type="gramEnd"/>
+      <w:r>
+        <w:rPr>
+          <w:rFonts w:ascii="Arial" w:hAnsi="Arial" w:cs="Arial"/>
+        </w:rPr>
+        <w:t>soundgen</w:t>
+      </w:r>
+      <w:proofErr w:type="spellEnd"/>
+      <w:r>
+        <w:rPr>
+          <w:rFonts w:ascii="Arial" w:hAnsi="Arial" w:cs="Arial"/>
+        </w:rPr>
+        <w:t>()</w:t>
       </w:r>
       <w:r>
         <w:rPr>
@@ -1959,7 +2197,28 @@
         <w:rPr>
           <w:rFonts w:ascii="Arial" w:hAnsi="Arial" w:cs="Arial"/>
         </w:rPr>
-        <w:t>Create spectrograms for 50 audio files, feed them to soundgen using code that Grace has already to pull out the estimated fundamental frequency contour, create spectrograms again with the frequency contour overlaid to check the accuracy of the tracing</w:t>
+        <w:t xml:space="preserve">Create spectrograms for 50 audio files, feed them to </w:t>
+      </w:r>
+      <w:proofErr w:type="spellStart"/>
+      <w:r>
+        <w:rPr>
+          <w:rFonts w:ascii="Arial" w:hAnsi="Arial" w:cs="Arial"/>
+        </w:rPr>
+        <w:t>soundgen</w:t>
+      </w:r>
+      <w:proofErr w:type="spellEnd"/>
+      <w:r>
+        <w:rPr>
+          <w:rFonts w:ascii="Arial" w:hAnsi="Arial" w:cs="Arial"/>
+        </w:rPr>
+        <w:t xml:space="preserve"> using code that Grace has already to pull out the estimated fundamental frequency contour, </w:t>
+      </w:r>
+      <w:r>
+        <w:rPr>
+          <w:rFonts w:ascii="Arial" w:hAnsi="Arial" w:cs="Arial"/>
+        </w:rPr>
+        <w:lastRenderedPageBreak/>
+        <w:t>create spectrograms again with the frequency contour overlaid to check the accuracy of the tracing</w:t>
       </w:r>
     </w:p>
     <w:p>
@@ -1999,8 +2258,21 @@
         <w:rPr>
           <w:rFonts w:ascii="Arial" w:hAnsi="Arial" w:cs="Arial"/>
         </w:rPr>
-        <w:lastRenderedPageBreak/>
-        <w:t>But when I create spectrograms in soundgen, the contours look great</w:t>
+        <w:t xml:space="preserve">But when I create spectrograms in </w:t>
+      </w:r>
+      <w:proofErr w:type="spellStart"/>
+      <w:r>
+        <w:rPr>
+          <w:rFonts w:ascii="Arial" w:hAnsi="Arial" w:cs="Arial"/>
+        </w:rPr>
+        <w:t>soundgen</w:t>
+      </w:r>
+      <w:proofErr w:type="spellEnd"/>
+      <w:r>
+        <w:rPr>
+          <w:rFonts w:ascii="Arial" w:hAnsi="Arial" w:cs="Arial"/>
+        </w:rPr>
+        <w:t>, the contours look great</w:t>
       </w:r>
     </w:p>
     <w:p>
@@ -2016,11 +2288,19 @@
           <w:rFonts w:ascii="Arial" w:hAnsi="Arial" w:cs="Arial"/>
         </w:rPr>
       </w:pPr>
-      <w:r>
-        <w:rPr>
-          <w:rFonts w:ascii="Arial" w:hAnsi="Arial" w:cs="Arial"/>
-        </w:rPr>
-        <w:t>Soundgen has a Shiny app in which you can upload audio files and do manual correction of the frequency contour online</w:t>
+      <w:proofErr w:type="spellStart"/>
+      <w:r>
+        <w:rPr>
+          <w:rFonts w:ascii="Arial" w:hAnsi="Arial" w:cs="Arial"/>
+        </w:rPr>
+        <w:t>Soundgen</w:t>
+      </w:r>
+      <w:proofErr w:type="spellEnd"/>
+      <w:r>
+        <w:rPr>
+          <w:rFonts w:ascii="Arial" w:hAnsi="Arial" w:cs="Arial"/>
+        </w:rPr>
+        <w:t xml:space="preserve"> has a Shiny app in which you can upload audio files and do manual correction of the frequency contour online</w:t>
       </w:r>
       <w:r>
         <w:rPr>
@@ -2108,7 +2388,21 @@
         <w:rPr>
           <w:rFonts w:ascii="Arial" w:hAnsi="Arial" w:cs="Arial"/>
         </w:rPr>
-        <w:t>used with the dtw package in R</w:t>
+        <w:t xml:space="preserve">used with the </w:t>
+      </w:r>
+      <w:proofErr w:type="spellStart"/>
+      <w:r>
+        <w:rPr>
+          <w:rFonts w:ascii="Arial" w:hAnsi="Arial" w:cs="Arial"/>
+        </w:rPr>
+        <w:t>dtw</w:t>
+      </w:r>
+      <w:proofErr w:type="spellEnd"/>
+      <w:r>
+        <w:rPr>
+          <w:rFonts w:ascii="Arial" w:hAnsi="Arial" w:cs="Arial"/>
+        </w:rPr>
+        <w:t xml:space="preserve"> package in R</w:t>
       </w:r>
     </w:p>
     <w:p>
@@ -2186,7 +2480,21 @@
         <w:rPr>
           <w:rFonts w:ascii="Arial" w:hAnsi="Arial" w:cs="Arial"/>
         </w:rPr>
-        <w:t>This part of the pipeline will be really similar to the SPCC pipeline above</w:t>
+        <w:t xml:space="preserve">This part of the pipeline will be really </w:t>
+      </w:r>
+      <w:proofErr w:type="gramStart"/>
+      <w:r>
+        <w:rPr>
+          <w:rFonts w:ascii="Arial" w:hAnsi="Arial" w:cs="Arial"/>
+        </w:rPr>
+        <w:t>similar to</w:t>
+      </w:r>
+      <w:proofErr w:type="gramEnd"/>
+      <w:r>
+        <w:rPr>
+          <w:rFonts w:ascii="Arial" w:hAnsi="Arial" w:cs="Arial"/>
+        </w:rPr>
+        <w:t xml:space="preserve"> the SPCC pipeline above</w:t>
       </w:r>
     </w:p>
     <w:p>

</xml_diff>

<commit_message>
BAC intro and methods updates
Tried to add more structure to introduction and revise methods based on deciding that this is part 1 and we will do baysian in part 2
</commit_message>
<xml_diff>
--- a/paRsynth_methods_draft.docx
+++ b/paRsynth_methods_draft.docx
@@ -617,6 +617,178 @@
           <w:rFonts w:ascii="Arial" w:hAnsi="Arial" w:cs="Arial"/>
         </w:rPr>
       </w:pPr>
+      <w:r>
+        <w:rPr>
+          <w:rFonts w:ascii="Arial" w:hAnsi="Arial" w:cs="Arial"/>
+        </w:rPr>
+        <w:t>First Paragraph</w:t>
+      </w:r>
+    </w:p>
+    <w:p>
+      <w:pPr>
+        <w:pStyle w:val="ListParagraph"/>
+        <w:numPr>
+          <w:ilvl w:val="0"/>
+          <w:numId w:val="6"/>
+        </w:numPr>
+        <w:rPr>
+          <w:rFonts w:ascii="Arial" w:hAnsi="Arial" w:cs="Arial"/>
+        </w:rPr>
+      </w:pPr>
+      <w:r>
+        <w:rPr>
+          <w:rFonts w:ascii="Arial" w:hAnsi="Arial" w:cs="Arial"/>
+        </w:rPr>
+        <w:t>Information encoding is a solution to navigated complex social environments because it _______</w:t>
+      </w:r>
+    </w:p>
+    <w:p>
+      <w:pPr>
+        <w:pStyle w:val="ListParagraph"/>
+        <w:numPr>
+          <w:ilvl w:val="0"/>
+          <w:numId w:val="6"/>
+        </w:numPr>
+        <w:rPr>
+          <w:rFonts w:ascii="Arial" w:hAnsi="Arial" w:cs="Arial"/>
+        </w:rPr>
+      </w:pPr>
+      <w:r>
+        <w:rPr>
+          <w:rFonts w:ascii="Arial" w:hAnsi="Arial" w:cs="Arial"/>
+        </w:rPr>
+        <w:t xml:space="preserve">New perspectives/tools arise to assess degree or types of information encoding in signals </w:t>
+      </w:r>
+    </w:p>
+    <w:p>
+      <w:pPr>
+        <w:pStyle w:val="ListParagraph"/>
+        <w:numPr>
+          <w:ilvl w:val="0"/>
+          <w:numId w:val="6"/>
+        </w:numPr>
+        <w:rPr>
+          <w:rFonts w:ascii="Arial" w:hAnsi="Arial" w:cs="Arial"/>
+        </w:rPr>
+      </w:pPr>
+      <w:proofErr w:type="gramStart"/>
+      <w:r>
+        <w:rPr>
+          <w:rFonts w:ascii="Arial" w:hAnsi="Arial" w:cs="Arial"/>
+        </w:rPr>
+        <w:t>BUT,</w:t>
+      </w:r>
+      <w:proofErr w:type="gramEnd"/>
+      <w:r>
+        <w:rPr>
+          <w:rFonts w:ascii="Arial" w:hAnsi="Arial" w:cs="Arial"/>
+        </w:rPr>
+        <w:t xml:space="preserve"> PROBLEM </w:t>
+      </w:r>
+      <w:proofErr w:type="spellStart"/>
+      <w:r>
+        <w:rPr>
+          <w:rFonts w:ascii="Arial" w:hAnsi="Arial" w:cs="Arial"/>
+        </w:rPr>
+        <w:t>PROBLEM</w:t>
+      </w:r>
+      <w:proofErr w:type="spellEnd"/>
+      <w:r>
+        <w:rPr>
+          <w:rFonts w:ascii="Arial" w:hAnsi="Arial" w:cs="Arial"/>
+        </w:rPr>
+        <w:t xml:space="preserve"> </w:t>
+      </w:r>
+      <w:proofErr w:type="spellStart"/>
+      <w:r>
+        <w:rPr>
+          <w:rFonts w:ascii="Arial" w:hAnsi="Arial" w:cs="Arial"/>
+        </w:rPr>
+        <w:t>PROBLEM</w:t>
+      </w:r>
+      <w:proofErr w:type="spellEnd"/>
+      <w:r>
+        <w:rPr>
+          <w:rFonts w:ascii="Arial" w:hAnsi="Arial" w:cs="Arial"/>
+        </w:rPr>
+        <w:t xml:space="preserve"> </w:t>
+      </w:r>
+    </w:p>
+    <w:p>
+      <w:pPr>
+        <w:pStyle w:val="ListParagraph"/>
+        <w:numPr>
+          <w:ilvl w:val="1"/>
+          <w:numId w:val="6"/>
+        </w:numPr>
+        <w:rPr>
+          <w:rFonts w:ascii="Arial" w:hAnsi="Arial" w:cs="Arial"/>
+        </w:rPr>
+      </w:pPr>
+      <w:r>
+        <w:rPr>
+          <w:rFonts w:ascii="Arial" w:hAnsi="Arial" w:cs="Arial"/>
+        </w:rPr>
+        <w:t xml:space="preserve">Something about </w:t>
+      </w:r>
+      <w:r>
+        <w:rPr>
+          <w:rFonts w:ascii="Arial" w:hAnsi="Arial" w:cs="Arial"/>
+        </w:rPr>
+        <w:t xml:space="preserve">uncheck/unverified assumption about encoding/decoding? </w:t>
+      </w:r>
+    </w:p>
+    <w:p>
+      <w:pPr>
+        <w:pStyle w:val="ListParagraph"/>
+        <w:numPr>
+          <w:ilvl w:val="0"/>
+          <w:numId w:val="6"/>
+        </w:numPr>
+        <w:rPr>
+          <w:rFonts w:ascii="Arial" w:hAnsi="Arial" w:cs="Arial"/>
+        </w:rPr>
+      </w:pPr>
+      <w:r>
+        <w:rPr>
+          <w:rFonts w:ascii="Arial" w:hAnsi="Arial" w:cs="Arial"/>
+        </w:rPr>
+        <w:t>We can solve this problem using synthetic tools (</w:t>
+      </w:r>
+      <w:proofErr w:type="spellStart"/>
+      <w:r>
+        <w:rPr>
+          <w:rFonts w:ascii="Arial" w:hAnsi="Arial" w:cs="Arial"/>
+        </w:rPr>
+        <w:t>paRsynth</w:t>
+      </w:r>
+      <w:proofErr w:type="spellEnd"/>
+      <w:r>
+        <w:rPr>
+          <w:rFonts w:ascii="Arial" w:hAnsi="Arial" w:cs="Arial"/>
+        </w:rPr>
+        <w:t>)</w:t>
+      </w:r>
+    </w:p>
+    <w:p>
+      <w:pPr>
+        <w:rPr>
+          <w:rFonts w:ascii="Arial" w:hAnsi="Arial" w:cs="Arial"/>
+        </w:rPr>
+      </w:pPr>
+    </w:p>
+    <w:p>
+      <w:pPr>
+        <w:rPr>
+          <w:rFonts w:ascii="Arial" w:hAnsi="Arial" w:cs="Arial"/>
+        </w:rPr>
+      </w:pPr>
+      <w:r>
+        <w:rPr>
+          <w:rFonts w:ascii="Arial" w:hAnsi="Arial" w:cs="Arial"/>
+        </w:rPr>
+        <w:t>Layout of introduction</w:t>
+      </w:r>
     </w:p>
     <w:p>
       <w:pPr>
@@ -640,6 +812,42 @@
       <w:pPr>
         <w:pStyle w:val="ListParagraph"/>
         <w:numPr>
+          <w:ilvl w:val="1"/>
+          <w:numId w:val="2"/>
+        </w:numPr>
+        <w:rPr>
+          <w:rFonts w:ascii="Arial" w:hAnsi="Arial" w:cs="Arial"/>
+        </w:rPr>
+      </w:pPr>
+      <w:r>
+        <w:rPr>
+          <w:rFonts w:ascii="Arial" w:hAnsi="Arial" w:cs="Arial"/>
+        </w:rPr>
+        <w:t xml:space="preserve">Potential functions of information encoding </w:t>
+      </w:r>
+    </w:p>
+    <w:p>
+      <w:pPr>
+        <w:pStyle w:val="ListParagraph"/>
+        <w:numPr>
+          <w:ilvl w:val="1"/>
+          <w:numId w:val="2"/>
+        </w:numPr>
+        <w:rPr>
+          <w:rFonts w:ascii="Arial" w:hAnsi="Arial" w:cs="Arial"/>
+        </w:rPr>
+      </w:pPr>
+      <w:r>
+        <w:rPr>
+          <w:rFonts w:ascii="Arial" w:hAnsi="Arial" w:cs="Arial"/>
+        </w:rPr>
+        <w:t>Group v individual information</w:t>
+      </w:r>
+    </w:p>
+    <w:p>
+      <w:pPr>
+        <w:pStyle w:val="ListParagraph"/>
+        <w:numPr>
           <w:ilvl w:val="0"/>
           <w:numId w:val="2"/>
         </w:numPr>
@@ -651,8 +859,38 @@
         <w:rPr>
           <w:rFonts w:ascii="Arial" w:hAnsi="Arial" w:cs="Arial"/>
         </w:rPr>
-        <w:t xml:space="preserve">Information theory perspective and </w:t>
-      </w:r>
+        <w:t>Tools we currently use</w:t>
+      </w:r>
+    </w:p>
+    <w:p>
+      <w:pPr>
+        <w:pStyle w:val="ListParagraph"/>
+        <w:numPr>
+          <w:ilvl w:val="1"/>
+          <w:numId w:val="2"/>
+        </w:numPr>
+        <w:rPr>
+          <w:rFonts w:ascii="Arial" w:hAnsi="Arial" w:cs="Arial"/>
+        </w:rPr>
+      </w:pPr>
+      <w:r>
+        <w:rPr>
+          <w:rFonts w:ascii="Arial" w:hAnsi="Arial" w:cs="Arial"/>
+        </w:rPr>
+        <w:t>Information theory</w:t>
+      </w:r>
+    </w:p>
+    <w:p>
+      <w:pPr>
+        <w:pStyle w:val="ListParagraph"/>
+        <w:numPr>
+          <w:ilvl w:val="1"/>
+          <w:numId w:val="2"/>
+        </w:numPr>
+        <w:rPr>
+          <w:rFonts w:ascii="Arial" w:hAnsi="Arial" w:cs="Arial"/>
+        </w:rPr>
+      </w:pPr>
       <w:proofErr w:type="gramStart"/>
       <w:r>
         <w:rPr>
@@ -665,13 +903,7 @@
         <w:rPr>
           <w:rFonts w:ascii="Arial" w:hAnsi="Arial" w:cs="Arial"/>
         </w:rPr>
-        <w:t xml:space="preserve"> code</w:t>
-      </w:r>
-      <w:r>
-        <w:rPr>
-          <w:rFonts w:ascii="Arial" w:hAnsi="Arial" w:cs="Arial"/>
-        </w:rPr>
-        <w:t xml:space="preserve"> for encoding, not just decoding (</w:t>
+        <w:t xml:space="preserve"> code (</w:t>
       </w:r>
       <w:proofErr w:type="spellStart"/>
       <w:r>
@@ -686,6 +918,38 @@
           <w:rFonts w:ascii="Arial" w:hAnsi="Arial" w:cs="Arial"/>
         </w:rPr>
         <w:t>)</w:t>
+      </w:r>
+    </w:p>
+    <w:p>
+      <w:pPr>
+        <w:pStyle w:val="ListParagraph"/>
+        <w:numPr>
+          <w:ilvl w:val="2"/>
+          <w:numId w:val="2"/>
+        </w:numPr>
+        <w:rPr>
+          <w:rFonts w:ascii="Arial" w:hAnsi="Arial" w:cs="Arial"/>
+        </w:rPr>
+      </w:pPr>
+      <w:r>
+        <w:rPr>
+          <w:rFonts w:ascii="Arial" w:hAnsi="Arial" w:cs="Arial"/>
+        </w:rPr>
+        <w:t xml:space="preserve">A lot of focus </w:t>
+      </w:r>
+      <w:proofErr w:type="gramStart"/>
+      <w:r>
+        <w:rPr>
+          <w:rFonts w:ascii="Arial" w:hAnsi="Arial" w:cs="Arial"/>
+        </w:rPr>
+        <w:t>on</w:t>
+      </w:r>
+      <w:proofErr w:type="gramEnd"/>
+      <w:r>
+        <w:rPr>
+          <w:rFonts w:ascii="Arial" w:hAnsi="Arial" w:cs="Arial"/>
+        </w:rPr>
+        <w:t xml:space="preserve"> how information is decoded, but this allows us to study encoding as well?</w:t>
       </w:r>
     </w:p>
     <w:p>
@@ -699,6 +963,7 @@
           <w:rFonts w:ascii="Arial" w:hAnsi="Arial" w:cs="Arial"/>
         </w:rPr>
       </w:pPr>
+      <w:commentRangeStart w:id="0"/>
       <w:r>
         <w:rPr>
           <w:rFonts w:ascii="Arial" w:hAnsi="Arial" w:cs="Arial"/>
@@ -710,6 +975,13 @@
           <w:rFonts w:ascii="Arial" w:hAnsi="Arial" w:cs="Arial"/>
         </w:rPr>
         <w:t>recover that information in vocal signals</w:t>
+      </w:r>
+      <w:commentRangeEnd w:id="0"/>
+      <w:r>
+        <w:rPr>
+          <w:rStyle w:val="CommentReference"/>
+        </w:rPr>
+        <w:commentReference w:id="0"/>
       </w:r>
     </w:p>
     <w:p>
@@ -750,39 +1022,12 @@
           <w:rFonts w:ascii="Arial" w:hAnsi="Arial" w:cs="Arial"/>
         </w:rPr>
       </w:pPr>
-    </w:p>
-    <w:p>
-      <w:pPr>
-        <w:rPr>
-          <w:rFonts w:ascii="Arial" w:hAnsi="Arial" w:cs="Arial"/>
-        </w:rPr>
-      </w:pPr>
-      <w:r>
-        <w:rPr>
-          <w:rFonts w:ascii="Arial" w:hAnsi="Arial" w:cs="Arial"/>
-        </w:rPr>
-        <w:t xml:space="preserve">Thesis statement: Here, we present </w:t>
-      </w:r>
-    </w:p>
-    <w:p>
-      <w:pPr>
-        <w:rPr>
-          <w:rFonts w:ascii="Arial" w:hAnsi="Arial" w:cs="Arial"/>
-        </w:rPr>
-      </w:pPr>
-      <w:r>
-        <w:rPr>
-          <w:rFonts w:ascii="Arial" w:hAnsi="Arial" w:cs="Arial"/>
-        </w:rPr>
-        <w:t xml:space="preserve">Goals of manuscript: In this manuscript, first we </w:t>
-      </w:r>
-    </w:p>
-    <w:p>
-      <w:pPr>
-        <w:rPr>
-          <w:rFonts w:ascii="Arial" w:hAnsi="Arial" w:cs="Arial"/>
-        </w:rPr>
-      </w:pPr>
+      <w:r>
+        <w:rPr>
+          <w:rFonts w:ascii="Arial" w:hAnsi="Arial" w:cs="Arial"/>
+        </w:rPr>
+        <w:t>Goals of this paper:</w:t>
+      </w:r>
     </w:p>
     <w:p>
       <w:pPr>
@@ -1027,6 +1272,7 @@
         <w:rPr>
           <w:rFonts w:ascii="Arial" w:hAnsi="Arial" w:cs="Arial"/>
         </w:rPr>
+        <w:lastRenderedPageBreak/>
         <w:t>I</w:t>
       </w:r>
       <w:r>
@@ -1143,13 +1389,7 @@
         <w:rPr>
           <w:rFonts w:ascii="Arial" w:hAnsi="Arial" w:cs="Arial"/>
         </w:rPr>
-        <w:t xml:space="preserve">Decide on </w:t>
-      </w:r>
-      <w:r>
-        <w:rPr>
-          <w:rFonts w:ascii="Arial" w:hAnsi="Arial" w:cs="Arial"/>
-        </w:rPr>
-        <w:t>treatments for experiments of information recovery</w:t>
+        <w:t>Decide on treatments for experiments of information recovery</w:t>
       </w:r>
     </w:p>
     <w:p>
@@ -1209,7 +1449,6 @@
         <w:rPr>
           <w:rFonts w:ascii="Arial" w:hAnsi="Arial" w:cs="Arial"/>
         </w:rPr>
-        <w:lastRenderedPageBreak/>
         <w:t xml:space="preserve">Or add a subsampling approach to this paper? Keep thinking about this, because Bayesian modeling of group and individual level variation is </w:t>
       </w:r>
       <w:proofErr w:type="gramStart"/>
@@ -1573,6 +1812,57 @@
       <w:pPr>
         <w:pStyle w:val="ListParagraph"/>
         <w:numPr>
+          <w:ilvl w:val="1"/>
+          <w:numId w:val="3"/>
+        </w:numPr>
+        <w:spacing w:after="240"/>
+        <w:contextualSpacing w:val="0"/>
+        <w:rPr>
+          <w:rFonts w:ascii="Arial" w:hAnsi="Arial" w:cs="Arial"/>
+        </w:rPr>
+      </w:pPr>
+      <w:r>
+        <w:rPr>
+          <w:rFonts w:ascii="Arial" w:hAnsi="Arial" w:cs="Arial"/>
+        </w:rPr>
+        <w:lastRenderedPageBreak/>
+        <w:t>Frequency contour tracing</w:t>
+      </w:r>
+      <w:r>
+        <w:rPr>
+          <w:rFonts w:ascii="Arial" w:hAnsi="Arial" w:cs="Arial"/>
+        </w:rPr>
+        <w:t xml:space="preserve"> based</w:t>
+      </w:r>
+      <w:r>
+        <w:rPr>
+          <w:rFonts w:ascii="Arial" w:hAnsi="Arial" w:cs="Arial"/>
+        </w:rPr>
+        <w:t xml:space="preserve"> (</w:t>
+      </w:r>
+      <w:r>
+        <w:rPr>
+          <w:rFonts w:ascii="Arial" w:hAnsi="Arial" w:cs="Arial"/>
+        </w:rPr>
+        <w:t>b</w:t>
+      </w:r>
+      <w:r>
+        <w:rPr>
+          <w:rFonts w:ascii="Arial" w:hAnsi="Arial" w:cs="Arial"/>
+        </w:rPr>
+        <w:t>ecause we are encoding information in frequency modulation patterns</w:t>
+      </w:r>
+      <w:r>
+        <w:rPr>
+          <w:rFonts w:ascii="Arial" w:hAnsi="Arial" w:cs="Arial"/>
+        </w:rPr>
+        <w:t>)</w:t>
+      </w:r>
+    </w:p>
+    <w:p>
+      <w:pPr>
+        <w:pStyle w:val="ListParagraph"/>
+        <w:numPr>
           <w:ilvl w:val="2"/>
           <w:numId w:val="3"/>
         </w:numPr>
@@ -1586,19 +1876,19 @@
         <w:rPr>
           <w:rFonts w:ascii="Arial" w:hAnsi="Arial" w:cs="Arial"/>
         </w:rPr>
-        <w:t>Bayesian hierarchical models</w:t>
-      </w:r>
-      <w:r>
-        <w:rPr>
-          <w:rFonts w:ascii="Arial" w:hAnsi="Arial" w:cs="Arial"/>
-        </w:rPr>
-        <w:t xml:space="preserve"> for inferential statistics</w:t>
-      </w:r>
-      <w:r>
-        <w:rPr>
-          <w:rFonts w:ascii="Arial" w:hAnsi="Arial" w:cs="Arial"/>
-        </w:rPr>
-        <w:t xml:space="preserve"> (TODO)</w:t>
+        <w:t>Frequency contour extraction</w:t>
+      </w:r>
+      <w:r>
+        <w:rPr>
+          <w:rFonts w:ascii="Arial" w:hAnsi="Arial" w:cs="Arial"/>
+        </w:rPr>
+        <w:t xml:space="preserve"> with semi-automated approaches</w:t>
+      </w:r>
+      <w:r>
+        <w:rPr>
+          <w:rFonts w:ascii="Arial" w:hAnsi="Arial" w:cs="Arial"/>
+        </w:rPr>
+        <w:t>: easily the hardest part of this pipeline because it can be very time-consuming and subjective</w:t>
       </w:r>
     </w:p>
     <w:p>
@@ -1618,13 +1908,27 @@
         <w:rPr>
           <w:rFonts w:ascii="Arial" w:hAnsi="Arial" w:cs="Arial"/>
         </w:rPr>
-        <w:t xml:space="preserve">Ask whether acoustic convergence is statistically significant at each social level </w:t>
-      </w:r>
-      <w:r>
-        <w:rPr>
-          <w:rFonts w:ascii="Arial" w:hAnsi="Arial" w:cs="Arial"/>
-        </w:rPr>
-        <w:t>across experimental treatments</w:t>
+        <w:t>We would only run this analysis with a subsample of the audio files and experimental treatments</w:t>
+      </w:r>
+    </w:p>
+    <w:p>
+      <w:pPr>
+        <w:pStyle w:val="ListParagraph"/>
+        <w:numPr>
+          <w:ilvl w:val="3"/>
+          <w:numId w:val="3"/>
+        </w:numPr>
+        <w:spacing w:after="240"/>
+        <w:contextualSpacing w:val="0"/>
+        <w:rPr>
+          <w:rFonts w:ascii="Arial" w:hAnsi="Arial" w:cs="Arial"/>
+        </w:rPr>
+      </w:pPr>
+      <w:r>
+        <w:rPr>
+          <w:rFonts w:ascii="Arial" w:hAnsi="Arial" w:cs="Arial"/>
+        </w:rPr>
+        <w:t>Pilot frequency contour tracing:</w:t>
       </w:r>
     </w:p>
     <w:p>
@@ -1640,17 +1944,75 @@
           <w:rFonts w:ascii="Arial" w:hAnsi="Arial" w:cs="Arial"/>
         </w:rPr>
       </w:pPr>
-      <w:r>
-        <w:rPr>
-          <w:rFonts w:ascii="Arial" w:hAnsi="Arial" w:cs="Arial"/>
-        </w:rPr>
-        <w:t>Bayesian models should use the SPCC matrix values as input data</w:t>
-      </w:r>
-      <w:r>
-        <w:rPr>
-          <w:rFonts w:ascii="Arial" w:hAnsi="Arial" w:cs="Arial"/>
-        </w:rPr>
-        <w:t>, very similar to Mantel test</w:t>
+      <w:proofErr w:type="spellStart"/>
+      <w:proofErr w:type="gramStart"/>
+      <w:r>
+        <w:rPr>
+          <w:rFonts w:ascii="Arial" w:hAnsi="Arial" w:cs="Arial"/>
+        </w:rPr>
+        <w:t>soundgen</w:t>
+      </w:r>
+      <w:proofErr w:type="spellEnd"/>
+      <w:r>
+        <w:rPr>
+          <w:rFonts w:ascii="Arial" w:hAnsi="Arial" w:cs="Arial"/>
+        </w:rPr>
+        <w:t>::</w:t>
+      </w:r>
+      <w:proofErr w:type="spellStart"/>
+      <w:proofErr w:type="gramEnd"/>
+      <w:r>
+        <w:rPr>
+          <w:rFonts w:ascii="Arial" w:hAnsi="Arial" w:cs="Arial"/>
+        </w:rPr>
+        <w:t>soundgen</w:t>
+      </w:r>
+      <w:proofErr w:type="spellEnd"/>
+      <w:r>
+        <w:rPr>
+          <w:rFonts w:ascii="Arial" w:hAnsi="Arial" w:cs="Arial"/>
+        </w:rPr>
+        <w:t>()</w:t>
+      </w:r>
+      <w:r>
+        <w:rPr>
+          <w:rFonts w:ascii="Arial" w:hAnsi="Arial" w:cs="Arial"/>
+        </w:rPr>
+        <w:t>, test whether frequency contours are accurate</w:t>
+      </w:r>
+    </w:p>
+    <w:p>
+      <w:pPr>
+        <w:pStyle w:val="ListParagraph"/>
+        <w:numPr>
+          <w:ilvl w:val="4"/>
+          <w:numId w:val="3"/>
+        </w:numPr>
+        <w:spacing w:after="240"/>
+        <w:contextualSpacing w:val="0"/>
+        <w:rPr>
+          <w:rFonts w:ascii="Arial" w:hAnsi="Arial" w:cs="Arial"/>
+        </w:rPr>
+      </w:pPr>
+      <w:r>
+        <w:rPr>
+          <w:rFonts w:ascii="Arial" w:hAnsi="Arial" w:cs="Arial"/>
+        </w:rPr>
+        <w:t xml:space="preserve">Create spectrograms for 50 audio files, feed them to </w:t>
+      </w:r>
+      <w:proofErr w:type="spellStart"/>
+      <w:r>
+        <w:rPr>
+          <w:rFonts w:ascii="Arial" w:hAnsi="Arial" w:cs="Arial"/>
+        </w:rPr>
+        <w:t>soundgen</w:t>
+      </w:r>
+      <w:proofErr w:type="spellEnd"/>
+      <w:r>
+        <w:rPr>
+          <w:rFonts w:ascii="Arial" w:hAnsi="Arial" w:cs="Arial"/>
+        </w:rPr>
+        <w:t xml:space="preserve"> using code that Grace has already to pull out the estimated fundamental frequency contour, create spectrograms again with the frequency contour overlaid to check the accuracy of the tracing</w:t>
       </w:r>
     </w:p>
     <w:p>
@@ -1670,21 +2032,41 @@
         <w:rPr>
           <w:rFonts w:ascii="Arial" w:hAnsi="Arial" w:cs="Arial"/>
         </w:rPr>
-        <w:t xml:space="preserve">Analysis questions: How similar are an individual’s calls to its own calls, compared to calls of other individuals? And the same </w:t>
+        <w:t>When I’ve done the latter in warbler the frequency contours are always off</w:t>
+      </w:r>
+    </w:p>
+    <w:p>
+      <w:pPr>
+        <w:pStyle w:val="ListParagraph"/>
+        <w:numPr>
+          <w:ilvl w:val="5"/>
+          <w:numId w:val="3"/>
+        </w:numPr>
+        <w:spacing w:after="240"/>
+        <w:contextualSpacing w:val="0"/>
+        <w:rPr>
+          <w:rFonts w:ascii="Arial" w:hAnsi="Arial" w:cs="Arial"/>
+        </w:rPr>
+      </w:pPr>
+      <w:r>
+        <w:rPr>
+          <w:rFonts w:ascii="Arial" w:hAnsi="Arial" w:cs="Arial"/>
+        </w:rPr>
+        <w:t xml:space="preserve">But when I create spectrograms in </w:t>
       </w:r>
       <w:proofErr w:type="spellStart"/>
       <w:r>
         <w:rPr>
           <w:rFonts w:ascii="Arial" w:hAnsi="Arial" w:cs="Arial"/>
         </w:rPr>
-        <w:t>for</w:t>
+        <w:t>soundgen</w:t>
       </w:r>
       <w:proofErr w:type="spellEnd"/>
       <w:r>
         <w:rPr>
           <w:rFonts w:ascii="Arial" w:hAnsi="Arial" w:cs="Arial"/>
         </w:rPr>
-        <w:t xml:space="preserve"> groups</w:t>
+        <w:t>, the contours look great</w:t>
       </w:r>
     </w:p>
     <w:p>
@@ -1700,25 +2082,320 @@
           <w:rFonts w:ascii="Arial" w:hAnsi="Arial" w:cs="Arial"/>
         </w:rPr>
       </w:pPr>
-      <w:r>
-        <w:rPr>
-          <w:rFonts w:ascii="Arial" w:hAnsi="Arial" w:cs="Arial"/>
-        </w:rPr>
-        <w:t xml:space="preserve">These models allow us to address the statistical significance of the degree or magnitude of </w:t>
-      </w:r>
+      <w:proofErr w:type="spellStart"/>
+      <w:r>
+        <w:rPr>
+          <w:rFonts w:ascii="Arial" w:hAnsi="Arial" w:cs="Arial"/>
+        </w:rPr>
+        <w:t>Soundgen</w:t>
+      </w:r>
+      <w:proofErr w:type="spellEnd"/>
+      <w:r>
+        <w:rPr>
+          <w:rFonts w:ascii="Arial" w:hAnsi="Arial" w:cs="Arial"/>
+        </w:rPr>
+        <w:t xml:space="preserve"> has a Shiny app in which you can upload audio files and do manual correction of the frequency contour online</w:t>
+      </w:r>
+      <w:r>
+        <w:rPr>
+          <w:rFonts w:ascii="Arial" w:hAnsi="Arial" w:cs="Arial"/>
+        </w:rPr>
+        <w:t xml:space="preserve"> (semi-automated)</w:t>
+      </w:r>
+    </w:p>
+    <w:p>
+      <w:pPr>
+        <w:pStyle w:val="ListParagraph"/>
+        <w:numPr>
+          <w:ilvl w:val="2"/>
+          <w:numId w:val="3"/>
+        </w:numPr>
+        <w:spacing w:after="240"/>
+        <w:contextualSpacing w:val="0"/>
+        <w:rPr>
+          <w:rFonts w:ascii="Arial" w:hAnsi="Arial" w:cs="Arial"/>
+        </w:rPr>
+      </w:pPr>
+      <w:r>
+        <w:rPr>
+          <w:rFonts w:ascii="Arial" w:hAnsi="Arial" w:cs="Arial"/>
+        </w:rPr>
+        <w:t>Dynamic time warping</w:t>
+      </w:r>
+      <w:r>
+        <w:rPr>
+          <w:rFonts w:ascii="Arial" w:hAnsi="Arial" w:cs="Arial"/>
+        </w:rPr>
+        <w:t xml:space="preserve"> (DTW)</w:t>
+      </w:r>
+      <w:r>
+        <w:rPr>
+          <w:rFonts w:ascii="Arial" w:hAnsi="Arial" w:cs="Arial"/>
+        </w:rPr>
+        <w:t xml:space="preserve"> to compare the time series of the frequency contours</w:t>
+      </w:r>
+    </w:p>
+    <w:p>
+      <w:pPr>
+        <w:pStyle w:val="ListParagraph"/>
+        <w:numPr>
+          <w:ilvl w:val="3"/>
+          <w:numId w:val="3"/>
+        </w:numPr>
+        <w:spacing w:after="240"/>
+        <w:contextualSpacing w:val="0"/>
+        <w:rPr>
+          <w:rFonts w:ascii="Arial" w:hAnsi="Arial" w:cs="Arial"/>
+        </w:rPr>
+      </w:pPr>
+      <w:r>
+        <w:rPr>
+          <w:rFonts w:ascii="Arial" w:hAnsi="Arial" w:cs="Arial"/>
+        </w:rPr>
+        <w:t xml:space="preserve">Run </w:t>
+      </w:r>
+      <w:r>
+        <w:rPr>
+          <w:rFonts w:ascii="Arial" w:hAnsi="Arial" w:cs="Arial"/>
+        </w:rPr>
+        <w:t xml:space="preserve">univariate </w:t>
+      </w:r>
+      <w:r>
+        <w:rPr>
+          <w:rFonts w:ascii="Arial" w:hAnsi="Arial" w:cs="Arial"/>
+        </w:rPr>
+        <w:t>DTW</w:t>
+      </w:r>
+      <w:r>
+        <w:rPr>
+          <w:rFonts w:ascii="Arial" w:hAnsi="Arial" w:cs="Arial"/>
+        </w:rPr>
+        <w:t xml:space="preserve"> on the fundamental frequency contours</w:t>
+      </w:r>
+      <w:r>
+        <w:rPr>
+          <w:rFonts w:ascii="Arial" w:hAnsi="Arial" w:cs="Arial"/>
+        </w:rPr>
+        <w:t xml:space="preserve"> using code that Grace has </w:t>
+      </w:r>
+      <w:r>
+        <w:rPr>
+          <w:rFonts w:ascii="Arial" w:hAnsi="Arial" w:cs="Arial"/>
+        </w:rPr>
+        <w:t xml:space="preserve">used with the </w:t>
+      </w:r>
+      <w:proofErr w:type="spellStart"/>
+      <w:r>
+        <w:rPr>
+          <w:rFonts w:ascii="Arial" w:hAnsi="Arial" w:cs="Arial"/>
+        </w:rPr>
+        <w:t>dtw</w:t>
+      </w:r>
+      <w:proofErr w:type="spellEnd"/>
+      <w:r>
+        <w:rPr>
+          <w:rFonts w:ascii="Arial" w:hAnsi="Arial" w:cs="Arial"/>
+        </w:rPr>
+        <w:t xml:space="preserve"> package in R</w:t>
+      </w:r>
+    </w:p>
+    <w:p>
+      <w:pPr>
+        <w:pStyle w:val="ListParagraph"/>
+        <w:numPr>
+          <w:ilvl w:val="3"/>
+          <w:numId w:val="3"/>
+        </w:numPr>
+        <w:spacing w:after="240"/>
+        <w:contextualSpacing w:val="0"/>
+        <w:rPr>
+          <w:rFonts w:ascii="Arial" w:hAnsi="Arial" w:cs="Arial"/>
+        </w:rPr>
+      </w:pPr>
+      <w:r>
+        <w:rPr>
+          <w:rFonts w:ascii="Arial" w:hAnsi="Arial" w:cs="Arial"/>
+        </w:rPr>
+        <w:t>Returns a distance matrix that can be used in downstream analysis</w:t>
+      </w:r>
+    </w:p>
+    <w:p>
+      <w:pPr>
+        <w:pStyle w:val="ListParagraph"/>
+        <w:numPr>
+          <w:ilvl w:val="2"/>
+          <w:numId w:val="3"/>
+        </w:numPr>
+        <w:spacing w:after="240"/>
+        <w:contextualSpacing w:val="0"/>
+        <w:rPr>
+          <w:rFonts w:ascii="Arial" w:hAnsi="Arial" w:cs="Arial"/>
+        </w:rPr>
+      </w:pPr>
+      <w:commentRangeStart w:id="1"/>
+      <w:r>
+        <w:rPr>
+          <w:rFonts w:ascii="Arial" w:hAnsi="Arial" w:cs="Arial"/>
+        </w:rPr>
+        <w:t>Multi-dimensional scaling acoustic space, clustering and Normalized Mutual Information</w:t>
+      </w:r>
+      <w:r>
+        <w:rPr>
+          <w:rFonts w:ascii="Arial" w:hAnsi="Arial" w:cs="Arial"/>
+        </w:rPr>
+        <w:t xml:space="preserve">, </w:t>
+      </w:r>
+      <w:r>
+        <w:rPr>
+          <w:rFonts w:ascii="Arial" w:hAnsi="Arial" w:cs="Arial"/>
+        </w:rPr>
+        <w:t xml:space="preserve">Bayesian hierarchical </w:t>
+      </w:r>
+      <w:r>
+        <w:rPr>
+          <w:rFonts w:ascii="Arial" w:hAnsi="Arial" w:cs="Arial"/>
+        </w:rPr>
+        <w:t>models</w:t>
+      </w:r>
+    </w:p>
+    <w:p>
+      <w:pPr>
+        <w:pStyle w:val="ListParagraph"/>
+        <w:numPr>
+          <w:ilvl w:val="3"/>
+          <w:numId w:val="3"/>
+        </w:numPr>
+        <w:spacing w:after="240"/>
+        <w:contextualSpacing w:val="0"/>
+        <w:rPr>
+          <w:rFonts w:ascii="Arial" w:hAnsi="Arial" w:cs="Arial"/>
+        </w:rPr>
+      </w:pPr>
+      <w:r>
+        <w:rPr>
+          <w:rFonts w:ascii="Arial" w:hAnsi="Arial" w:cs="Arial"/>
+        </w:rPr>
+        <w:t xml:space="preserve">This part of the pipeline will be really </w:t>
+      </w:r>
+      <w:proofErr w:type="gramStart"/>
+      <w:r>
+        <w:rPr>
+          <w:rFonts w:ascii="Arial" w:hAnsi="Arial" w:cs="Arial"/>
+        </w:rPr>
+        <w:t>similar to</w:t>
+      </w:r>
+      <w:proofErr w:type="gramEnd"/>
+      <w:r>
+        <w:rPr>
+          <w:rFonts w:ascii="Arial" w:hAnsi="Arial" w:cs="Arial"/>
+        </w:rPr>
+        <w:t xml:space="preserve"> the SPCC pipeline above</w:t>
+      </w:r>
+      <w:commentRangeEnd w:id="1"/>
+      <w:r>
+        <w:rPr>
+          <w:rStyle w:val="CommentReference"/>
+        </w:rPr>
+        <w:commentReference w:id="1"/>
+      </w:r>
+    </w:p>
+    <w:p>
+      <w:pPr>
+        <w:pStyle w:val="ListParagraph"/>
+        <w:numPr>
+          <w:ilvl w:val="0"/>
+          <w:numId w:val="3"/>
+        </w:numPr>
+        <w:rPr>
+          <w:rFonts w:ascii="Arial" w:hAnsi="Arial" w:cs="Arial"/>
+        </w:rPr>
+      </w:pPr>
+      <w:r>
+        <w:rPr>
+          <w:rFonts w:ascii="Arial" w:hAnsi="Arial" w:cs="Arial"/>
+        </w:rPr>
+        <w:t>Figures:</w:t>
+      </w:r>
+    </w:p>
+    <w:p>
+      <w:pPr>
+        <w:pStyle w:val="ListParagraph"/>
+        <w:numPr>
+          <w:ilvl w:val="1"/>
+          <w:numId w:val="3"/>
+        </w:numPr>
+        <w:rPr>
+          <w:rFonts w:ascii="Arial" w:hAnsi="Arial" w:cs="Arial"/>
+        </w:rPr>
+      </w:pPr>
       <w:r>
         <w:rPr>
           <w:rFonts w:ascii="Arial" w:hAnsi="Arial" w:cs="Arial"/>
         </w:rPr>
         <w:lastRenderedPageBreak/>
-        <w:t>convergence</w:t>
-      </w:r>
-      <w:r>
-        <w:rPr>
-          <w:rFonts w:ascii="Arial" w:hAnsi="Arial" w:cs="Arial"/>
-        </w:rPr>
-        <w:t xml:space="preserve"> (which we originally encoded using </w:t>
-      </w:r>
+        <w:t>One plot for each experiment in different “social environments” and NMI at both social levels in the same plot, where does the “switching point” between NMI accuracy at the group and individual level</w:t>
+      </w:r>
+      <w:r>
+        <w:rPr>
+          <w:rFonts w:ascii="Arial" w:hAnsi="Arial" w:cs="Arial"/>
+        </w:rPr>
+        <w:t xml:space="preserve"> occur?</w:t>
+      </w:r>
+    </w:p>
+    <w:p>
+      <w:pPr>
+        <w:rPr>
+          <w:rFonts w:ascii="Arial" w:hAnsi="Arial" w:cs="Arial"/>
+        </w:rPr>
+      </w:pPr>
+    </w:p>
+    <w:p>
+      <w:pPr>
+        <w:rPr>
+          <w:rFonts w:ascii="Arial" w:hAnsi="Arial" w:cs="Arial"/>
+        </w:rPr>
+      </w:pPr>
+    </w:p>
+    <w:p>
+      <w:pPr>
+        <w:rPr>
+          <w:rFonts w:ascii="Arial" w:hAnsi="Arial" w:cs="Arial"/>
+        </w:rPr>
+      </w:pPr>
+    </w:p>
+    <w:p>
+      <w:pPr>
+        <w:rPr>
+          <w:rFonts w:ascii="Arial" w:hAnsi="Arial" w:cs="Arial"/>
+        </w:rPr>
+      </w:pPr>
+      <w:r>
+        <w:rPr>
+          <w:rFonts w:ascii="Arial" w:hAnsi="Arial" w:cs="Arial"/>
+        </w:rPr>
+        <w:br w:type="page"/>
+      </w:r>
+    </w:p>
+    <w:p>
+      <w:pPr>
+        <w:rPr>
+          <w:rFonts w:ascii="Arial" w:hAnsi="Arial" w:cs="Arial"/>
+        </w:rPr>
+      </w:pPr>
+      <w:r>
+        <w:rPr>
+          <w:rFonts w:ascii="Arial" w:hAnsi="Arial" w:cs="Arial"/>
+        </w:rPr>
+        <w:lastRenderedPageBreak/>
+        <w:t>Just because I don’t want to lose this information yet:</w:t>
+      </w:r>
+    </w:p>
+    <w:p>
+      <w:pPr>
+        <w:rPr>
+          <w:rFonts w:ascii="Arial" w:hAnsi="Arial" w:cs="Arial"/>
+        </w:rPr>
+      </w:pPr>
       <w:proofErr w:type="spellStart"/>
       <w:r>
         <w:rPr>
@@ -1731,25 +2408,55 @@
         <w:rPr>
           <w:rFonts w:ascii="Arial" w:hAnsi="Arial" w:cs="Arial"/>
         </w:rPr>
-        <w:t>)</w:t>
-      </w:r>
-      <w:r>
-        <w:rPr>
-          <w:rFonts w:ascii="Arial" w:hAnsi="Arial" w:cs="Arial"/>
-        </w:rPr>
-        <w:t>. The inferential statistics layer to validate that the information we originally encoded can be recov</w:t>
-      </w:r>
-      <w:r>
-        <w:rPr>
-          <w:rFonts w:ascii="Arial" w:hAnsi="Arial" w:cs="Arial"/>
-        </w:rPr>
-        <w:t>er</w:t>
-      </w:r>
-      <w:r>
-        <w:rPr>
-          <w:rFonts w:ascii="Arial" w:hAnsi="Arial" w:cs="Arial"/>
-        </w:rPr>
-        <w:t>ed</w:t>
+        <w:t xml:space="preserve"> Part 2: validating types of analysis </w:t>
+      </w:r>
+    </w:p>
+    <w:p>
+      <w:pPr>
+        <w:pStyle w:val="ListParagraph"/>
+        <w:numPr>
+          <w:ilvl w:val="2"/>
+          <w:numId w:val="3"/>
+        </w:numPr>
+        <w:spacing w:after="240"/>
+        <w:ind w:left="180"/>
+        <w:contextualSpacing w:val="0"/>
+        <w:rPr>
+          <w:rFonts w:ascii="Arial" w:hAnsi="Arial" w:cs="Arial"/>
+        </w:rPr>
+      </w:pPr>
+      <w:r>
+        <w:rPr>
+          <w:rFonts w:ascii="Arial" w:hAnsi="Arial" w:cs="Arial"/>
+        </w:rPr>
+        <w:t>Bayesian hierarchical models</w:t>
+      </w:r>
+      <w:r>
+        <w:rPr>
+          <w:rFonts w:ascii="Arial" w:hAnsi="Arial" w:cs="Arial"/>
+        </w:rPr>
+        <w:t xml:space="preserve"> for inferential statistics (TODO)</w:t>
+      </w:r>
+    </w:p>
+    <w:p>
+      <w:pPr>
+        <w:pStyle w:val="ListParagraph"/>
+        <w:numPr>
+          <w:ilvl w:val="3"/>
+          <w:numId w:val="3"/>
+        </w:numPr>
+        <w:spacing w:after="240"/>
+        <w:ind w:left="720"/>
+        <w:contextualSpacing w:val="0"/>
+        <w:rPr>
+          <w:rFonts w:ascii="Arial" w:hAnsi="Arial" w:cs="Arial"/>
+        </w:rPr>
+      </w:pPr>
+      <w:r>
+        <w:rPr>
+          <w:rFonts w:ascii="Arial" w:hAnsi="Arial" w:cs="Arial"/>
+        </w:rPr>
+        <w:t>Ask whether acoustic convergence is statistically significant at each social level across experimental treatments</w:t>
       </w:r>
     </w:p>
     <w:p>
@@ -1760,6 +2467,7 @@
           <w:numId w:val="3"/>
         </w:numPr>
         <w:spacing w:after="240"/>
+        <w:ind w:left="1440"/>
         <w:contextualSpacing w:val="0"/>
         <w:rPr>
           <w:rFonts w:ascii="Arial" w:hAnsi="Arial" w:cs="Arial"/>
@@ -1769,13 +2477,98 @@
         <w:rPr>
           <w:rFonts w:ascii="Arial" w:hAnsi="Arial" w:cs="Arial"/>
         </w:rPr>
-        <w:t>A receiver standpoint on information recovery, in which we simulated signaler information encoding</w:t>
-      </w:r>
-      <w:r>
-        <w:rPr>
-          <w:rFonts w:ascii="Arial" w:hAnsi="Arial" w:cs="Arial"/>
-        </w:rPr>
-        <w:t xml:space="preserve">. Does the variation that we encoded </w:t>
+        <w:t>Bayesian models should use the SPCC matrix values as input data, very similar to Mantel test</w:t>
+      </w:r>
+    </w:p>
+    <w:p>
+      <w:pPr>
+        <w:pStyle w:val="ListParagraph"/>
+        <w:numPr>
+          <w:ilvl w:val="5"/>
+          <w:numId w:val="3"/>
+        </w:numPr>
+        <w:spacing w:after="240"/>
+        <w:ind w:left="1890"/>
+        <w:contextualSpacing w:val="0"/>
+        <w:rPr>
+          <w:rFonts w:ascii="Arial" w:hAnsi="Arial" w:cs="Arial"/>
+        </w:rPr>
+      </w:pPr>
+      <w:r>
+        <w:rPr>
+          <w:rFonts w:ascii="Arial" w:hAnsi="Arial" w:cs="Arial"/>
+        </w:rPr>
+        <w:t xml:space="preserve">Analysis questions: How similar are an individual’s calls to </w:t>
+      </w:r>
+      <w:proofErr w:type="gramStart"/>
+      <w:r>
+        <w:rPr>
+          <w:rFonts w:ascii="Arial" w:hAnsi="Arial" w:cs="Arial"/>
+        </w:rPr>
+        <w:t>its</w:t>
+      </w:r>
+      <w:proofErr w:type="gramEnd"/>
+      <w:r>
+        <w:rPr>
+          <w:rFonts w:ascii="Arial" w:hAnsi="Arial" w:cs="Arial"/>
+        </w:rPr>
+        <w:t xml:space="preserve"> own calls, compared to calls of other individuals? And the same for groups</w:t>
+      </w:r>
+    </w:p>
+    <w:p>
+      <w:pPr>
+        <w:pStyle w:val="ListParagraph"/>
+        <w:numPr>
+          <w:ilvl w:val="4"/>
+          <w:numId w:val="3"/>
+        </w:numPr>
+        <w:spacing w:after="240"/>
+        <w:ind w:left="1440"/>
+        <w:contextualSpacing w:val="0"/>
+        <w:rPr>
+          <w:rFonts w:ascii="Arial" w:hAnsi="Arial" w:cs="Arial"/>
+        </w:rPr>
+      </w:pPr>
+      <w:r>
+        <w:rPr>
+          <w:rFonts w:ascii="Arial" w:hAnsi="Arial" w:cs="Arial"/>
+        </w:rPr>
+        <w:t xml:space="preserve">These models allow us to address the statistical significance of the degree or magnitude of convergence (which we originally encoded using </w:t>
+      </w:r>
+      <w:proofErr w:type="spellStart"/>
+      <w:r>
+        <w:rPr>
+          <w:rFonts w:ascii="Arial" w:hAnsi="Arial" w:cs="Arial"/>
+        </w:rPr>
+        <w:t>paRsynth</w:t>
+      </w:r>
+      <w:proofErr w:type="spellEnd"/>
+      <w:r>
+        <w:rPr>
+          <w:rFonts w:ascii="Arial" w:hAnsi="Arial" w:cs="Arial"/>
+        </w:rPr>
+        <w:t>). The inferential statistics layer to validate that the information we originally encoded can be recovered</w:t>
+      </w:r>
+    </w:p>
+    <w:p>
+      <w:pPr>
+        <w:pStyle w:val="ListParagraph"/>
+        <w:numPr>
+          <w:ilvl w:val="4"/>
+          <w:numId w:val="3"/>
+        </w:numPr>
+        <w:spacing w:after="240"/>
+        <w:ind w:left="1440"/>
+        <w:contextualSpacing w:val="0"/>
+        <w:rPr>
+          <w:rFonts w:ascii="Arial" w:hAnsi="Arial" w:cs="Arial"/>
+        </w:rPr>
+      </w:pPr>
+      <w:r>
+        <w:rPr>
+          <w:rFonts w:ascii="Arial" w:hAnsi="Arial" w:cs="Arial"/>
+        </w:rPr>
+        <w:t xml:space="preserve">A receiver standpoint on information recovery, in which we simulated signaler information encoding. Does the variation that we encoded </w:t>
       </w:r>
       <w:proofErr w:type="gramStart"/>
       <w:r>
@@ -1800,6 +2593,7 @@
           <w:numId w:val="3"/>
         </w:numPr>
         <w:spacing w:after="240"/>
+        <w:ind w:left="720"/>
         <w:contextualSpacing w:val="0"/>
         <w:rPr>
           <w:rFonts w:ascii="Arial" w:hAnsi="Arial" w:cs="Arial"/>
@@ -1809,13 +2603,7 @@
         <w:rPr>
           <w:rFonts w:ascii="Arial" w:hAnsi="Arial" w:cs="Arial"/>
         </w:rPr>
-        <w:t xml:space="preserve">Because we have repeated sampling at both social levels with known </w:t>
-      </w:r>
-      <w:r>
-        <w:rPr>
-          <w:rFonts w:ascii="Arial" w:hAnsi="Arial" w:cs="Arial"/>
-        </w:rPr>
-        <w:t xml:space="preserve">individuals, we can </w:t>
+        <w:t xml:space="preserve">Because we have repeated sampling at both social levels with known individuals, we can </w:t>
       </w:r>
       <w:proofErr w:type="gramStart"/>
       <w:r>
@@ -1829,531 +2617,15 @@
         <w:rPr>
           <w:rFonts w:ascii="Arial" w:hAnsi="Arial" w:cs="Arial"/>
         </w:rPr>
-        <w:t xml:space="preserve"> variation in convergence within and between categories (individuals, groups) </w:t>
-      </w:r>
-      <w:r>
-        <w:rPr>
-          <w:rFonts w:ascii="Arial" w:hAnsi="Arial" w:cs="Arial"/>
-        </w:rPr>
-        <w:t>at each social level</w:t>
-      </w:r>
-    </w:p>
-    <w:p>
-      <w:pPr>
-        <w:pStyle w:val="ListParagraph"/>
-        <w:numPr>
-          <w:ilvl w:val="1"/>
-          <w:numId w:val="3"/>
-        </w:numPr>
-        <w:spacing w:after="240"/>
-        <w:contextualSpacing w:val="0"/>
-        <w:rPr>
-          <w:rFonts w:ascii="Arial" w:hAnsi="Arial" w:cs="Arial"/>
-        </w:rPr>
-      </w:pPr>
-      <w:r>
-        <w:rPr>
-          <w:rFonts w:ascii="Arial" w:hAnsi="Arial" w:cs="Arial"/>
-        </w:rPr>
-        <w:t>Frequency contour tracing</w:t>
-      </w:r>
-      <w:r>
-        <w:rPr>
-          <w:rFonts w:ascii="Arial" w:hAnsi="Arial" w:cs="Arial"/>
-        </w:rPr>
-        <w:t xml:space="preserve"> based</w:t>
-      </w:r>
-      <w:r>
-        <w:rPr>
-          <w:rFonts w:ascii="Arial" w:hAnsi="Arial" w:cs="Arial"/>
-        </w:rPr>
-        <w:t xml:space="preserve"> (</w:t>
-      </w:r>
-      <w:r>
-        <w:rPr>
-          <w:rFonts w:ascii="Arial" w:hAnsi="Arial" w:cs="Arial"/>
-        </w:rPr>
-        <w:t>b</w:t>
-      </w:r>
-      <w:r>
-        <w:rPr>
-          <w:rFonts w:ascii="Arial" w:hAnsi="Arial" w:cs="Arial"/>
-        </w:rPr>
-        <w:t>ecause we are encoding information in frequency modulation patterns</w:t>
-      </w:r>
-      <w:r>
-        <w:rPr>
-          <w:rFonts w:ascii="Arial" w:hAnsi="Arial" w:cs="Arial"/>
-        </w:rPr>
-        <w:t>)</w:t>
-      </w:r>
-    </w:p>
-    <w:p>
-      <w:pPr>
-        <w:pStyle w:val="ListParagraph"/>
-        <w:numPr>
-          <w:ilvl w:val="2"/>
-          <w:numId w:val="3"/>
-        </w:numPr>
-        <w:spacing w:after="240"/>
-        <w:contextualSpacing w:val="0"/>
-        <w:rPr>
-          <w:rFonts w:ascii="Arial" w:hAnsi="Arial" w:cs="Arial"/>
-        </w:rPr>
-      </w:pPr>
-      <w:r>
-        <w:rPr>
-          <w:rFonts w:ascii="Arial" w:hAnsi="Arial" w:cs="Arial"/>
-        </w:rPr>
-        <w:t>Frequency contour extraction</w:t>
-      </w:r>
-      <w:r>
-        <w:rPr>
-          <w:rFonts w:ascii="Arial" w:hAnsi="Arial" w:cs="Arial"/>
-        </w:rPr>
-        <w:t xml:space="preserve"> with semi-automated approaches</w:t>
-      </w:r>
-      <w:r>
-        <w:rPr>
-          <w:rFonts w:ascii="Arial" w:hAnsi="Arial" w:cs="Arial"/>
-        </w:rPr>
-        <w:t>: easily the hardest part of this pipeline because it can be very time-consuming and subjective</w:t>
-      </w:r>
-    </w:p>
-    <w:p>
-      <w:pPr>
-        <w:pStyle w:val="ListParagraph"/>
-        <w:numPr>
-          <w:ilvl w:val="3"/>
-          <w:numId w:val="3"/>
-        </w:numPr>
-        <w:spacing w:after="240"/>
-        <w:contextualSpacing w:val="0"/>
-        <w:rPr>
-          <w:rFonts w:ascii="Arial" w:hAnsi="Arial" w:cs="Arial"/>
-        </w:rPr>
-      </w:pPr>
-      <w:r>
-        <w:rPr>
-          <w:rFonts w:ascii="Arial" w:hAnsi="Arial" w:cs="Arial"/>
-        </w:rPr>
-        <w:t>We would only run this analysis with a subsample of the audio files and experimental treatments</w:t>
-      </w:r>
-    </w:p>
-    <w:p>
-      <w:pPr>
-        <w:pStyle w:val="ListParagraph"/>
-        <w:numPr>
-          <w:ilvl w:val="3"/>
-          <w:numId w:val="3"/>
-        </w:numPr>
-        <w:spacing w:after="240"/>
-        <w:contextualSpacing w:val="0"/>
-        <w:rPr>
-          <w:rFonts w:ascii="Arial" w:hAnsi="Arial" w:cs="Arial"/>
-        </w:rPr>
-      </w:pPr>
-      <w:r>
-        <w:rPr>
-          <w:rFonts w:ascii="Arial" w:hAnsi="Arial" w:cs="Arial"/>
-        </w:rPr>
-        <w:t xml:space="preserve">Pilot </w:t>
-      </w:r>
-      <w:r>
-        <w:rPr>
-          <w:rFonts w:ascii="Arial" w:hAnsi="Arial" w:cs="Arial"/>
-        </w:rPr>
-        <w:t>frequency contour tracing:</w:t>
-      </w:r>
-    </w:p>
-    <w:p>
-      <w:pPr>
-        <w:pStyle w:val="ListParagraph"/>
-        <w:numPr>
-          <w:ilvl w:val="4"/>
-          <w:numId w:val="3"/>
-        </w:numPr>
-        <w:spacing w:after="240"/>
-        <w:contextualSpacing w:val="0"/>
-        <w:rPr>
-          <w:rFonts w:ascii="Arial" w:hAnsi="Arial" w:cs="Arial"/>
-        </w:rPr>
-      </w:pPr>
-      <w:proofErr w:type="spellStart"/>
-      <w:proofErr w:type="gramStart"/>
-      <w:r>
-        <w:rPr>
-          <w:rFonts w:ascii="Arial" w:hAnsi="Arial" w:cs="Arial"/>
-        </w:rPr>
-        <w:t>soundgen</w:t>
-      </w:r>
-      <w:proofErr w:type="spellEnd"/>
-      <w:r>
-        <w:rPr>
-          <w:rFonts w:ascii="Arial" w:hAnsi="Arial" w:cs="Arial"/>
-        </w:rPr>
-        <w:t>::</w:t>
-      </w:r>
-      <w:proofErr w:type="spellStart"/>
-      <w:proofErr w:type="gramEnd"/>
-      <w:r>
-        <w:rPr>
-          <w:rFonts w:ascii="Arial" w:hAnsi="Arial" w:cs="Arial"/>
-        </w:rPr>
-        <w:t>soundgen</w:t>
-      </w:r>
-      <w:proofErr w:type="spellEnd"/>
-      <w:r>
-        <w:rPr>
-          <w:rFonts w:ascii="Arial" w:hAnsi="Arial" w:cs="Arial"/>
-        </w:rPr>
-        <w:t>()</w:t>
-      </w:r>
-      <w:r>
-        <w:rPr>
-          <w:rFonts w:ascii="Arial" w:hAnsi="Arial" w:cs="Arial"/>
-        </w:rPr>
-        <w:t>, test whether frequency contours are accurate</w:t>
-      </w:r>
-    </w:p>
-    <w:p>
-      <w:pPr>
-        <w:pStyle w:val="ListParagraph"/>
-        <w:numPr>
-          <w:ilvl w:val="4"/>
-          <w:numId w:val="3"/>
-        </w:numPr>
-        <w:spacing w:after="240"/>
-        <w:contextualSpacing w:val="0"/>
-        <w:rPr>
-          <w:rFonts w:ascii="Arial" w:hAnsi="Arial" w:cs="Arial"/>
-        </w:rPr>
-      </w:pPr>
-      <w:r>
-        <w:rPr>
-          <w:rFonts w:ascii="Arial" w:hAnsi="Arial" w:cs="Arial"/>
-        </w:rPr>
-        <w:t xml:space="preserve">Create spectrograms for 50 audio files, feed them to </w:t>
-      </w:r>
-      <w:proofErr w:type="spellStart"/>
-      <w:r>
-        <w:rPr>
-          <w:rFonts w:ascii="Arial" w:hAnsi="Arial" w:cs="Arial"/>
-        </w:rPr>
-        <w:t>soundgen</w:t>
-      </w:r>
-      <w:proofErr w:type="spellEnd"/>
-      <w:r>
-        <w:rPr>
-          <w:rFonts w:ascii="Arial" w:hAnsi="Arial" w:cs="Arial"/>
-        </w:rPr>
-        <w:t xml:space="preserve"> using code that Grace has already to pull out the estimated fundamental frequency contour, create spectrograms again with the frequency contour overlaid to check the accuracy of the tracing</w:t>
-      </w:r>
-    </w:p>
-    <w:p>
-      <w:pPr>
-        <w:pStyle w:val="ListParagraph"/>
-        <w:numPr>
-          <w:ilvl w:val="5"/>
-          <w:numId w:val="3"/>
-        </w:numPr>
-        <w:spacing w:after="240"/>
-        <w:contextualSpacing w:val="0"/>
-        <w:rPr>
-          <w:rFonts w:ascii="Arial" w:hAnsi="Arial" w:cs="Arial"/>
-        </w:rPr>
-      </w:pPr>
-      <w:r>
-        <w:rPr>
-          <w:rFonts w:ascii="Arial" w:hAnsi="Arial" w:cs="Arial"/>
-        </w:rPr>
-        <w:t>When I’ve done the latter in warbler the frequency contours are always off</w:t>
-      </w:r>
-    </w:p>
-    <w:p>
-      <w:pPr>
-        <w:pStyle w:val="ListParagraph"/>
-        <w:numPr>
-          <w:ilvl w:val="5"/>
-          <w:numId w:val="3"/>
-        </w:numPr>
-        <w:spacing w:after="240"/>
-        <w:contextualSpacing w:val="0"/>
-        <w:rPr>
-          <w:rFonts w:ascii="Arial" w:hAnsi="Arial" w:cs="Arial"/>
-        </w:rPr>
-      </w:pPr>
-      <w:r>
-        <w:rPr>
-          <w:rFonts w:ascii="Arial" w:hAnsi="Arial" w:cs="Arial"/>
-        </w:rPr>
-        <w:t xml:space="preserve">But when I create spectrograms in </w:t>
-      </w:r>
-      <w:proofErr w:type="spellStart"/>
-      <w:r>
-        <w:rPr>
-          <w:rFonts w:ascii="Arial" w:hAnsi="Arial" w:cs="Arial"/>
-        </w:rPr>
-        <w:t>soundgen</w:t>
-      </w:r>
-      <w:proofErr w:type="spellEnd"/>
-      <w:r>
-        <w:rPr>
-          <w:rFonts w:ascii="Arial" w:hAnsi="Arial" w:cs="Arial"/>
-        </w:rPr>
-        <w:t>, the contours look great</w:t>
-      </w:r>
-    </w:p>
-    <w:p>
-      <w:pPr>
-        <w:pStyle w:val="ListParagraph"/>
-        <w:numPr>
-          <w:ilvl w:val="4"/>
-          <w:numId w:val="3"/>
-        </w:numPr>
-        <w:spacing w:after="240"/>
-        <w:contextualSpacing w:val="0"/>
-        <w:rPr>
-          <w:rFonts w:ascii="Arial" w:hAnsi="Arial" w:cs="Arial"/>
-        </w:rPr>
-      </w:pPr>
-      <w:proofErr w:type="spellStart"/>
-      <w:r>
-        <w:rPr>
-          <w:rFonts w:ascii="Arial" w:hAnsi="Arial" w:cs="Arial"/>
-        </w:rPr>
-        <w:t>Soundgen</w:t>
-      </w:r>
-      <w:proofErr w:type="spellEnd"/>
-      <w:r>
-        <w:rPr>
-          <w:rFonts w:ascii="Arial" w:hAnsi="Arial" w:cs="Arial"/>
-        </w:rPr>
-        <w:t xml:space="preserve"> has a Shiny app in which you can upload audio files and do manual correction of the frequency contour online</w:t>
-      </w:r>
-      <w:r>
-        <w:rPr>
-          <w:rFonts w:ascii="Arial" w:hAnsi="Arial" w:cs="Arial"/>
-        </w:rPr>
-        <w:t xml:space="preserve"> (semi-automated)</w:t>
-      </w:r>
-    </w:p>
-    <w:p>
-      <w:pPr>
-        <w:pStyle w:val="ListParagraph"/>
-        <w:numPr>
-          <w:ilvl w:val="2"/>
-          <w:numId w:val="3"/>
-        </w:numPr>
-        <w:spacing w:after="240"/>
-        <w:contextualSpacing w:val="0"/>
-        <w:rPr>
-          <w:rFonts w:ascii="Arial" w:hAnsi="Arial" w:cs="Arial"/>
-        </w:rPr>
-      </w:pPr>
-      <w:r>
-        <w:rPr>
-          <w:rFonts w:ascii="Arial" w:hAnsi="Arial" w:cs="Arial"/>
-        </w:rPr>
-        <w:t>Dynamic time warping</w:t>
-      </w:r>
-      <w:r>
-        <w:rPr>
-          <w:rFonts w:ascii="Arial" w:hAnsi="Arial" w:cs="Arial"/>
-        </w:rPr>
-        <w:t xml:space="preserve"> (DTW)</w:t>
-      </w:r>
-      <w:r>
-        <w:rPr>
-          <w:rFonts w:ascii="Arial" w:hAnsi="Arial" w:cs="Arial"/>
-        </w:rPr>
-        <w:t xml:space="preserve"> to compare the time series of the frequency contours</w:t>
-      </w:r>
-    </w:p>
-    <w:p>
-      <w:pPr>
-        <w:pStyle w:val="ListParagraph"/>
-        <w:numPr>
-          <w:ilvl w:val="3"/>
-          <w:numId w:val="3"/>
-        </w:numPr>
-        <w:spacing w:after="240"/>
-        <w:contextualSpacing w:val="0"/>
-        <w:rPr>
-          <w:rFonts w:ascii="Arial" w:hAnsi="Arial" w:cs="Arial"/>
-        </w:rPr>
-      </w:pPr>
-      <w:r>
-        <w:rPr>
-          <w:rFonts w:ascii="Arial" w:hAnsi="Arial" w:cs="Arial"/>
-        </w:rPr>
-        <w:lastRenderedPageBreak/>
-        <w:t xml:space="preserve">Run </w:t>
-      </w:r>
-      <w:r>
-        <w:rPr>
-          <w:rFonts w:ascii="Arial" w:hAnsi="Arial" w:cs="Arial"/>
-        </w:rPr>
-        <w:t xml:space="preserve">univariate </w:t>
-      </w:r>
-      <w:r>
-        <w:rPr>
-          <w:rFonts w:ascii="Arial" w:hAnsi="Arial" w:cs="Arial"/>
-        </w:rPr>
-        <w:t>DTW</w:t>
-      </w:r>
-      <w:r>
-        <w:rPr>
-          <w:rFonts w:ascii="Arial" w:hAnsi="Arial" w:cs="Arial"/>
-        </w:rPr>
-        <w:t xml:space="preserve"> on the fundamental frequency contours</w:t>
-      </w:r>
-      <w:r>
-        <w:rPr>
-          <w:rFonts w:ascii="Arial" w:hAnsi="Arial" w:cs="Arial"/>
-        </w:rPr>
-        <w:t xml:space="preserve"> using code that Grace has </w:t>
-      </w:r>
-      <w:r>
-        <w:rPr>
-          <w:rFonts w:ascii="Arial" w:hAnsi="Arial" w:cs="Arial"/>
-        </w:rPr>
-        <w:t xml:space="preserve">used with the </w:t>
-      </w:r>
-      <w:proofErr w:type="spellStart"/>
-      <w:r>
-        <w:rPr>
-          <w:rFonts w:ascii="Arial" w:hAnsi="Arial" w:cs="Arial"/>
-        </w:rPr>
-        <w:t>dtw</w:t>
-      </w:r>
-      <w:proofErr w:type="spellEnd"/>
-      <w:r>
-        <w:rPr>
-          <w:rFonts w:ascii="Arial" w:hAnsi="Arial" w:cs="Arial"/>
-        </w:rPr>
-        <w:t xml:space="preserve"> package in R</w:t>
-      </w:r>
-    </w:p>
-    <w:p>
-      <w:pPr>
-        <w:pStyle w:val="ListParagraph"/>
-        <w:numPr>
-          <w:ilvl w:val="3"/>
-          <w:numId w:val="3"/>
-        </w:numPr>
-        <w:spacing w:after="240"/>
-        <w:contextualSpacing w:val="0"/>
-        <w:rPr>
-          <w:rFonts w:ascii="Arial" w:hAnsi="Arial" w:cs="Arial"/>
-        </w:rPr>
-      </w:pPr>
-      <w:r>
-        <w:rPr>
-          <w:rFonts w:ascii="Arial" w:hAnsi="Arial" w:cs="Arial"/>
-        </w:rPr>
-        <w:t>Returns a distance matrix that can be used in downstream analysis</w:t>
-      </w:r>
-    </w:p>
-    <w:p>
-      <w:pPr>
-        <w:pStyle w:val="ListParagraph"/>
-        <w:numPr>
-          <w:ilvl w:val="2"/>
-          <w:numId w:val="3"/>
-        </w:numPr>
-        <w:spacing w:after="240"/>
-        <w:contextualSpacing w:val="0"/>
-        <w:rPr>
-          <w:rFonts w:ascii="Arial" w:hAnsi="Arial" w:cs="Arial"/>
-        </w:rPr>
-      </w:pPr>
-      <w:r>
-        <w:rPr>
-          <w:rFonts w:ascii="Arial" w:hAnsi="Arial" w:cs="Arial"/>
-        </w:rPr>
-        <w:t>Multi-dimensional scaling acoustic space, clustering and Normalized Mutual Information</w:t>
-      </w:r>
-      <w:r>
-        <w:rPr>
-          <w:rFonts w:ascii="Arial" w:hAnsi="Arial" w:cs="Arial"/>
-        </w:rPr>
-        <w:t xml:space="preserve">, </w:t>
-      </w:r>
-      <w:r>
-        <w:rPr>
-          <w:rFonts w:ascii="Arial" w:hAnsi="Arial" w:cs="Arial"/>
-        </w:rPr>
-        <w:t xml:space="preserve">Bayesian hierarchical </w:t>
-      </w:r>
-      <w:r>
-        <w:rPr>
-          <w:rFonts w:ascii="Arial" w:hAnsi="Arial" w:cs="Arial"/>
-        </w:rPr>
-        <w:t>models</w:t>
-      </w:r>
-    </w:p>
-    <w:p>
-      <w:pPr>
-        <w:pStyle w:val="ListParagraph"/>
-        <w:numPr>
-          <w:ilvl w:val="3"/>
-          <w:numId w:val="3"/>
-        </w:numPr>
-        <w:spacing w:after="240"/>
-        <w:contextualSpacing w:val="0"/>
-        <w:rPr>
-          <w:rFonts w:ascii="Arial" w:hAnsi="Arial" w:cs="Arial"/>
-        </w:rPr>
-      </w:pPr>
-      <w:r>
-        <w:rPr>
-          <w:rFonts w:ascii="Arial" w:hAnsi="Arial" w:cs="Arial"/>
-        </w:rPr>
-        <w:t>This part of the pipeline will be really similar to the SPCC pipeline above</w:t>
-      </w:r>
-    </w:p>
-    <w:p>
-      <w:pPr>
-        <w:pStyle w:val="ListParagraph"/>
-        <w:numPr>
-          <w:ilvl w:val="0"/>
-          <w:numId w:val="3"/>
-        </w:numPr>
-        <w:rPr>
-          <w:rFonts w:ascii="Arial" w:hAnsi="Arial" w:cs="Arial"/>
-        </w:rPr>
-      </w:pPr>
-      <w:r>
-        <w:rPr>
-          <w:rFonts w:ascii="Arial" w:hAnsi="Arial" w:cs="Arial"/>
-        </w:rPr>
-        <w:t>Figures:</w:t>
-      </w:r>
-    </w:p>
-    <w:p>
-      <w:pPr>
-        <w:pStyle w:val="ListParagraph"/>
-        <w:numPr>
-          <w:ilvl w:val="1"/>
-          <w:numId w:val="3"/>
-        </w:numPr>
-        <w:rPr>
-          <w:rFonts w:ascii="Arial" w:hAnsi="Arial" w:cs="Arial"/>
-        </w:rPr>
-      </w:pPr>
-      <w:r>
-        <w:rPr>
-          <w:rFonts w:ascii="Arial" w:hAnsi="Arial" w:cs="Arial"/>
-        </w:rPr>
-        <w:t>One plot for each experiment in different “social environments” and NMI at both social levels in the same plot, where does the “switching point” between NMI accuracy at the group and individual level</w:t>
-      </w:r>
-      <w:r>
-        <w:rPr>
-          <w:rFonts w:ascii="Arial" w:hAnsi="Arial" w:cs="Arial"/>
-        </w:rPr>
-        <w:t xml:space="preserve"> occur?</w:t>
-      </w:r>
+        <w:t xml:space="preserve"> variation in convergence within and between categories (individuals, groups) at each social level</w:t>
+      </w:r>
+    </w:p>
+    <w:p>
+      <w:pPr>
+        <w:rPr>
+          <w:rFonts w:ascii="Arial" w:hAnsi="Arial" w:cs="Arial"/>
+        </w:rPr>
+      </w:pPr>
     </w:p>
     <w:sectPr>
       <w:pgSz w:w="12240" w:h="15840"/>
@@ -2365,12 +2637,183 @@
 </w:document>
 </file>
 
+<file path=word/comments.xml><?xml version="1.0" encoding="utf-8"?>
+<w:comments xmlns:wpc="http://schemas.microsoft.com/office/word/2010/wordprocessingCanvas" xmlns:cx="http://schemas.microsoft.com/office/drawing/2014/chartex" xmlns:cx1="http://schemas.microsoft.com/office/drawing/2015/9/8/chartex" xmlns:cx2="http://schemas.microsoft.com/office/drawing/2015/10/21/chartex" xmlns:cx3="http://schemas.microsoft.com/office/drawing/2016/5/9/chartex" xmlns:cx4="http://schemas.microsoft.com/office/drawing/2016/5/10/chartex" xmlns:cx5="http://schemas.microsoft.com/office/drawing/2016/5/11/chartex" xmlns:cx6="http://schemas.microsoft.com/office/drawing/2016/5/12/chartex" xmlns:cx7="http://schemas.microsoft.com/office/drawing/2016/5/13/chartex" xmlns:cx8="http://schemas.microsoft.com/office/drawing/2016/5/14/chartex" xmlns:mc="http://schemas.openxmlformats.org/markup-compatibility/2006" xmlns:aink="http://schemas.microsoft.com/office/drawing/2016/ink" xmlns:am3d="http://schemas.microsoft.com/office/drawing/2017/model3d" xmlns:o="urn:schemas-microsoft-com:office:office" xmlns:oel="http://schemas.microsoft.com/office/2019/extlst" xmlns:r="http://schemas.openxmlformats.org/officeDocument/2006/relationships" xmlns:m="http://schemas.openxmlformats.org/officeDocument/2006/math" xmlns:v="urn:schemas-microsoft-com:vml" xmlns:wp14="http://schemas.microsoft.com/office/word/2010/wordprocessingDrawing" xmlns:wp="http://schemas.openxmlformats.org/drawingml/2006/wordprocessingDrawing" xmlns:w10="urn:schemas-microsoft-com:office:word" xmlns:w="http://schemas.openxmlformats.org/wordprocessingml/2006/main" xmlns:w14="http://schemas.microsoft.com/office/word/2010/wordml" xmlns:w15="http://schemas.microsoft.com/office/word/2012/wordml" xmlns:w16cex="http://schemas.microsoft.com/office/word/2018/wordml/cex" xmlns:w16cid="http://schemas.microsoft.com/office/word/2016/wordml/cid" xmlns:w16="http://schemas.microsoft.com/office/word/2018/wordml" xmlns:w16du="http://schemas.microsoft.com/office/word/2023/wordml/word16du" xmlns:w16sdtdh="http://schemas.microsoft.com/office/word/2020/wordml/sdtdatahash" xmlns:w16se="http://schemas.microsoft.com/office/word/2015/wordml/symex" xmlns:wpg="http://schemas.microsoft.com/office/word/2010/wordprocessingGroup" xmlns:wpi="http://schemas.microsoft.com/office/word/2010/wordprocessingInk" xmlns:wne="http://schemas.microsoft.com/office/word/2006/wordml" xmlns:wps="http://schemas.microsoft.com/office/word/2010/wordprocessingShape" mc:Ignorable="w14 w15 w16se w16cid w16 w16cex w16sdtdh w16du wp14">
+  <w:comment w:id="0" w:author="Coppinger, Brittany" w:date="2024-12-04T11:25:00Z" w:initials="BC">
+    <w:p>
+      <w:pPr>
+        <w:pStyle w:val="CommentText"/>
+      </w:pPr>
+      <w:r>
+        <w:rPr>
+          <w:rStyle w:val="CommentReference"/>
+        </w:rPr>
+        <w:annotationRef/>
+      </w:r>
+      <w:r>
+        <w:t>Need to develop this why more</w:t>
+      </w:r>
+    </w:p>
+  </w:comment>
+  <w:comment w:id="1" w:author="Coppinger, Brittany" w:date="2024-12-04T11:30:00Z" w:initials="BC">
+    <w:p>
+      <w:pPr>
+        <w:pStyle w:val="CommentText"/>
+      </w:pPr>
+      <w:r>
+        <w:rPr>
+          <w:rStyle w:val="CommentReference"/>
+        </w:rPr>
+        <w:annotationRef/>
+      </w:r>
+      <w:r>
+        <w:t>No longer needed with new scope?</w:t>
+      </w:r>
+    </w:p>
+  </w:comment>
+</w:comments>
+</file>
+
+<file path=word/commentsExtended.xml><?xml version="1.0" encoding="utf-8"?>
+<w15:commentsEx xmlns:wpc="http://schemas.microsoft.com/office/word/2010/wordprocessingCanvas" xmlns:cx="http://schemas.microsoft.com/office/drawing/2014/chartex" xmlns:cx1="http://schemas.microsoft.com/office/drawing/2015/9/8/chartex" xmlns:cx2="http://schemas.microsoft.com/office/drawing/2015/10/21/chartex" xmlns:cx3="http://schemas.microsoft.com/office/drawing/2016/5/9/chartex" xmlns:cx4="http://schemas.microsoft.com/office/drawing/2016/5/10/chartex" xmlns:cx5="http://schemas.microsoft.com/office/drawing/2016/5/11/chartex" xmlns:cx6="http://schemas.microsoft.com/office/drawing/2016/5/12/chartex" xmlns:cx7="http://schemas.microsoft.com/office/drawing/2016/5/13/chartex" xmlns:cx8="http://schemas.microsoft.com/office/drawing/2016/5/14/chartex" xmlns:mc="http://schemas.openxmlformats.org/markup-compatibility/2006" xmlns:aink="http://schemas.microsoft.com/office/drawing/2016/ink" xmlns:am3d="http://schemas.microsoft.com/office/drawing/2017/model3d" xmlns:o="urn:schemas-microsoft-com:office:office" xmlns:oel="http://schemas.microsoft.com/office/2019/extlst" xmlns:r="http://schemas.openxmlformats.org/officeDocument/2006/relationships" xmlns:m="http://schemas.openxmlformats.org/officeDocument/2006/math" xmlns:v="urn:schemas-microsoft-com:vml" xmlns:wp14="http://schemas.microsoft.com/office/word/2010/wordprocessingDrawing" xmlns:wp="http://schemas.openxmlformats.org/drawingml/2006/wordprocessingDrawing" xmlns:w10="urn:schemas-microsoft-com:office:word" xmlns:w="http://schemas.openxmlformats.org/wordprocessingml/2006/main" xmlns:w14="http://schemas.microsoft.com/office/word/2010/wordml" xmlns:w15="http://schemas.microsoft.com/office/word/2012/wordml" xmlns:w16cex="http://schemas.microsoft.com/office/word/2018/wordml/cex" xmlns:w16cid="http://schemas.microsoft.com/office/word/2016/wordml/cid" xmlns:w16="http://schemas.microsoft.com/office/word/2018/wordml" xmlns:w16du="http://schemas.microsoft.com/office/word/2023/wordml/word16du" xmlns:w16sdtdh="http://schemas.microsoft.com/office/word/2020/wordml/sdtdatahash" xmlns:w16se="http://schemas.microsoft.com/office/word/2015/wordml/symex" xmlns:wpg="http://schemas.microsoft.com/office/word/2010/wordprocessingGroup" xmlns:wpi="http://schemas.microsoft.com/office/word/2010/wordprocessingInk" xmlns:wne="http://schemas.microsoft.com/office/word/2006/wordml" xmlns:wps="http://schemas.microsoft.com/office/word/2010/wordprocessingShape" mc:Ignorable="w14 w15 w16se w16cid w16 w16cex w16sdtdh w16du wp14">
+  <w15:commentEx w15:paraId="7A6FD0DC" w15:done="0"/>
+  <w15:commentEx w15:paraId="39AD4D06" w15:done="0"/>
+</w15:commentsEx>
+</file>
+
+<file path=word/commentsExtensible.xml><?xml version="1.0" encoding="utf-8"?>
+<w16cex:commentsExtensible xmlns:wpc="http://schemas.microsoft.com/office/word/2010/wordprocessingCanvas" xmlns:cx="http://schemas.microsoft.com/office/drawing/2014/chartex" xmlns:cx1="http://schemas.microsoft.com/office/drawing/2015/9/8/chartex" xmlns:cx2="http://schemas.microsoft.com/office/drawing/2015/10/21/chartex" xmlns:cx3="http://schemas.microsoft.com/office/drawing/2016/5/9/chartex" xmlns:cx4="http://schemas.microsoft.com/office/drawing/2016/5/10/chartex" xmlns:cx5="http://schemas.microsoft.com/office/drawing/2016/5/11/chartex" xmlns:cx6="http://schemas.microsoft.com/office/drawing/2016/5/12/chartex" xmlns:cx7="http://schemas.microsoft.com/office/drawing/2016/5/13/chartex" xmlns:cx8="http://schemas.microsoft.com/office/drawing/2016/5/14/chartex" xmlns:cr="http://schemas.microsoft.com/office/comments/2020/reactions" xmlns:mc="http://schemas.openxmlformats.org/markup-compatibility/2006" xmlns:aink="http://schemas.microsoft.com/office/drawing/2016/ink" xmlns:am3d="http://schemas.microsoft.com/office/drawing/2017/model3d" xmlns:o="urn:schemas-microsoft-com:office:office" xmlns:oel="http://schemas.microsoft.com/office/2019/extlst" xmlns:r="http://schemas.openxmlformats.org/officeDocument/2006/relationships" xmlns:m="http://schemas.openxmlformats.org/officeDocument/2006/math" xmlns:v="urn:schemas-microsoft-com:vml" xmlns:wp14="http://schemas.microsoft.com/office/word/2010/wordprocessingDrawing" xmlns:wp="http://schemas.openxmlformats.org/drawingml/2006/wordprocessingDrawing" xmlns:w10="urn:schemas-microsoft-com:office:word" xmlns:w="http://schemas.openxmlformats.org/wordprocessingml/2006/main" xmlns:w14="http://schemas.microsoft.com/office/word/2010/wordml" xmlns:w15="http://schemas.microsoft.com/office/word/2012/wordml" xmlns:w16cex="http://schemas.microsoft.com/office/word/2018/wordml/cex" xmlns:w16cid="http://schemas.microsoft.com/office/word/2016/wordml/cid" xmlns:w16="http://schemas.microsoft.com/office/word/2018/wordml" xmlns:w16du="http://schemas.microsoft.com/office/word/2023/wordml/word16du" xmlns:w16sdtdh="http://schemas.microsoft.com/office/word/2020/wordml/sdtdatahash" xmlns:w16se="http://schemas.microsoft.com/office/word/2015/wordml/symex" xmlns:wpg="http://schemas.microsoft.com/office/word/2010/wordprocessingGroup" xmlns:wpi="http://schemas.microsoft.com/office/word/2010/wordprocessingInk" xmlns:wne="http://schemas.microsoft.com/office/word/2006/wordml" xmlns:wps="http://schemas.microsoft.com/office/word/2010/wordprocessingShape" mc:Ignorable="w14 w15 w16se w16cid w16 w16cex w16sdtdh cr w16du wp14">
+  <w16cex:commentExtensible w16cex:durableId="0D098405" w16cex:dateUtc="2024-12-04T16:25:00Z"/>
+  <w16cex:commentExtensible w16cex:durableId="59C03562" w16cex:dateUtc="2024-12-04T16:30:00Z"/>
+</w16cex:commentsExtensible>
+</file>
+
+<file path=word/commentsIds.xml><?xml version="1.0" encoding="utf-8"?>
+<w16cid:commentsIds xmlns:wpc="http://schemas.microsoft.com/office/word/2010/wordprocessingCanvas" xmlns:cx="http://schemas.microsoft.com/office/drawing/2014/chartex" xmlns:cx1="http://schemas.microsoft.com/office/drawing/2015/9/8/chartex" xmlns:cx2="http://schemas.microsoft.com/office/drawing/2015/10/21/chartex" xmlns:cx3="http://schemas.microsoft.com/office/drawing/2016/5/9/chartex" xmlns:cx4="http://schemas.microsoft.com/office/drawing/2016/5/10/chartex" xmlns:cx5="http://schemas.microsoft.com/office/drawing/2016/5/11/chartex" xmlns:cx6="http://schemas.microsoft.com/office/drawing/2016/5/12/chartex" xmlns:cx7="http://schemas.microsoft.com/office/drawing/2016/5/13/chartex" xmlns:cx8="http://schemas.microsoft.com/office/drawing/2016/5/14/chartex" xmlns:mc="http://schemas.openxmlformats.org/markup-compatibility/2006" xmlns:aink="http://schemas.microsoft.com/office/drawing/2016/ink" xmlns:am3d="http://schemas.microsoft.com/office/drawing/2017/model3d" xmlns:o="urn:schemas-microsoft-com:office:office" xmlns:oel="http://schemas.microsoft.com/office/2019/extlst" xmlns:r="http://schemas.openxmlformats.org/officeDocument/2006/relationships" xmlns:m="http://schemas.openxmlformats.org/officeDocument/2006/math" xmlns:v="urn:schemas-microsoft-com:vml" xmlns:wp14="http://schemas.microsoft.com/office/word/2010/wordprocessingDrawing" xmlns:wp="http://schemas.openxmlformats.org/drawingml/2006/wordprocessingDrawing" xmlns:w10="urn:schemas-microsoft-com:office:word" xmlns:w="http://schemas.openxmlformats.org/wordprocessingml/2006/main" xmlns:w14="http://schemas.microsoft.com/office/word/2010/wordml" xmlns:w15="http://schemas.microsoft.com/office/word/2012/wordml" xmlns:w16cex="http://schemas.microsoft.com/office/word/2018/wordml/cex" xmlns:w16cid="http://schemas.microsoft.com/office/word/2016/wordml/cid" xmlns:w16="http://schemas.microsoft.com/office/word/2018/wordml" xmlns:w16du="http://schemas.microsoft.com/office/word/2023/wordml/word16du" xmlns:w16sdtdh="http://schemas.microsoft.com/office/word/2020/wordml/sdtdatahash" xmlns:w16se="http://schemas.microsoft.com/office/word/2015/wordml/symex" xmlns:wpg="http://schemas.microsoft.com/office/word/2010/wordprocessingGroup" xmlns:wpi="http://schemas.microsoft.com/office/word/2010/wordprocessingInk" xmlns:wne="http://schemas.microsoft.com/office/word/2006/wordml" xmlns:wps="http://schemas.microsoft.com/office/word/2010/wordprocessingShape" mc:Ignorable="w14 w15 w16se w16cid w16 w16cex w16sdtdh w16du wp14">
+  <w16cid:commentId w16cid:paraId="7A6FD0DC" w16cid:durableId="0D098405"/>
+  <w16cid:commentId w16cid:paraId="39AD4D06" w16cid:durableId="59C03562"/>
+</w16cid:commentsIds>
+</file>
+
 <file path=word/numbering.xml><?xml version="1.0" encoding="utf-8"?>
 <w:numbering xmlns:wpc="http://schemas.microsoft.com/office/word/2010/wordprocessingCanvas" xmlns:cx="http://schemas.microsoft.com/office/drawing/2014/chartex" xmlns:cx1="http://schemas.microsoft.com/office/drawing/2015/9/8/chartex" xmlns:cx2="http://schemas.microsoft.com/office/drawing/2015/10/21/chartex" xmlns:cx3="http://schemas.microsoft.com/office/drawing/2016/5/9/chartex" xmlns:cx4="http://schemas.microsoft.com/office/drawing/2016/5/10/chartex" xmlns:cx5="http://schemas.microsoft.com/office/drawing/2016/5/11/chartex" xmlns:cx6="http://schemas.microsoft.com/office/drawing/2016/5/12/chartex" xmlns:cx7="http://schemas.microsoft.com/office/drawing/2016/5/13/chartex" xmlns:cx8="http://schemas.microsoft.com/office/drawing/2016/5/14/chartex" xmlns:mc="http://schemas.openxmlformats.org/markup-compatibility/2006" xmlns:aink="http://schemas.microsoft.com/office/drawing/2016/ink" xmlns:am3d="http://schemas.microsoft.com/office/drawing/2017/model3d" xmlns:o="urn:schemas-microsoft-com:office:office" xmlns:oel="http://schemas.microsoft.com/office/2019/extlst" xmlns:r="http://schemas.openxmlformats.org/officeDocument/2006/relationships" xmlns:m="http://schemas.openxmlformats.org/officeDocument/2006/math" xmlns:v="urn:schemas-microsoft-com:vml" xmlns:wp14="http://schemas.microsoft.com/office/word/2010/wordprocessingDrawing" xmlns:wp="http://schemas.openxmlformats.org/drawingml/2006/wordprocessingDrawing" xmlns:w10="urn:schemas-microsoft-com:office:word" xmlns:w="http://schemas.openxmlformats.org/wordprocessingml/2006/main" xmlns:w14="http://schemas.microsoft.com/office/word/2010/wordml" xmlns:w15="http://schemas.microsoft.com/office/word/2012/wordml" xmlns:w16cex="http://schemas.microsoft.com/office/word/2018/wordml/cex" xmlns:w16cid="http://schemas.microsoft.com/office/word/2016/wordml/cid" xmlns:w16="http://schemas.microsoft.com/office/word/2018/wordml" xmlns:w16du="http://schemas.microsoft.com/office/word/2023/wordml/word16du" xmlns:w16sdtdh="http://schemas.microsoft.com/office/word/2020/wordml/sdtdatahash" xmlns:w16se="http://schemas.microsoft.com/office/word/2015/wordml/symex" xmlns:wpg="http://schemas.microsoft.com/office/word/2010/wordprocessingGroup" xmlns:wpi="http://schemas.microsoft.com/office/word/2010/wordprocessingInk" xmlns:wne="http://schemas.microsoft.com/office/word/2006/wordml" xmlns:wps="http://schemas.microsoft.com/office/word/2010/wordprocessingShape" mc:Ignorable="w14 w15 w16se w16cid w16 w16cex w16sdtdh w16du wp14">
   <w:abstractNum w:abstractNumId="0" w15:restartNumberingAfterBreak="0">
+    <w:nsid w:val="1DDF1BF4"/>
+    <w:multiLevelType w:val="hybridMultilevel"/>
+    <w:tmpl w:val="1C66CDB8"/>
+    <w:lvl w:ilvl="0" w:tplc="04090001">
+      <w:start w:val="1"/>
+      <w:numFmt w:val="bullet"/>
+      <w:lvlText w:val=""/>
+      <w:lvlJc w:val="left"/>
+      <w:pPr>
+        <w:ind w:left="720" w:hanging="360"/>
+      </w:pPr>
+      <w:rPr>
+        <w:rFonts w:ascii="Symbol" w:hAnsi="Symbol" w:hint="default"/>
+      </w:rPr>
+    </w:lvl>
+    <w:lvl w:ilvl="1" w:tplc="04090003">
+      <w:start w:val="1"/>
+      <w:numFmt w:val="bullet"/>
+      <w:lvlText w:val="o"/>
+      <w:lvlJc w:val="left"/>
+      <w:pPr>
+        <w:ind w:left="1440" w:hanging="360"/>
+      </w:pPr>
+      <w:rPr>
+        <w:rFonts w:ascii="Courier New" w:hAnsi="Courier New" w:cs="Courier New" w:hint="default"/>
+      </w:rPr>
+    </w:lvl>
+    <w:lvl w:ilvl="2" w:tplc="04090005" w:tentative="1">
+      <w:start w:val="1"/>
+      <w:numFmt w:val="bullet"/>
+      <w:lvlText w:val=""/>
+      <w:lvlJc w:val="left"/>
+      <w:pPr>
+        <w:ind w:left="2160" w:hanging="360"/>
+      </w:pPr>
+      <w:rPr>
+        <w:rFonts w:ascii="Wingdings" w:hAnsi="Wingdings" w:hint="default"/>
+      </w:rPr>
+    </w:lvl>
+    <w:lvl w:ilvl="3" w:tplc="04090001" w:tentative="1">
+      <w:start w:val="1"/>
+      <w:numFmt w:val="bullet"/>
+      <w:lvlText w:val=""/>
+      <w:lvlJc w:val="left"/>
+      <w:pPr>
+        <w:ind w:left="2880" w:hanging="360"/>
+      </w:pPr>
+      <w:rPr>
+        <w:rFonts w:ascii="Symbol" w:hAnsi="Symbol" w:hint="default"/>
+      </w:rPr>
+    </w:lvl>
+    <w:lvl w:ilvl="4" w:tplc="04090003" w:tentative="1">
+      <w:start w:val="1"/>
+      <w:numFmt w:val="bullet"/>
+      <w:lvlText w:val="o"/>
+      <w:lvlJc w:val="left"/>
+      <w:pPr>
+        <w:ind w:left="3600" w:hanging="360"/>
+      </w:pPr>
+      <w:rPr>
+        <w:rFonts w:ascii="Courier New" w:hAnsi="Courier New" w:cs="Courier New" w:hint="default"/>
+      </w:rPr>
+    </w:lvl>
+    <w:lvl w:ilvl="5" w:tplc="04090005" w:tentative="1">
+      <w:start w:val="1"/>
+      <w:numFmt w:val="bullet"/>
+      <w:lvlText w:val=""/>
+      <w:lvlJc w:val="left"/>
+      <w:pPr>
+        <w:ind w:left="4320" w:hanging="360"/>
+      </w:pPr>
+      <w:rPr>
+        <w:rFonts w:ascii="Wingdings" w:hAnsi="Wingdings" w:hint="default"/>
+      </w:rPr>
+    </w:lvl>
+    <w:lvl w:ilvl="6" w:tplc="04090001" w:tentative="1">
+      <w:start w:val="1"/>
+      <w:numFmt w:val="bullet"/>
+      <w:lvlText w:val=""/>
+      <w:lvlJc w:val="left"/>
+      <w:pPr>
+        <w:ind w:left="5040" w:hanging="360"/>
+      </w:pPr>
+      <w:rPr>
+        <w:rFonts w:ascii="Symbol" w:hAnsi="Symbol" w:hint="default"/>
+      </w:rPr>
+    </w:lvl>
+    <w:lvl w:ilvl="7" w:tplc="04090003" w:tentative="1">
+      <w:start w:val="1"/>
+      <w:numFmt w:val="bullet"/>
+      <w:lvlText w:val="o"/>
+      <w:lvlJc w:val="left"/>
+      <w:pPr>
+        <w:ind w:left="5760" w:hanging="360"/>
+      </w:pPr>
+      <w:rPr>
+        <w:rFonts w:ascii="Courier New" w:hAnsi="Courier New" w:cs="Courier New" w:hint="default"/>
+      </w:rPr>
+    </w:lvl>
+    <w:lvl w:ilvl="8" w:tplc="04090005" w:tentative="1">
+      <w:start w:val="1"/>
+      <w:numFmt w:val="bullet"/>
+      <w:lvlText w:val=""/>
+      <w:lvlJc w:val="left"/>
+      <w:pPr>
+        <w:ind w:left="6480" w:hanging="360"/>
+      </w:pPr>
+      <w:rPr>
+        <w:rFonts w:ascii="Wingdings" w:hAnsi="Wingdings" w:hint="default"/>
+      </w:rPr>
+    </w:lvl>
+  </w:abstractNum>
+  <w:abstractNum w:abstractNumId="1" w15:restartNumberingAfterBreak="0">
     <w:nsid w:val="2F5D2CA7"/>
     <w:multiLevelType w:val="hybridMultilevel"/>
-    <w:tmpl w:val="35BAADC0"/>
+    <w:tmpl w:val="CC288E5E"/>
     <w:lvl w:ilvl="0" w:tplc="0409000F">
       <w:start w:val="1"/>
       <w:numFmt w:val="decimal"/>
@@ -2383,16 +2826,19 @@
         <w:rFonts w:hint="default"/>
       </w:rPr>
     </w:lvl>
-    <w:lvl w:ilvl="1" w:tplc="04090019">
-      <w:start w:val="1"/>
-      <w:numFmt w:val="lowerLetter"/>
-      <w:lvlText w:val="%2."/>
+    <w:lvl w:ilvl="1" w:tplc="04090001">
+      <w:start w:val="1"/>
+      <w:numFmt w:val="bullet"/>
+      <w:lvlText w:val=""/>
       <w:lvlJc w:val="left"/>
       <w:pPr>
         <w:ind w:left="1440" w:hanging="360"/>
       </w:pPr>
-    </w:lvl>
-    <w:lvl w:ilvl="2" w:tplc="0409001B" w:tentative="1">
+      <w:rPr>
+        <w:rFonts w:ascii="Symbol" w:hAnsi="Symbol" w:hint="default"/>
+      </w:rPr>
+    </w:lvl>
+    <w:lvl w:ilvl="2" w:tplc="0409001B">
       <w:start w:val="1"/>
       <w:numFmt w:val="lowerRoman"/>
       <w:lvlText w:val="%3."/>
@@ -2456,7 +2902,7 @@
       </w:pPr>
     </w:lvl>
   </w:abstractNum>
-  <w:abstractNum w:abstractNumId="1" w15:restartNumberingAfterBreak="0">
+  <w:abstractNum w:abstractNumId="2" w15:restartNumberingAfterBreak="0">
     <w:nsid w:val="369A006E"/>
     <w:multiLevelType w:val="hybridMultilevel"/>
     <w:tmpl w:val="C15807F0"/>
@@ -2545,7 +2991,7 @@
       </w:pPr>
     </w:lvl>
   </w:abstractNum>
-  <w:abstractNum w:abstractNumId="2" w15:restartNumberingAfterBreak="0">
+  <w:abstractNum w:abstractNumId="3" w15:restartNumberingAfterBreak="0">
     <w:nsid w:val="394B33D4"/>
     <w:multiLevelType w:val="hybridMultilevel"/>
     <w:tmpl w:val="15B886D8"/>
@@ -2634,16 +3080,259 @@
       </w:pPr>
     </w:lvl>
   </w:abstractNum>
+  <w:abstractNum w:abstractNumId="4" w15:restartNumberingAfterBreak="0">
+    <w:nsid w:val="75A93002"/>
+    <w:multiLevelType w:val="hybridMultilevel"/>
+    <w:tmpl w:val="E890953C"/>
+    <w:lvl w:ilvl="0" w:tplc="04090001">
+      <w:start w:val="1"/>
+      <w:numFmt w:val="bullet"/>
+      <w:lvlText w:val=""/>
+      <w:lvlJc w:val="left"/>
+      <w:pPr>
+        <w:ind w:left="1446" w:hanging="360"/>
+      </w:pPr>
+      <w:rPr>
+        <w:rFonts w:ascii="Symbol" w:hAnsi="Symbol" w:hint="default"/>
+      </w:rPr>
+    </w:lvl>
+    <w:lvl w:ilvl="1" w:tplc="04090003" w:tentative="1">
+      <w:start w:val="1"/>
+      <w:numFmt w:val="bullet"/>
+      <w:lvlText w:val="o"/>
+      <w:lvlJc w:val="left"/>
+      <w:pPr>
+        <w:ind w:left="2166" w:hanging="360"/>
+      </w:pPr>
+      <w:rPr>
+        <w:rFonts w:ascii="Courier New" w:hAnsi="Courier New" w:cs="Courier New" w:hint="default"/>
+      </w:rPr>
+    </w:lvl>
+    <w:lvl w:ilvl="2" w:tplc="04090005" w:tentative="1">
+      <w:start w:val="1"/>
+      <w:numFmt w:val="bullet"/>
+      <w:lvlText w:val=""/>
+      <w:lvlJc w:val="left"/>
+      <w:pPr>
+        <w:ind w:left="2886" w:hanging="360"/>
+      </w:pPr>
+      <w:rPr>
+        <w:rFonts w:ascii="Wingdings" w:hAnsi="Wingdings" w:hint="default"/>
+      </w:rPr>
+    </w:lvl>
+    <w:lvl w:ilvl="3" w:tplc="04090001" w:tentative="1">
+      <w:start w:val="1"/>
+      <w:numFmt w:val="bullet"/>
+      <w:lvlText w:val=""/>
+      <w:lvlJc w:val="left"/>
+      <w:pPr>
+        <w:ind w:left="3606" w:hanging="360"/>
+      </w:pPr>
+      <w:rPr>
+        <w:rFonts w:ascii="Symbol" w:hAnsi="Symbol" w:hint="default"/>
+      </w:rPr>
+    </w:lvl>
+    <w:lvl w:ilvl="4" w:tplc="04090003" w:tentative="1">
+      <w:start w:val="1"/>
+      <w:numFmt w:val="bullet"/>
+      <w:lvlText w:val="o"/>
+      <w:lvlJc w:val="left"/>
+      <w:pPr>
+        <w:ind w:left="4326" w:hanging="360"/>
+      </w:pPr>
+      <w:rPr>
+        <w:rFonts w:ascii="Courier New" w:hAnsi="Courier New" w:cs="Courier New" w:hint="default"/>
+      </w:rPr>
+    </w:lvl>
+    <w:lvl w:ilvl="5" w:tplc="04090005" w:tentative="1">
+      <w:start w:val="1"/>
+      <w:numFmt w:val="bullet"/>
+      <w:lvlText w:val=""/>
+      <w:lvlJc w:val="left"/>
+      <w:pPr>
+        <w:ind w:left="5046" w:hanging="360"/>
+      </w:pPr>
+      <w:rPr>
+        <w:rFonts w:ascii="Wingdings" w:hAnsi="Wingdings" w:hint="default"/>
+      </w:rPr>
+    </w:lvl>
+    <w:lvl w:ilvl="6" w:tplc="04090001" w:tentative="1">
+      <w:start w:val="1"/>
+      <w:numFmt w:val="bullet"/>
+      <w:lvlText w:val=""/>
+      <w:lvlJc w:val="left"/>
+      <w:pPr>
+        <w:ind w:left="5766" w:hanging="360"/>
+      </w:pPr>
+      <w:rPr>
+        <w:rFonts w:ascii="Symbol" w:hAnsi="Symbol" w:hint="default"/>
+      </w:rPr>
+    </w:lvl>
+    <w:lvl w:ilvl="7" w:tplc="04090003" w:tentative="1">
+      <w:start w:val="1"/>
+      <w:numFmt w:val="bullet"/>
+      <w:lvlText w:val="o"/>
+      <w:lvlJc w:val="left"/>
+      <w:pPr>
+        <w:ind w:left="6486" w:hanging="360"/>
+      </w:pPr>
+      <w:rPr>
+        <w:rFonts w:ascii="Courier New" w:hAnsi="Courier New" w:cs="Courier New" w:hint="default"/>
+      </w:rPr>
+    </w:lvl>
+    <w:lvl w:ilvl="8" w:tplc="04090005" w:tentative="1">
+      <w:start w:val="1"/>
+      <w:numFmt w:val="bullet"/>
+      <w:lvlText w:val=""/>
+      <w:lvlJc w:val="left"/>
+      <w:pPr>
+        <w:ind w:left="7206" w:hanging="360"/>
+      </w:pPr>
+      <w:rPr>
+        <w:rFonts w:ascii="Wingdings" w:hAnsi="Wingdings" w:hint="default"/>
+      </w:rPr>
+    </w:lvl>
+  </w:abstractNum>
+  <w:abstractNum w:abstractNumId="5" w15:restartNumberingAfterBreak="0">
+    <w:nsid w:val="788676DB"/>
+    <w:multiLevelType w:val="hybridMultilevel"/>
+    <w:tmpl w:val="FA6CAE92"/>
+    <w:lvl w:ilvl="0" w:tplc="04090001">
+      <w:start w:val="1"/>
+      <w:numFmt w:val="bullet"/>
+      <w:lvlText w:val=""/>
+      <w:lvlJc w:val="left"/>
+      <w:pPr>
+        <w:ind w:left="720" w:hanging="360"/>
+      </w:pPr>
+      <w:rPr>
+        <w:rFonts w:ascii="Symbol" w:hAnsi="Symbol" w:hint="default"/>
+      </w:rPr>
+    </w:lvl>
+    <w:lvl w:ilvl="1" w:tplc="04090003" w:tentative="1">
+      <w:start w:val="1"/>
+      <w:numFmt w:val="bullet"/>
+      <w:lvlText w:val="o"/>
+      <w:lvlJc w:val="left"/>
+      <w:pPr>
+        <w:ind w:left="1440" w:hanging="360"/>
+      </w:pPr>
+      <w:rPr>
+        <w:rFonts w:ascii="Courier New" w:hAnsi="Courier New" w:cs="Courier New" w:hint="default"/>
+      </w:rPr>
+    </w:lvl>
+    <w:lvl w:ilvl="2" w:tplc="04090005" w:tentative="1">
+      <w:start w:val="1"/>
+      <w:numFmt w:val="bullet"/>
+      <w:lvlText w:val=""/>
+      <w:lvlJc w:val="left"/>
+      <w:pPr>
+        <w:ind w:left="2160" w:hanging="360"/>
+      </w:pPr>
+      <w:rPr>
+        <w:rFonts w:ascii="Wingdings" w:hAnsi="Wingdings" w:hint="default"/>
+      </w:rPr>
+    </w:lvl>
+    <w:lvl w:ilvl="3" w:tplc="04090001" w:tentative="1">
+      <w:start w:val="1"/>
+      <w:numFmt w:val="bullet"/>
+      <w:lvlText w:val=""/>
+      <w:lvlJc w:val="left"/>
+      <w:pPr>
+        <w:ind w:left="2880" w:hanging="360"/>
+      </w:pPr>
+      <w:rPr>
+        <w:rFonts w:ascii="Symbol" w:hAnsi="Symbol" w:hint="default"/>
+      </w:rPr>
+    </w:lvl>
+    <w:lvl w:ilvl="4" w:tplc="04090003" w:tentative="1">
+      <w:start w:val="1"/>
+      <w:numFmt w:val="bullet"/>
+      <w:lvlText w:val="o"/>
+      <w:lvlJc w:val="left"/>
+      <w:pPr>
+        <w:ind w:left="3600" w:hanging="360"/>
+      </w:pPr>
+      <w:rPr>
+        <w:rFonts w:ascii="Courier New" w:hAnsi="Courier New" w:cs="Courier New" w:hint="default"/>
+      </w:rPr>
+    </w:lvl>
+    <w:lvl w:ilvl="5" w:tplc="04090005" w:tentative="1">
+      <w:start w:val="1"/>
+      <w:numFmt w:val="bullet"/>
+      <w:lvlText w:val=""/>
+      <w:lvlJc w:val="left"/>
+      <w:pPr>
+        <w:ind w:left="4320" w:hanging="360"/>
+      </w:pPr>
+      <w:rPr>
+        <w:rFonts w:ascii="Wingdings" w:hAnsi="Wingdings" w:hint="default"/>
+      </w:rPr>
+    </w:lvl>
+    <w:lvl w:ilvl="6" w:tplc="04090001" w:tentative="1">
+      <w:start w:val="1"/>
+      <w:numFmt w:val="bullet"/>
+      <w:lvlText w:val=""/>
+      <w:lvlJc w:val="left"/>
+      <w:pPr>
+        <w:ind w:left="5040" w:hanging="360"/>
+      </w:pPr>
+      <w:rPr>
+        <w:rFonts w:ascii="Symbol" w:hAnsi="Symbol" w:hint="default"/>
+      </w:rPr>
+    </w:lvl>
+    <w:lvl w:ilvl="7" w:tplc="04090003" w:tentative="1">
+      <w:start w:val="1"/>
+      <w:numFmt w:val="bullet"/>
+      <w:lvlText w:val="o"/>
+      <w:lvlJc w:val="left"/>
+      <w:pPr>
+        <w:ind w:left="5760" w:hanging="360"/>
+      </w:pPr>
+      <w:rPr>
+        <w:rFonts w:ascii="Courier New" w:hAnsi="Courier New" w:cs="Courier New" w:hint="default"/>
+      </w:rPr>
+    </w:lvl>
+    <w:lvl w:ilvl="8" w:tplc="04090005" w:tentative="1">
+      <w:start w:val="1"/>
+      <w:numFmt w:val="bullet"/>
+      <w:lvlText w:val=""/>
+      <w:lvlJc w:val="left"/>
+      <w:pPr>
+        <w:ind w:left="6480" w:hanging="360"/>
+      </w:pPr>
+      <w:rPr>
+        <w:rFonts w:ascii="Wingdings" w:hAnsi="Wingdings" w:hint="default"/>
+      </w:rPr>
+    </w:lvl>
+  </w:abstractNum>
   <w:num w:numId="1" w16cid:durableId="1660646443">
+    <w:abstractNumId w:val="2"/>
+  </w:num>
+  <w:num w:numId="2" w16cid:durableId="650646282">
     <w:abstractNumId w:val="1"/>
   </w:num>
-  <w:num w:numId="2" w16cid:durableId="650646282">
+  <w:num w:numId="3" w16cid:durableId="1029796945">
+    <w:abstractNumId w:val="3"/>
+  </w:num>
+  <w:num w:numId="4" w16cid:durableId="1992362874">
+    <w:abstractNumId w:val="4"/>
+  </w:num>
+  <w:num w:numId="5" w16cid:durableId="1282037254">
+    <w:abstractNumId w:val="5"/>
+  </w:num>
+  <w:num w:numId="6" w16cid:durableId="809594277">
     <w:abstractNumId w:val="0"/>
   </w:num>
-  <w:num w:numId="3" w16cid:durableId="1029796945">
-    <w:abstractNumId w:val="2"/>
-  </w:num>
 </w:numbering>
+</file>
+
+<file path=word/people.xml><?xml version="1.0" encoding="utf-8"?>
+<w15:people xmlns:wpc="http://schemas.microsoft.com/office/word/2010/wordprocessingCanvas" xmlns:cx="http://schemas.microsoft.com/office/drawing/2014/chartex" xmlns:cx1="http://schemas.microsoft.com/office/drawing/2015/9/8/chartex" xmlns:cx2="http://schemas.microsoft.com/office/drawing/2015/10/21/chartex" xmlns:cx3="http://schemas.microsoft.com/office/drawing/2016/5/9/chartex" xmlns:cx4="http://schemas.microsoft.com/office/drawing/2016/5/10/chartex" xmlns:cx5="http://schemas.microsoft.com/office/drawing/2016/5/11/chartex" xmlns:cx6="http://schemas.microsoft.com/office/drawing/2016/5/12/chartex" xmlns:cx7="http://schemas.microsoft.com/office/drawing/2016/5/13/chartex" xmlns:cx8="http://schemas.microsoft.com/office/drawing/2016/5/14/chartex" xmlns:mc="http://schemas.openxmlformats.org/markup-compatibility/2006" xmlns:aink="http://schemas.microsoft.com/office/drawing/2016/ink" xmlns:am3d="http://schemas.microsoft.com/office/drawing/2017/model3d" xmlns:o="urn:schemas-microsoft-com:office:office" xmlns:oel="http://schemas.microsoft.com/office/2019/extlst" xmlns:r="http://schemas.openxmlformats.org/officeDocument/2006/relationships" xmlns:m="http://schemas.openxmlformats.org/officeDocument/2006/math" xmlns:v="urn:schemas-microsoft-com:vml" xmlns:wp14="http://schemas.microsoft.com/office/word/2010/wordprocessingDrawing" xmlns:wp="http://schemas.openxmlformats.org/drawingml/2006/wordprocessingDrawing" xmlns:w10="urn:schemas-microsoft-com:office:word" xmlns:w="http://schemas.openxmlformats.org/wordprocessingml/2006/main" xmlns:w14="http://schemas.microsoft.com/office/word/2010/wordml" xmlns:w15="http://schemas.microsoft.com/office/word/2012/wordml" xmlns:w16cex="http://schemas.microsoft.com/office/word/2018/wordml/cex" xmlns:w16cid="http://schemas.microsoft.com/office/word/2016/wordml/cid" xmlns:w16="http://schemas.microsoft.com/office/word/2018/wordml" xmlns:w16du="http://schemas.microsoft.com/office/word/2023/wordml/word16du" xmlns:w16sdtdh="http://schemas.microsoft.com/office/word/2020/wordml/sdtdatahash" xmlns:w16se="http://schemas.microsoft.com/office/word/2015/wordml/symex" xmlns:wpg="http://schemas.microsoft.com/office/word/2010/wordprocessingGroup" xmlns:wpi="http://schemas.microsoft.com/office/word/2010/wordprocessingInk" xmlns:wne="http://schemas.microsoft.com/office/word/2006/wordml" xmlns:wps="http://schemas.microsoft.com/office/word/2010/wordprocessingShape" mc:Ignorable="w14 w15 w16se w16cid w16 w16cex w16sdtdh w16du wp14">
+  <w15:person w15:author="Coppinger, Brittany">
+    <w15:presenceInfo w15:providerId="AD" w15:userId="S::copping7@msu.edu::91362ca3-4f6d-449f-8348-5f9a1531276e"/>
+  </w15:person>
+</w15:people>
 </file>
 
 <file path=word/styles.xml><?xml version="1.0" encoding="utf-8"?>
@@ -3600,6 +4289,69 @@
       <w:shd w:val="clear" w:color="auto" w:fill="E1DFDD"/>
     </w:rPr>
   </w:style>
+  <w:style w:type="character" w:styleId="CommentReference">
+    <w:name w:val="annotation reference"/>
+    <w:basedOn w:val="DefaultParagraphFont"/>
+    <w:uiPriority w:val="99"/>
+    <w:semiHidden/>
+    <w:unhideWhenUsed/>
+    <w:rsid w:val="00A931F0"/>
+    <w:rPr>
+      <w:sz w:val="16"/>
+      <w:szCs w:val="16"/>
+    </w:rPr>
+  </w:style>
+  <w:style w:type="paragraph" w:styleId="CommentText">
+    <w:name w:val="annotation text"/>
+    <w:basedOn w:val="Normal"/>
+    <w:link w:val="CommentTextChar"/>
+    <w:uiPriority w:val="99"/>
+    <w:unhideWhenUsed/>
+    <w:rsid w:val="00A931F0"/>
+    <w:rPr>
+      <w:sz w:val="20"/>
+      <w:szCs w:val="20"/>
+    </w:rPr>
+  </w:style>
+  <w:style w:type="character" w:customStyle="1" w:styleId="CommentTextChar">
+    <w:name w:val="Comment Text Char"/>
+    <w:basedOn w:val="DefaultParagraphFont"/>
+    <w:link w:val="CommentText"/>
+    <w:uiPriority w:val="99"/>
+    <w:rsid w:val="00A931F0"/>
+    <w:rPr>
+      <w:sz w:val="20"/>
+      <w:szCs w:val="20"/>
+    </w:rPr>
+  </w:style>
+  <w:style w:type="paragraph" w:styleId="CommentSubject">
+    <w:name w:val="annotation subject"/>
+    <w:basedOn w:val="CommentText"/>
+    <w:next w:val="CommentText"/>
+    <w:link w:val="CommentSubjectChar"/>
+    <w:uiPriority w:val="99"/>
+    <w:semiHidden/>
+    <w:unhideWhenUsed/>
+    <w:rsid w:val="00A931F0"/>
+    <w:rPr>
+      <w:b/>
+      <w:bCs/>
+    </w:rPr>
+  </w:style>
+  <w:style w:type="character" w:customStyle="1" w:styleId="CommentSubjectChar">
+    <w:name w:val="Comment Subject Char"/>
+    <w:basedOn w:val="CommentTextChar"/>
+    <w:link w:val="CommentSubject"/>
+    <w:uiPriority w:val="99"/>
+    <w:semiHidden/>
+    <w:rsid w:val="00A931F0"/>
+    <w:rPr>
+      <w:b/>
+      <w:bCs/>
+      <w:sz w:val="20"/>
+      <w:szCs w:val="20"/>
+    </w:rPr>
+  </w:style>
 </w:styles>
 </file>
 

</xml_diff>

<commit_message>
Intro topic sentences draft, very rough
</commit_message>
<xml_diff>
--- a/paRsynth_methods_draft.docx
+++ b/paRsynth_methods_draft.docx
@@ -1079,6 +1079,488 @@
       <w:r>
         <w:rPr>
           <w:rFonts w:ascii="Arial" w:hAnsi="Arial" w:cs="Arial"/>
+        </w:rPr>
+        <w:t>Intro:</w:t>
+      </w:r>
+      <w:r>
+        <w:rPr>
+          <w:rFonts w:ascii="Arial" w:hAnsi="Arial" w:cs="Arial"/>
+        </w:rPr>
+        <w:t xml:space="preserve"> </w:t>
+      </w:r>
+      <w:r>
+        <w:rPr>
+          <w:rFonts w:ascii="Arial" w:hAnsi="Arial" w:cs="Arial"/>
+        </w:rPr>
+        <w:t xml:space="preserve">Animals can flexibly encode information about individual identities and social affiliations in learned vocal signals, which may be critically important </w:t>
+      </w:r>
+      <w:r>
+        <w:rPr>
+          <w:rFonts w:ascii="Arial" w:hAnsi="Arial" w:cs="Arial"/>
+        </w:rPr>
+        <w:t>for navigating complex social environments</w:t>
+      </w:r>
+      <w:r>
+        <w:rPr>
+          <w:rFonts w:ascii="Arial" w:hAnsi="Arial" w:cs="Arial"/>
+        </w:rPr>
+        <w:t>.</w:t>
+      </w:r>
+    </w:p>
+    <w:p>
+      <w:pPr>
+        <w:rPr>
+          <w:rFonts w:ascii="Arial" w:hAnsi="Arial" w:cs="Arial"/>
+        </w:rPr>
+      </w:pPr>
+    </w:p>
+    <w:p>
+      <w:pPr>
+        <w:rPr>
+          <w:rFonts w:ascii="Arial" w:hAnsi="Arial" w:cs="Arial"/>
+        </w:rPr>
+      </w:pPr>
+      <w:r>
+        <w:rPr>
+          <w:rFonts w:ascii="Arial" w:hAnsi="Arial" w:cs="Arial"/>
+        </w:rPr>
+        <w:t>BABY:</w:t>
+      </w:r>
+      <w:r>
+        <w:rPr>
+          <w:rFonts w:ascii="Arial" w:hAnsi="Arial" w:cs="Arial"/>
+        </w:rPr>
+        <w:t xml:space="preserve"> </w:t>
+      </w:r>
+      <w:r>
+        <w:rPr>
+          <w:rFonts w:ascii="Arial" w:hAnsi="Arial" w:cs="Arial"/>
+        </w:rPr>
+        <w:t xml:space="preserve">The information that animals </w:t>
+      </w:r>
+      <w:r>
+        <w:rPr>
+          <w:rFonts w:ascii="Arial" w:hAnsi="Arial" w:cs="Arial"/>
+        </w:rPr>
+        <w:t>encode in learned vocal signals should scale with the complexity of their social environment</w:t>
+      </w:r>
+      <w:r>
+        <w:rPr>
+          <w:rFonts w:ascii="Arial" w:hAnsi="Arial" w:cs="Arial"/>
+        </w:rPr>
+        <w:t xml:space="preserve">, </w:t>
+      </w:r>
+      <w:r>
+        <w:rPr>
+          <w:rFonts w:ascii="Arial" w:hAnsi="Arial" w:cs="Arial"/>
+        </w:rPr>
+        <w:t>which is a</w:t>
+      </w:r>
+      <w:r>
+        <w:rPr>
+          <w:rFonts w:ascii="Arial" w:hAnsi="Arial" w:cs="Arial"/>
+        </w:rPr>
+        <w:t>n</w:t>
+      </w:r>
+      <w:r>
+        <w:rPr>
+          <w:rFonts w:ascii="Arial" w:hAnsi="Arial" w:cs="Arial"/>
+        </w:rPr>
+        <w:t xml:space="preserve"> idea</w:t>
+      </w:r>
+      <w:r>
+        <w:rPr>
+          <w:rFonts w:ascii="Arial" w:hAnsi="Arial" w:cs="Arial"/>
+        </w:rPr>
+        <w:t xml:space="preserve"> posed across </w:t>
+      </w:r>
+      <w:r>
+        <w:rPr>
+          <w:rFonts w:ascii="Arial" w:hAnsi="Arial" w:cs="Arial"/>
+        </w:rPr>
+        <w:t>longstanding</w:t>
+      </w:r>
+      <w:r>
+        <w:rPr>
+          <w:rFonts w:ascii="Arial" w:hAnsi="Arial" w:cs="Arial"/>
+        </w:rPr>
+        <w:t xml:space="preserve"> hypotheses about how vocal communication systems </w:t>
+      </w:r>
+      <w:r>
+        <w:rPr>
+          <w:rFonts w:ascii="Arial" w:hAnsi="Arial" w:cs="Arial"/>
+        </w:rPr>
+        <w:t>reflect the complexity of animals’ social environments.</w:t>
+      </w:r>
+    </w:p>
+    <w:p>
+      <w:pPr>
+        <w:rPr>
+          <w:rFonts w:ascii="Arial" w:hAnsi="Arial" w:cs="Arial"/>
+        </w:rPr>
+      </w:pPr>
+    </w:p>
+    <w:p>
+      <w:pPr>
+        <w:rPr>
+          <w:rFonts w:ascii="Arial" w:hAnsi="Arial" w:cs="Arial"/>
+        </w:rPr>
+      </w:pPr>
+      <w:r>
+        <w:rPr>
+          <w:rFonts w:ascii="Arial" w:hAnsi="Arial" w:cs="Arial"/>
+        </w:rPr>
+        <w:t>WEREWOLF FOR PAPER 1</w:t>
+      </w:r>
+      <w:r>
+        <w:rPr>
+          <w:rFonts w:ascii="Arial" w:hAnsi="Arial" w:cs="Arial"/>
+        </w:rPr>
+        <w:t xml:space="preserve"> (emphasize </w:t>
+      </w:r>
+      <w:proofErr w:type="spellStart"/>
+      <w:r>
+        <w:rPr>
+          <w:rFonts w:ascii="Arial" w:hAnsi="Arial" w:cs="Arial"/>
+        </w:rPr>
+        <w:t>paRsynth</w:t>
+      </w:r>
+      <w:proofErr w:type="spellEnd"/>
+      <w:r>
+        <w:rPr>
+          <w:rFonts w:ascii="Arial" w:hAnsi="Arial" w:cs="Arial"/>
+        </w:rPr>
+        <w:t xml:space="preserve"> synthetic identity signals </w:t>
+      </w:r>
+      <w:r>
+        <w:rPr>
+          <w:rFonts w:ascii="Arial" w:hAnsi="Arial" w:cs="Arial"/>
+        </w:rPr>
+        <w:t xml:space="preserve">and </w:t>
+      </w:r>
+      <w:r>
+        <w:rPr>
+          <w:rFonts w:ascii="Arial" w:hAnsi="Arial" w:cs="Arial"/>
+        </w:rPr>
+        <w:t xml:space="preserve">bioacoustics pipeline </w:t>
+      </w:r>
+      <w:r>
+        <w:rPr>
+          <w:rFonts w:ascii="Arial" w:hAnsi="Arial" w:cs="Arial"/>
+        </w:rPr>
+        <w:t>to show that we can recover the</w:t>
+      </w:r>
+      <w:r>
+        <w:rPr>
+          <w:rFonts w:ascii="Arial" w:hAnsi="Arial" w:cs="Arial"/>
+        </w:rPr>
+        <w:t xml:space="preserve"> information</w:t>
+      </w:r>
+      <w:r>
+        <w:rPr>
+          <w:rFonts w:ascii="Arial" w:hAnsi="Arial" w:cs="Arial"/>
+        </w:rPr>
+        <w:t xml:space="preserve"> originally encoded</w:t>
+      </w:r>
+      <w:r>
+        <w:rPr>
+          <w:rFonts w:ascii="Arial" w:hAnsi="Arial" w:cs="Arial"/>
+        </w:rPr>
+        <w:t>)</w:t>
+      </w:r>
+      <w:r>
+        <w:rPr>
+          <w:rFonts w:ascii="Arial" w:hAnsi="Arial" w:cs="Arial"/>
+        </w:rPr>
+        <w:t>:</w:t>
+      </w:r>
+      <w:r>
+        <w:rPr>
+          <w:rFonts w:ascii="Arial" w:hAnsi="Arial" w:cs="Arial"/>
+        </w:rPr>
+        <w:t xml:space="preserve"> </w:t>
+      </w:r>
+      <w:r>
+        <w:rPr>
+          <w:rFonts w:ascii="Arial" w:hAnsi="Arial" w:cs="Arial"/>
+        </w:rPr>
+        <w:t>It is very challenging to a</w:t>
+      </w:r>
+      <w:r>
+        <w:rPr>
+          <w:rFonts w:ascii="Arial" w:hAnsi="Arial" w:cs="Arial"/>
+        </w:rPr>
+        <w:t>ddress</w:t>
+      </w:r>
+      <w:r>
+        <w:rPr>
+          <w:rFonts w:ascii="Arial" w:hAnsi="Arial" w:cs="Arial"/>
+        </w:rPr>
+        <w:t xml:space="preserve"> which structural features </w:t>
+      </w:r>
+      <w:r>
+        <w:rPr>
+          <w:rFonts w:ascii="Arial" w:hAnsi="Arial" w:cs="Arial"/>
+        </w:rPr>
+        <w:t xml:space="preserve">animals modify </w:t>
+      </w:r>
+      <w:r>
+        <w:rPr>
+          <w:rFonts w:ascii="Arial" w:hAnsi="Arial" w:cs="Arial"/>
+        </w:rPr>
+        <w:t xml:space="preserve">to </w:t>
+      </w:r>
+      <w:r>
+        <w:rPr>
+          <w:rFonts w:ascii="Arial" w:hAnsi="Arial" w:cs="Arial"/>
+        </w:rPr>
+        <w:t>encode</w:t>
+      </w:r>
+      <w:r>
+        <w:rPr>
+          <w:rFonts w:ascii="Arial" w:hAnsi="Arial" w:cs="Arial"/>
+        </w:rPr>
+        <w:t xml:space="preserve"> information</w:t>
+      </w:r>
+      <w:r>
+        <w:rPr>
+          <w:rFonts w:ascii="Arial" w:hAnsi="Arial" w:cs="Arial"/>
+        </w:rPr>
+        <w:t xml:space="preserve"> about individual identity and social affiliations</w:t>
+      </w:r>
+      <w:r>
+        <w:rPr>
+          <w:rFonts w:ascii="Arial" w:hAnsi="Arial" w:cs="Arial"/>
+        </w:rPr>
+        <w:t xml:space="preserve">. We also do not understand how </w:t>
+      </w:r>
+      <w:r>
+        <w:rPr>
+          <w:rFonts w:ascii="Arial" w:hAnsi="Arial" w:cs="Arial"/>
+        </w:rPr>
+        <w:t>animals vary structural features in response to social complexity…</w:t>
+      </w:r>
+    </w:p>
+    <w:p>
+      <w:pPr>
+        <w:rPr>
+          <w:rFonts w:ascii="Arial" w:hAnsi="Arial" w:cs="Arial"/>
+        </w:rPr>
+      </w:pPr>
+    </w:p>
+    <w:p>
+      <w:pPr>
+        <w:rPr>
+          <w:rFonts w:ascii="Arial" w:hAnsi="Arial" w:cs="Arial"/>
+        </w:rPr>
+      </w:pPr>
+      <w:r>
+        <w:rPr>
+          <w:rFonts w:ascii="Arial" w:hAnsi="Arial" w:cs="Arial"/>
+        </w:rPr>
+        <w:lastRenderedPageBreak/>
+        <w:t>SILVER BULLET: We need to apply and integrate an information theory perspective</w:t>
+      </w:r>
+      <w:r>
+        <w:rPr>
+          <w:rFonts w:ascii="Arial" w:hAnsi="Arial" w:cs="Arial"/>
+        </w:rPr>
+        <w:t xml:space="preserve"> in order to better understand how structural features can be modified</w:t>
+      </w:r>
+      <w:r>
+        <w:rPr>
+          <w:rFonts w:ascii="Arial" w:hAnsi="Arial" w:cs="Arial"/>
+        </w:rPr>
+        <w:t>…plus tools to generate synthetic signals that contain types and amounts of identity information that we can control</w:t>
+      </w:r>
+    </w:p>
+    <w:p>
+      <w:pPr>
+        <w:rPr>
+          <w:rFonts w:ascii="Arial" w:hAnsi="Arial" w:cs="Arial"/>
+        </w:rPr>
+      </w:pPr>
+    </w:p>
+    <w:p>
+      <w:pPr>
+        <w:rPr>
+          <w:rFonts w:ascii="Arial" w:hAnsi="Arial" w:cs="Arial"/>
+        </w:rPr>
+      </w:pPr>
+    </w:p>
+    <w:p>
+      <w:pPr>
+        <w:rPr>
+          <w:rFonts w:ascii="Arial" w:hAnsi="Arial" w:cs="Arial"/>
+        </w:rPr>
+      </w:pPr>
+    </w:p>
+    <w:p>
+      <w:pPr>
+        <w:rPr>
+          <w:rFonts w:ascii="Arial" w:hAnsi="Arial" w:cs="Arial"/>
+        </w:rPr>
+      </w:pPr>
+      <w:r>
+        <w:rPr>
+          <w:rFonts w:ascii="Arial" w:hAnsi="Arial" w:cs="Arial"/>
+        </w:rPr>
+        <w:t>WEREWOLF</w:t>
+      </w:r>
+      <w:r>
+        <w:rPr>
+          <w:rFonts w:ascii="Arial" w:hAnsi="Arial" w:cs="Arial"/>
+        </w:rPr>
+        <w:t xml:space="preserve"> FOR PAPER 2</w:t>
+      </w:r>
+      <w:r>
+        <w:rPr>
+          <w:rFonts w:ascii="Arial" w:hAnsi="Arial" w:cs="Arial"/>
+        </w:rPr>
+        <w:t xml:space="preserve"> (</w:t>
+      </w:r>
+      <w:r>
+        <w:rPr>
+          <w:rFonts w:ascii="Arial" w:hAnsi="Arial" w:cs="Arial"/>
+        </w:rPr>
+        <w:t xml:space="preserve">emphasize </w:t>
+      </w:r>
+      <w:r>
+        <w:rPr>
+          <w:rFonts w:ascii="Arial" w:hAnsi="Arial" w:cs="Arial"/>
+        </w:rPr>
+        <w:t>bioacoustics pipeline and expand to add additional methods</w:t>
+      </w:r>
+      <w:r>
+        <w:rPr>
+          <w:rFonts w:ascii="Arial" w:hAnsi="Arial" w:cs="Arial"/>
+        </w:rPr>
+        <w:t xml:space="preserve"> to quantify acoustic variation </w:t>
+      </w:r>
+      <w:r>
+        <w:rPr>
+          <w:rFonts w:ascii="Arial" w:hAnsi="Arial" w:cs="Arial"/>
+        </w:rPr>
+        <w:t>using synthetic signals as a baseline</w:t>
+      </w:r>
+      <w:r>
+        <w:rPr>
+          <w:rFonts w:ascii="Arial" w:hAnsi="Arial" w:cs="Arial"/>
+        </w:rPr>
+        <w:t>)</w:t>
+      </w:r>
+      <w:r>
+        <w:rPr>
+          <w:rFonts w:ascii="Arial" w:hAnsi="Arial" w:cs="Arial"/>
+        </w:rPr>
+        <w:t>:</w:t>
+      </w:r>
+      <w:r>
+        <w:rPr>
+          <w:rFonts w:ascii="Arial" w:hAnsi="Arial" w:cs="Arial"/>
+        </w:rPr>
+        <w:t xml:space="preserve"> </w:t>
+      </w:r>
+      <w:r>
+        <w:rPr>
+          <w:rFonts w:ascii="Arial" w:hAnsi="Arial" w:cs="Arial"/>
+        </w:rPr>
+        <w:t xml:space="preserve">We often do not know the acoustic structures that animals modify by learning to encode information, </w:t>
+      </w:r>
+      <w:r>
+        <w:rPr>
+          <w:rFonts w:ascii="Arial" w:hAnsi="Arial" w:cs="Arial"/>
+        </w:rPr>
+        <w:t>nor</w:t>
+      </w:r>
+      <w:r>
+        <w:rPr>
+          <w:rFonts w:ascii="Arial" w:hAnsi="Arial" w:cs="Arial"/>
+        </w:rPr>
+        <w:t xml:space="preserve"> the “truth” about the types and amounts of information encoded in biological signals. </w:t>
+      </w:r>
+      <w:r>
+        <w:rPr>
+          <w:rFonts w:ascii="Arial" w:hAnsi="Arial" w:cs="Arial"/>
+        </w:rPr>
+        <w:t>As such,</w:t>
+      </w:r>
+      <w:r>
+        <w:rPr>
+          <w:rFonts w:ascii="Arial" w:hAnsi="Arial" w:cs="Arial"/>
+        </w:rPr>
+        <w:t xml:space="preserve"> our inferences </w:t>
+      </w:r>
+      <w:r>
+        <w:rPr>
+          <w:rFonts w:ascii="Arial" w:hAnsi="Arial" w:cs="Arial"/>
+        </w:rPr>
+        <w:t xml:space="preserve">about </w:t>
+      </w:r>
+      <w:r>
+        <w:rPr>
+          <w:rFonts w:ascii="Arial" w:hAnsi="Arial" w:cs="Arial"/>
+        </w:rPr>
+        <w:t>the information animals encode in learned signals can be biased</w:t>
+      </w:r>
+      <w:r>
+        <w:rPr>
+          <w:rFonts w:ascii="Arial" w:hAnsi="Arial" w:cs="Arial"/>
+        </w:rPr>
+        <w:t xml:space="preserve"> by the methods we use to make biological inferences.</w:t>
+      </w:r>
+    </w:p>
+    <w:p>
+      <w:pPr>
+        <w:rPr>
+          <w:rFonts w:ascii="Arial" w:hAnsi="Arial" w:cs="Arial"/>
+        </w:rPr>
+      </w:pPr>
+    </w:p>
+    <w:p>
+      <w:pPr>
+        <w:rPr>
+          <w:rFonts w:ascii="Arial" w:hAnsi="Arial" w:cs="Arial"/>
+        </w:rPr>
+      </w:pPr>
+    </w:p>
+    <w:p>
+      <w:pPr>
+        <w:rPr>
+          <w:rFonts w:ascii="Arial" w:hAnsi="Arial" w:cs="Arial"/>
+        </w:rPr>
+      </w:pPr>
+    </w:p>
+    <w:p>
+      <w:pPr>
+        <w:rPr>
+          <w:rFonts w:ascii="Arial" w:hAnsi="Arial" w:cs="Arial"/>
+        </w:rPr>
+      </w:pPr>
+    </w:p>
+    <w:p>
+      <w:pPr>
+        <w:rPr>
+          <w:rFonts w:ascii="Arial" w:hAnsi="Arial" w:cs="Arial"/>
+        </w:rPr>
+      </w:pPr>
+    </w:p>
+    <w:p>
+      <w:pPr>
+        <w:rPr>
+          <w:rFonts w:ascii="Arial" w:hAnsi="Arial" w:cs="Arial"/>
+        </w:rPr>
+      </w:pPr>
+    </w:p>
+    <w:p>
+      <w:pPr>
+        <w:rPr>
+          <w:rFonts w:ascii="Arial" w:hAnsi="Arial" w:cs="Arial"/>
+        </w:rPr>
+      </w:pPr>
+      <w:r>
+        <w:rPr>
+          <w:rFonts w:ascii="Arial" w:hAnsi="Arial" w:cs="Arial"/>
           <w:b/>
           <w:bCs/>
         </w:rPr>
@@ -1319,7 +1801,6 @@
         <w:rPr>
           <w:rFonts w:ascii="Arial" w:hAnsi="Arial" w:cs="Arial"/>
         </w:rPr>
-        <w:lastRenderedPageBreak/>
         <w:t xml:space="preserve">Or add a subsampling approach to this paper? Keep thinking about this, because Bayesian modeling of group and individual level variation is </w:t>
       </w:r>
       <w:proofErr w:type="gramStart"/>
@@ -1462,6 +1943,7 @@
         <w:rPr>
           <w:rFonts w:ascii="Arial" w:hAnsi="Arial" w:cs="Arial"/>
         </w:rPr>
+        <w:lastRenderedPageBreak/>
         <w:t>Run SPCC</w:t>
       </w:r>
       <w:r>
@@ -1814,14 +2296,7 @@
         <w:rPr>
           <w:rFonts w:ascii="Arial" w:hAnsi="Arial" w:cs="Arial"/>
         </w:rPr>
-        <w:t xml:space="preserve"> clustering, since the analysis question </w:t>
-      </w:r>
-      <w:r>
-        <w:rPr>
-          <w:rFonts w:ascii="Arial" w:hAnsi="Arial" w:cs="Arial"/>
-        </w:rPr>
-        <w:lastRenderedPageBreak/>
-        <w:t xml:space="preserve">above is directly related to clustering. Use an approach that allows us to measure the posterior (read Ch. 13 in </w:t>
+        <w:t xml:space="preserve"> clustering, since the analysis question above is directly related to clustering. Use an approach that allows us to measure the posterior (read Ch. 13 in </w:t>
       </w:r>
       <w:proofErr w:type="spellStart"/>
       <w:r>
@@ -1881,6 +2356,7 @@
         <w:rPr>
           <w:rFonts w:ascii="Arial" w:hAnsi="Arial" w:cs="Arial"/>
         </w:rPr>
+        <w:lastRenderedPageBreak/>
         <w:t>These models allow us to address the statistical significance of the degree or magnitude of convergence</w:t>
       </w:r>
       <w:r>
@@ -2211,14 +2687,7 @@
         <w:rPr>
           <w:rFonts w:ascii="Arial" w:hAnsi="Arial" w:cs="Arial"/>
         </w:rPr>
-        <w:t xml:space="preserve"> using code that Grace has already to pull out the estimated fundamental frequency contour, </w:t>
-      </w:r>
-      <w:r>
-        <w:rPr>
-          <w:rFonts w:ascii="Arial" w:hAnsi="Arial" w:cs="Arial"/>
-        </w:rPr>
-        <w:lastRenderedPageBreak/>
-        <w:t>create spectrograms again with the frequency contour overlaid to check the accuracy of the tracing</w:t>
+        <w:t xml:space="preserve"> using code that Grace has already to pull out the estimated fundamental frequency contour, create spectrograms again with the frequency contour overlaid to check the accuracy of the tracing</w:t>
       </w:r>
     </w:p>
     <w:p>
@@ -2326,6 +2795,7 @@
         <w:rPr>
           <w:rFonts w:ascii="Arial" w:hAnsi="Arial" w:cs="Arial"/>
         </w:rPr>
+        <w:lastRenderedPageBreak/>
         <w:t>Dynamic time warping</w:t>
       </w:r>
       <w:r>

</xml_diff>

<commit_message>
Changes to intro outline and code
</commit_message>
<xml_diff>
--- a/paRsynth_methods_draft.docx
+++ b/paRsynth_methods_draft.docx
@@ -557,7 +557,6 @@
         </w:rPr>
         <w:t xml:space="preserve">: </w:t>
       </w:r>
-      <w:proofErr w:type="gramStart"/>
       <w:r>
         <w:rPr>
           <w:rFonts w:ascii="Arial" w:hAnsi="Arial" w:cs="Arial"/>
@@ -574,14 +573,7 @@
         <w:rPr>
           <w:rFonts w:ascii="Arial" w:hAnsi="Arial" w:cs="Arial"/>
         </w:rPr>
-        <w:t>word</w:t>
-      </w:r>
-      <w:proofErr w:type="gramEnd"/>
-      <w:r>
-        <w:rPr>
-          <w:rFonts w:ascii="Arial" w:hAnsi="Arial" w:cs="Arial"/>
-        </w:rPr>
-        <w:t xml:space="preserve"> </w:t>
+        <w:t xml:space="preserve">word </w:t>
       </w:r>
       <w:r>
         <w:rPr>
@@ -767,21 +759,7 @@
         <w:rPr>
           <w:rFonts w:ascii="Arial" w:hAnsi="Arial" w:cs="Arial"/>
         </w:rPr>
-        <w:t xml:space="preserve">Information theory perspective and </w:t>
-      </w:r>
-      <w:proofErr w:type="gramStart"/>
-      <w:r>
-        <w:rPr>
-          <w:rFonts w:ascii="Arial" w:hAnsi="Arial" w:cs="Arial"/>
-        </w:rPr>
-        <w:t>Parsons</w:t>
-      </w:r>
-      <w:proofErr w:type="gramEnd"/>
-      <w:r>
-        <w:rPr>
-          <w:rFonts w:ascii="Arial" w:hAnsi="Arial" w:cs="Arial"/>
-        </w:rPr>
-        <w:t xml:space="preserve"> code</w:t>
+        <w:t>Information theory perspective and Parsons code</w:t>
       </w:r>
       <w:r>
         <w:rPr>
@@ -1169,16 +1147,46 @@
         <w:rPr>
           <w:rFonts w:ascii="Arial" w:hAnsi="Arial" w:cs="Arial"/>
         </w:rPr>
-        <w:t xml:space="preserve"> and base-3 </w:t>
-      </w:r>
-      <w:proofErr w:type="gramStart"/>
-      <w:r>
-        <w:rPr>
-          <w:rFonts w:ascii="Arial" w:hAnsi="Arial" w:cs="Arial"/>
-        </w:rPr>
-        <w:t>Parsons</w:t>
-      </w:r>
-      <w:proofErr w:type="gramEnd"/>
+        <w:t xml:space="preserve"> and base-3 Parsons </w:t>
+      </w:r>
+      <w:r>
+        <w:rPr>
+          <w:rFonts w:ascii="Arial" w:hAnsi="Arial" w:cs="Arial"/>
+        </w:rPr>
+        <w:t>code</w:t>
+      </w:r>
+    </w:p>
+    <w:p>
+      <w:pPr>
+        <w:pStyle w:val="ListParagraph"/>
+        <w:numPr>
+          <w:ilvl w:val="0"/>
+          <w:numId w:val="3"/>
+        </w:numPr>
+        <w:spacing w:after="240"/>
+        <w:contextualSpacing w:val="0"/>
+        <w:rPr>
+          <w:rFonts w:ascii="Arial" w:hAnsi="Arial" w:cs="Arial"/>
+        </w:rPr>
+      </w:pPr>
+      <w:r>
+        <w:rPr>
+          <w:rFonts w:ascii="Arial" w:hAnsi="Arial" w:cs="Arial"/>
+        </w:rPr>
+        <w:t xml:space="preserve">Pseudocode for our </w:t>
+      </w:r>
+      <w:r>
+        <w:rPr>
+          <w:rFonts w:ascii="Arial" w:hAnsi="Arial" w:cs="Arial"/>
+        </w:rPr>
+        <w:t>“Information recovery pipeline”</w:t>
+      </w:r>
+      <w:r>
+        <w:rPr>
+          <w:rFonts w:ascii="Arial" w:hAnsi="Arial" w:cs="Arial"/>
+        </w:rPr>
+        <w:t>.</w:t>
+      </w:r>
       <w:r>
         <w:rPr>
           <w:rFonts w:ascii="Arial" w:hAnsi="Arial" w:cs="Arial"/>
@@ -1189,39 +1197,322 @@
         <w:rPr>
           <w:rFonts w:ascii="Arial" w:hAnsi="Arial" w:cs="Arial"/>
         </w:rPr>
-        <w:t>code</w:t>
-      </w:r>
-    </w:p>
-    <w:p>
-      <w:pPr>
-        <w:pStyle w:val="ListParagraph"/>
-        <w:numPr>
-          <w:ilvl w:val="0"/>
-          <w:numId w:val="3"/>
-        </w:numPr>
-        <w:spacing w:after="240"/>
-        <w:contextualSpacing w:val="0"/>
-        <w:rPr>
-          <w:rFonts w:ascii="Arial" w:hAnsi="Arial" w:cs="Arial"/>
-        </w:rPr>
-      </w:pPr>
-      <w:r>
-        <w:rPr>
-          <w:rFonts w:ascii="Arial" w:hAnsi="Arial" w:cs="Arial"/>
-        </w:rPr>
-        <w:t xml:space="preserve">Pseudocode for our </w:t>
-      </w:r>
-      <w:r>
-        <w:rPr>
-          <w:rFonts w:ascii="Arial" w:hAnsi="Arial" w:cs="Arial"/>
-        </w:rPr>
-        <w:t>“Information recovery pipeline”</w:t>
-      </w:r>
-      <w:r>
-        <w:rPr>
-          <w:rFonts w:ascii="Arial" w:hAnsi="Arial" w:cs="Arial"/>
-        </w:rPr>
-        <w:t>.</w:t>
+        <w:t xml:space="preserve">We have code to do the majority of all of this, and will need to </w:t>
+      </w:r>
+      <w:r>
+        <w:rPr>
+          <w:rFonts w:ascii="Arial" w:hAnsi="Arial" w:cs="Arial"/>
+        </w:rPr>
+        <w:t>put the pieces together</w:t>
+      </w:r>
+    </w:p>
+    <w:p>
+      <w:pPr>
+        <w:pStyle w:val="ListParagraph"/>
+        <w:numPr>
+          <w:ilvl w:val="1"/>
+          <w:numId w:val="3"/>
+        </w:numPr>
+        <w:spacing w:after="240"/>
+        <w:contextualSpacing w:val="0"/>
+        <w:rPr>
+          <w:rFonts w:ascii="Arial" w:hAnsi="Arial" w:cs="Arial"/>
+        </w:rPr>
+      </w:pPr>
+      <w:r>
+        <w:rPr>
+          <w:rFonts w:ascii="Arial" w:hAnsi="Arial" w:cs="Arial"/>
+        </w:rPr>
+        <w:t>Decide on treatments for experiments of information recovery</w:t>
+      </w:r>
+    </w:p>
+    <w:p>
+      <w:pPr>
+        <w:pStyle w:val="ListParagraph"/>
+        <w:numPr>
+          <w:ilvl w:val="2"/>
+          <w:numId w:val="3"/>
+        </w:numPr>
+        <w:spacing w:after="240"/>
+        <w:contextualSpacing w:val="0"/>
+        <w:rPr>
+          <w:rFonts w:ascii="Arial" w:hAnsi="Arial" w:cs="Arial"/>
+        </w:rPr>
+      </w:pPr>
+      <w:r>
+        <w:rPr>
+          <w:rFonts w:ascii="Arial" w:hAnsi="Arial" w:cs="Arial"/>
+        </w:rPr>
+        <w:t xml:space="preserve">Social environment variation (number of groups and individuals), information encoding at two social levels </w:t>
+      </w:r>
+    </w:p>
+    <w:p>
+      <w:pPr>
+        <w:pStyle w:val="ListParagraph"/>
+        <w:numPr>
+          <w:ilvl w:val="2"/>
+          <w:numId w:val="3"/>
+        </w:numPr>
+        <w:spacing w:after="240"/>
+        <w:contextualSpacing w:val="0"/>
+        <w:rPr>
+          <w:rFonts w:ascii="Arial" w:hAnsi="Arial" w:cs="Arial"/>
+        </w:rPr>
+      </w:pPr>
+      <w:r>
+        <w:rPr>
+          <w:rFonts w:ascii="Arial" w:hAnsi="Arial" w:cs="Arial"/>
+        </w:rPr>
+        <w:t>Set some upper maximum for total number of SPCC comparisons, think about this. For some social environment treatments, subsample a single call per individual</w:t>
+      </w:r>
+    </w:p>
+    <w:p>
+      <w:pPr>
+        <w:pStyle w:val="ListParagraph"/>
+        <w:numPr>
+          <w:ilvl w:val="2"/>
+          <w:numId w:val="3"/>
+        </w:numPr>
+        <w:spacing w:after="240"/>
+        <w:contextualSpacing w:val="0"/>
+        <w:rPr>
+          <w:rFonts w:ascii="Arial" w:hAnsi="Arial" w:cs="Arial"/>
+        </w:rPr>
+      </w:pPr>
+      <w:r>
+        <w:rPr>
+          <w:rFonts w:ascii="Arial" w:hAnsi="Arial" w:cs="Arial"/>
+        </w:rPr>
+        <w:lastRenderedPageBreak/>
+        <w:t>Or add a subsampling approach to this paper? Keep thinking about this, because Bayesian modeling of group and individual level variation is really useful and use fewer numbers of groups and individuals in the social environment</w:t>
+      </w:r>
+    </w:p>
+    <w:p>
+      <w:pPr>
+        <w:pStyle w:val="ListParagraph"/>
+        <w:numPr>
+          <w:ilvl w:val="1"/>
+          <w:numId w:val="3"/>
+        </w:numPr>
+        <w:spacing w:after="240"/>
+        <w:contextualSpacing w:val="0"/>
+        <w:rPr>
+          <w:rFonts w:ascii="Arial" w:hAnsi="Arial" w:cs="Arial"/>
+        </w:rPr>
+      </w:pPr>
+      <w:r>
+        <w:rPr>
+          <w:rFonts w:ascii="Arial" w:hAnsi="Arial" w:cs="Arial"/>
+        </w:rPr>
+        <w:t>Pipeline for visuals to go into the manuscript:</w:t>
+      </w:r>
+    </w:p>
+    <w:p>
+      <w:pPr>
+        <w:pStyle w:val="ListParagraph"/>
+        <w:numPr>
+          <w:ilvl w:val="2"/>
+          <w:numId w:val="3"/>
+        </w:numPr>
+        <w:spacing w:after="240"/>
+        <w:contextualSpacing w:val="0"/>
+        <w:rPr>
+          <w:rFonts w:ascii="Arial" w:hAnsi="Arial" w:cs="Arial"/>
+        </w:rPr>
+      </w:pPr>
+      <w:r>
+        <w:rPr>
+          <w:rFonts w:ascii="Arial" w:hAnsi="Arial" w:cs="Arial"/>
+        </w:rPr>
+        <w:t xml:space="preserve">Create synthetic call datasets with </w:t>
+      </w:r>
+      <w:proofErr w:type="spellStart"/>
+      <w:r>
+        <w:rPr>
+          <w:rFonts w:ascii="Arial" w:hAnsi="Arial" w:cs="Arial"/>
+        </w:rPr>
+        <w:t>paRsynth</w:t>
+      </w:r>
+      <w:proofErr w:type="spellEnd"/>
+      <w:r>
+        <w:rPr>
+          <w:rFonts w:ascii="Arial" w:hAnsi="Arial" w:cs="Arial"/>
+        </w:rPr>
+        <w:t xml:space="preserve"> that are individually and group distinctive</w:t>
+      </w:r>
+    </w:p>
+    <w:p>
+      <w:pPr>
+        <w:pStyle w:val="ListParagraph"/>
+        <w:numPr>
+          <w:ilvl w:val="2"/>
+          <w:numId w:val="3"/>
+        </w:numPr>
+        <w:spacing w:after="240"/>
+        <w:contextualSpacing w:val="0"/>
+        <w:rPr>
+          <w:rFonts w:ascii="Arial" w:hAnsi="Arial" w:cs="Arial"/>
+        </w:rPr>
+      </w:pPr>
+      <w:r>
+        <w:rPr>
+          <w:rFonts w:ascii="Arial" w:hAnsi="Arial" w:cs="Arial"/>
+        </w:rPr>
+        <w:t xml:space="preserve">Figure 1: </w:t>
+      </w:r>
+      <w:r>
+        <w:rPr>
+          <w:rFonts w:ascii="Arial" w:hAnsi="Arial" w:cs="Arial"/>
+        </w:rPr>
+        <w:t xml:space="preserve">Lexicon of </w:t>
+      </w:r>
+      <w:r>
+        <w:rPr>
+          <w:rFonts w:ascii="Arial" w:hAnsi="Arial" w:cs="Arial"/>
+        </w:rPr>
+        <w:t>individually distinctive and group-disti</w:t>
+      </w:r>
+      <w:r>
+        <w:rPr>
+          <w:rFonts w:ascii="Arial" w:hAnsi="Arial" w:cs="Arial"/>
+        </w:rPr>
+        <w:t>n</w:t>
+      </w:r>
+      <w:r>
+        <w:rPr>
+          <w:rFonts w:ascii="Arial" w:hAnsi="Arial" w:cs="Arial"/>
+        </w:rPr>
+        <w:t>ctive call</w:t>
+      </w:r>
+      <w:r>
+        <w:rPr>
+          <w:rFonts w:ascii="Arial" w:hAnsi="Arial" w:cs="Arial"/>
+        </w:rPr>
+        <w:t xml:space="preserve"> spectrograms</w:t>
+      </w:r>
+    </w:p>
+    <w:p>
+      <w:pPr>
+        <w:pStyle w:val="ListParagraph"/>
+        <w:numPr>
+          <w:ilvl w:val="2"/>
+          <w:numId w:val="3"/>
+        </w:numPr>
+        <w:spacing w:after="240"/>
+        <w:contextualSpacing w:val="0"/>
+        <w:rPr>
+          <w:rFonts w:ascii="Arial" w:hAnsi="Arial" w:cs="Arial"/>
+        </w:rPr>
+      </w:pPr>
+      <w:r>
+        <w:rPr>
+          <w:rFonts w:ascii="Arial" w:hAnsi="Arial" w:cs="Arial"/>
+        </w:rPr>
+        <w:t xml:space="preserve">Figure 2: </w:t>
+      </w:r>
+      <w:r>
+        <w:rPr>
+          <w:rFonts w:ascii="Arial" w:hAnsi="Arial" w:cs="Arial"/>
+        </w:rPr>
+        <w:t xml:space="preserve">Acoustic space plots of </w:t>
+      </w:r>
+      <w:r>
+        <w:rPr>
+          <w:rFonts w:ascii="Arial" w:hAnsi="Arial" w:cs="Arial"/>
+        </w:rPr>
+        <w:t>individually distinctive and group-distinctive calls</w:t>
+      </w:r>
+      <w:r>
+        <w:rPr>
+          <w:rFonts w:ascii="Arial" w:hAnsi="Arial" w:cs="Arial"/>
+        </w:rPr>
+        <w:t xml:space="preserve"> (or panels in Figure 1)</w:t>
+      </w:r>
+    </w:p>
+    <w:p>
+      <w:pPr>
+        <w:pStyle w:val="ListParagraph"/>
+        <w:numPr>
+          <w:ilvl w:val="1"/>
+          <w:numId w:val="3"/>
+        </w:numPr>
+        <w:spacing w:after="240"/>
+        <w:contextualSpacing w:val="0"/>
+        <w:rPr>
+          <w:rFonts w:ascii="Arial" w:hAnsi="Arial" w:cs="Arial"/>
+        </w:rPr>
+      </w:pPr>
+      <w:r>
+        <w:rPr>
+          <w:rFonts w:ascii="Arial" w:hAnsi="Arial" w:cs="Arial"/>
+        </w:rPr>
+        <w:t>Information recovery pipeline</w:t>
+      </w:r>
+    </w:p>
+    <w:p>
+      <w:pPr>
+        <w:pStyle w:val="ListParagraph"/>
+        <w:numPr>
+          <w:ilvl w:val="2"/>
+          <w:numId w:val="3"/>
+        </w:numPr>
+        <w:spacing w:after="240"/>
+        <w:contextualSpacing w:val="0"/>
+        <w:rPr>
+          <w:rFonts w:ascii="Arial" w:hAnsi="Arial" w:cs="Arial"/>
+        </w:rPr>
+      </w:pPr>
+      <w:r>
+        <w:rPr>
+          <w:rFonts w:ascii="Arial" w:hAnsi="Arial" w:cs="Arial"/>
+        </w:rPr>
+        <w:t xml:space="preserve">Create the synthetic call datasets </w:t>
+      </w:r>
+      <w:r>
+        <w:rPr>
+          <w:rFonts w:ascii="Arial" w:hAnsi="Arial" w:cs="Arial"/>
+        </w:rPr>
+        <w:t xml:space="preserve">with </w:t>
+      </w:r>
+      <w:proofErr w:type="spellStart"/>
+      <w:r>
+        <w:rPr>
+          <w:rFonts w:ascii="Arial" w:hAnsi="Arial" w:cs="Arial"/>
+        </w:rPr>
+        <w:t>paRsynth</w:t>
+      </w:r>
+      <w:proofErr w:type="spellEnd"/>
+      <w:r>
+        <w:rPr>
+          <w:rFonts w:ascii="Arial" w:hAnsi="Arial" w:cs="Arial"/>
+        </w:rPr>
+        <w:t xml:space="preserve"> (character strings and metadata to audio files)</w:t>
+      </w:r>
+    </w:p>
+    <w:p>
+      <w:pPr>
+        <w:pStyle w:val="ListParagraph"/>
+        <w:numPr>
+          <w:ilvl w:val="2"/>
+          <w:numId w:val="3"/>
+        </w:numPr>
+        <w:spacing w:after="240"/>
+        <w:contextualSpacing w:val="0"/>
+        <w:rPr>
+          <w:rFonts w:ascii="Arial" w:hAnsi="Arial" w:cs="Arial"/>
+        </w:rPr>
+      </w:pPr>
+      <w:r>
+        <w:rPr>
+          <w:rFonts w:ascii="Arial" w:hAnsi="Arial" w:cs="Arial"/>
+        </w:rPr>
+        <w:t>SPCC</w:t>
+      </w:r>
+      <w:r>
+        <w:rPr>
+          <w:rFonts w:ascii="Arial" w:hAnsi="Arial" w:cs="Arial"/>
+        </w:rPr>
+        <w:t>-based</w:t>
       </w:r>
       <w:r>
         <w:rPr>
@@ -1233,33 +1524,816 @@
         <w:rPr>
           <w:rFonts w:ascii="Arial" w:hAnsi="Arial" w:cs="Arial"/>
         </w:rPr>
-        <w:t xml:space="preserve">We have code to do the majority of all of this, and will need to </w:t>
-      </w:r>
-      <w:r>
-        <w:rPr>
-          <w:rFonts w:ascii="Arial" w:hAnsi="Arial" w:cs="Arial"/>
-        </w:rPr>
-        <w:t>put the pieces together</w:t>
-      </w:r>
-    </w:p>
-    <w:p>
-      <w:pPr>
-        <w:pStyle w:val="ListParagraph"/>
-        <w:numPr>
-          <w:ilvl w:val="1"/>
-          <w:numId w:val="3"/>
-        </w:numPr>
-        <w:spacing w:after="240"/>
-        <w:contextualSpacing w:val="0"/>
-        <w:rPr>
-          <w:rFonts w:ascii="Arial" w:hAnsi="Arial" w:cs="Arial"/>
-        </w:rPr>
-      </w:pPr>
-      <w:r>
-        <w:rPr>
-          <w:rFonts w:ascii="Arial" w:hAnsi="Arial" w:cs="Arial"/>
-        </w:rPr>
-        <w:t>Decide on treatments for experiments of information recovery</w:t>
+        <w:t>(a mix of traditional bioacoustics tools and information theory perspective</w:t>
+      </w:r>
+      <w:r>
+        <w:rPr>
+          <w:rFonts w:ascii="Arial" w:hAnsi="Arial" w:cs="Arial"/>
+        </w:rPr>
+        <w:t xml:space="preserve">, </w:t>
+      </w:r>
+      <w:r>
+        <w:rPr>
+          <w:rFonts w:ascii="Arial" w:hAnsi="Arial" w:cs="Arial"/>
+        </w:rPr>
+        <w:t>plus newer tools for inferential statistics</w:t>
+      </w:r>
+      <w:r>
+        <w:rPr>
+          <w:rFonts w:ascii="Arial" w:hAnsi="Arial" w:cs="Arial"/>
+        </w:rPr>
+        <w:t>)</w:t>
+      </w:r>
+      <w:r>
+        <w:rPr>
+          <w:rFonts w:ascii="Arial" w:hAnsi="Arial" w:cs="Arial"/>
+        </w:rPr>
+        <w:t>:</w:t>
+      </w:r>
+    </w:p>
+    <w:p>
+      <w:pPr>
+        <w:pStyle w:val="ListParagraph"/>
+        <w:numPr>
+          <w:ilvl w:val="3"/>
+          <w:numId w:val="3"/>
+        </w:numPr>
+        <w:spacing w:after="240"/>
+        <w:contextualSpacing w:val="0"/>
+        <w:rPr>
+          <w:rFonts w:ascii="Arial" w:hAnsi="Arial" w:cs="Arial"/>
+        </w:rPr>
+      </w:pPr>
+      <w:r>
+        <w:rPr>
+          <w:rFonts w:ascii="Arial" w:hAnsi="Arial" w:cs="Arial"/>
+        </w:rPr>
+        <w:t>Run SPCC</w:t>
+      </w:r>
+      <w:r>
+        <w:rPr>
+          <w:rFonts w:ascii="Arial" w:hAnsi="Arial" w:cs="Arial"/>
+        </w:rPr>
+        <w:t xml:space="preserve"> to measure acoustic similarity of all calls in the dataset generated for a given set of experimental treatments</w:t>
+      </w:r>
+    </w:p>
+    <w:p>
+      <w:pPr>
+        <w:pStyle w:val="ListParagraph"/>
+        <w:numPr>
+          <w:ilvl w:val="3"/>
+          <w:numId w:val="3"/>
+        </w:numPr>
+        <w:spacing w:after="240"/>
+        <w:contextualSpacing w:val="0"/>
+        <w:rPr>
+          <w:rFonts w:ascii="Arial" w:hAnsi="Arial" w:cs="Arial"/>
+        </w:rPr>
+      </w:pPr>
+      <w:r>
+        <w:rPr>
+          <w:rFonts w:ascii="Arial" w:hAnsi="Arial" w:cs="Arial"/>
+        </w:rPr>
+        <w:t>Reduce</w:t>
+      </w:r>
+      <w:r>
+        <w:rPr>
+          <w:rFonts w:ascii="Arial" w:hAnsi="Arial" w:cs="Arial"/>
+        </w:rPr>
+        <w:t xml:space="preserve"> dimensionality of the SPCC matrix with </w:t>
+      </w:r>
+      <w:r>
+        <w:rPr>
+          <w:rFonts w:ascii="Arial" w:hAnsi="Arial" w:cs="Arial"/>
+        </w:rPr>
+        <w:t>m</w:t>
+      </w:r>
+      <w:r>
+        <w:rPr>
+          <w:rFonts w:ascii="Arial" w:hAnsi="Arial" w:cs="Arial"/>
+        </w:rPr>
+        <w:t xml:space="preserve">ulti-dimensional scaling </w:t>
+      </w:r>
+      <w:r>
+        <w:rPr>
+          <w:rFonts w:ascii="Arial" w:hAnsi="Arial" w:cs="Arial"/>
+        </w:rPr>
+        <w:t>acoustic space</w:t>
+      </w:r>
+    </w:p>
+    <w:p>
+      <w:pPr>
+        <w:pStyle w:val="ListParagraph"/>
+        <w:numPr>
+          <w:ilvl w:val="4"/>
+          <w:numId w:val="3"/>
+        </w:numPr>
+        <w:spacing w:after="240"/>
+        <w:contextualSpacing w:val="0"/>
+        <w:rPr>
+          <w:rFonts w:ascii="Arial" w:hAnsi="Arial" w:cs="Arial"/>
+        </w:rPr>
+      </w:pPr>
+      <w:r>
+        <w:rPr>
+          <w:rFonts w:ascii="Arial" w:hAnsi="Arial" w:cs="Arial"/>
+        </w:rPr>
+        <w:t>Use a high number of dimensions for the MDS solution that reduces stress to &lt;= 5%</w:t>
+      </w:r>
+    </w:p>
+    <w:p>
+      <w:pPr>
+        <w:pStyle w:val="ListParagraph"/>
+        <w:numPr>
+          <w:ilvl w:val="3"/>
+          <w:numId w:val="3"/>
+        </w:numPr>
+        <w:spacing w:after="240"/>
+        <w:contextualSpacing w:val="0"/>
+        <w:rPr>
+          <w:rFonts w:ascii="Arial" w:hAnsi="Arial" w:cs="Arial"/>
+        </w:rPr>
+      </w:pPr>
+      <w:r>
+        <w:rPr>
+          <w:rFonts w:ascii="Arial" w:hAnsi="Arial" w:cs="Arial"/>
+        </w:rPr>
+        <w:t>Run k-means or other unsupervised c</w:t>
+      </w:r>
+      <w:r>
+        <w:rPr>
+          <w:rFonts w:ascii="Arial" w:hAnsi="Arial" w:cs="Arial"/>
+        </w:rPr>
+        <w:t xml:space="preserve">lustering </w:t>
+      </w:r>
+      <w:r>
+        <w:rPr>
+          <w:rFonts w:ascii="Arial" w:hAnsi="Arial" w:cs="Arial"/>
+        </w:rPr>
+        <w:t xml:space="preserve">on the first </w:t>
+      </w:r>
+      <w:r>
+        <w:rPr>
+          <w:rFonts w:ascii="Arial" w:hAnsi="Arial" w:cs="Arial"/>
+        </w:rPr>
+        <w:t>2 MDS dimensions</w:t>
+      </w:r>
+    </w:p>
+    <w:p>
+      <w:pPr>
+        <w:pStyle w:val="ListParagraph"/>
+        <w:numPr>
+          <w:ilvl w:val="3"/>
+          <w:numId w:val="3"/>
+        </w:numPr>
+        <w:spacing w:after="240"/>
+        <w:contextualSpacing w:val="0"/>
+        <w:rPr>
+          <w:rFonts w:ascii="Arial" w:hAnsi="Arial" w:cs="Arial"/>
+        </w:rPr>
+      </w:pPr>
+      <w:r>
+        <w:rPr>
+          <w:rFonts w:ascii="Arial" w:hAnsi="Arial" w:cs="Arial"/>
+        </w:rPr>
+        <w:t xml:space="preserve">Compute </w:t>
+      </w:r>
+      <w:r>
+        <w:rPr>
+          <w:rFonts w:ascii="Arial" w:hAnsi="Arial" w:cs="Arial"/>
+        </w:rPr>
+        <w:t>Normalized Mutual</w:t>
+      </w:r>
+      <w:r>
+        <w:rPr>
+          <w:rFonts w:ascii="Arial" w:hAnsi="Arial" w:cs="Arial"/>
+        </w:rPr>
+        <w:t xml:space="preserve"> Information </w:t>
+      </w:r>
+      <w:r>
+        <w:rPr>
+          <w:rFonts w:ascii="Arial" w:hAnsi="Arial" w:cs="Arial"/>
+        </w:rPr>
+        <w:t>between the cluster labels</w:t>
+      </w:r>
+      <w:r>
+        <w:rPr>
+          <w:rFonts w:ascii="Arial" w:hAnsi="Arial" w:cs="Arial"/>
+        </w:rPr>
+        <w:t xml:space="preserve"> and the original labels at each social level</w:t>
+      </w:r>
+    </w:p>
+    <w:p>
+      <w:pPr>
+        <w:pStyle w:val="ListParagraph"/>
+        <w:numPr>
+          <w:ilvl w:val="4"/>
+          <w:numId w:val="3"/>
+        </w:numPr>
+        <w:spacing w:after="240"/>
+        <w:contextualSpacing w:val="0"/>
+        <w:rPr>
+          <w:rFonts w:ascii="Arial" w:hAnsi="Arial" w:cs="Arial"/>
+        </w:rPr>
+      </w:pPr>
+      <w:r>
+        <w:rPr>
+          <w:rFonts w:ascii="Arial" w:hAnsi="Arial" w:cs="Arial"/>
+        </w:rPr>
+        <w:t xml:space="preserve">NMI should be calculated </w:t>
+      </w:r>
+      <w:r>
+        <w:rPr>
+          <w:rFonts w:ascii="Arial" w:hAnsi="Arial" w:cs="Arial"/>
+        </w:rPr>
+        <w:t>in 3 ways: group-level (original group IDs)</w:t>
+      </w:r>
+      <w:r>
+        <w:rPr>
+          <w:rFonts w:ascii="Arial" w:hAnsi="Arial" w:cs="Arial"/>
+        </w:rPr>
+        <w:t xml:space="preserve">, individuals within groups </w:t>
+      </w:r>
+      <w:r>
+        <w:rPr>
+          <w:rFonts w:ascii="Arial" w:hAnsi="Arial" w:cs="Arial"/>
+        </w:rPr>
+        <w:t>(</w:t>
+      </w:r>
+      <w:r>
+        <w:rPr>
+          <w:rFonts w:ascii="Arial" w:hAnsi="Arial" w:cs="Arial"/>
+        </w:rPr>
+        <w:t>NMI at the individual level within groups</w:t>
+      </w:r>
+      <w:r>
+        <w:rPr>
+          <w:rFonts w:ascii="Arial" w:hAnsi="Arial" w:cs="Arial"/>
+        </w:rPr>
+        <w:t>)</w:t>
+      </w:r>
+      <w:r>
+        <w:rPr>
+          <w:rFonts w:ascii="Arial" w:hAnsi="Arial" w:cs="Arial"/>
+        </w:rPr>
+        <w:t>, all individuals (group plus individual ID as a unique identifier)</w:t>
+      </w:r>
+      <w:r>
+        <w:rPr>
+          <w:rFonts w:ascii="Arial" w:hAnsi="Arial" w:cs="Arial"/>
+        </w:rPr>
+        <w:t>. Keep thinking about the last calculation, since it doesn’t follow the original information encoding logic in which individuals are unique within groups</w:t>
+      </w:r>
+    </w:p>
+    <w:p>
+      <w:pPr>
+        <w:pStyle w:val="ListParagraph"/>
+        <w:numPr>
+          <w:ilvl w:val="3"/>
+          <w:numId w:val="3"/>
+        </w:numPr>
+        <w:spacing w:after="240"/>
+        <w:contextualSpacing w:val="0"/>
+        <w:rPr>
+          <w:rFonts w:ascii="Arial" w:hAnsi="Arial" w:cs="Arial"/>
+        </w:rPr>
+      </w:pPr>
+      <w:r>
+        <w:rPr>
+          <w:rFonts w:ascii="Arial" w:hAnsi="Arial" w:cs="Arial"/>
+        </w:rPr>
+        <w:t>Bayesian hierarchical models</w:t>
+      </w:r>
+      <w:r>
+        <w:rPr>
+          <w:rFonts w:ascii="Arial" w:hAnsi="Arial" w:cs="Arial"/>
+        </w:rPr>
+        <w:t xml:space="preserve"> for inferential statistics</w:t>
+      </w:r>
+      <w:r>
+        <w:rPr>
+          <w:rFonts w:ascii="Arial" w:hAnsi="Arial" w:cs="Arial"/>
+        </w:rPr>
+        <w:t xml:space="preserve"> (TODO)</w:t>
+      </w:r>
+    </w:p>
+    <w:p>
+      <w:pPr>
+        <w:pStyle w:val="ListParagraph"/>
+        <w:numPr>
+          <w:ilvl w:val="4"/>
+          <w:numId w:val="3"/>
+        </w:numPr>
+        <w:spacing w:after="240"/>
+        <w:contextualSpacing w:val="0"/>
+        <w:rPr>
+          <w:rFonts w:ascii="Arial" w:hAnsi="Arial" w:cs="Arial"/>
+        </w:rPr>
+      </w:pPr>
+      <w:r>
+        <w:rPr>
+          <w:rFonts w:ascii="Arial" w:hAnsi="Arial" w:cs="Arial"/>
+        </w:rPr>
+        <w:lastRenderedPageBreak/>
+        <w:t xml:space="preserve">Ask whether acoustic convergence is statistically significant at each social level </w:t>
+      </w:r>
+      <w:r>
+        <w:rPr>
+          <w:rFonts w:ascii="Arial" w:hAnsi="Arial" w:cs="Arial"/>
+        </w:rPr>
+        <w:t>across experimental treatments</w:t>
+      </w:r>
+    </w:p>
+    <w:p>
+      <w:pPr>
+        <w:pStyle w:val="ListParagraph"/>
+        <w:numPr>
+          <w:ilvl w:val="4"/>
+          <w:numId w:val="3"/>
+        </w:numPr>
+        <w:spacing w:after="240"/>
+        <w:contextualSpacing w:val="0"/>
+        <w:rPr>
+          <w:rFonts w:ascii="Arial" w:hAnsi="Arial" w:cs="Arial"/>
+        </w:rPr>
+      </w:pPr>
+      <w:r>
+        <w:rPr>
+          <w:rFonts w:ascii="Arial" w:hAnsi="Arial" w:cs="Arial"/>
+        </w:rPr>
+        <w:t>Bayesian models should use the SPCC matrix values as input data</w:t>
+      </w:r>
+      <w:r>
+        <w:rPr>
+          <w:rFonts w:ascii="Arial" w:hAnsi="Arial" w:cs="Arial"/>
+        </w:rPr>
+        <w:t>, very similar to Mantel test</w:t>
+      </w:r>
+    </w:p>
+    <w:p>
+      <w:pPr>
+        <w:pStyle w:val="ListParagraph"/>
+        <w:numPr>
+          <w:ilvl w:val="5"/>
+          <w:numId w:val="3"/>
+        </w:numPr>
+        <w:spacing w:after="240"/>
+        <w:contextualSpacing w:val="0"/>
+        <w:rPr>
+          <w:rFonts w:ascii="Arial" w:hAnsi="Arial" w:cs="Arial"/>
+        </w:rPr>
+      </w:pPr>
+      <w:r>
+        <w:rPr>
+          <w:rFonts w:ascii="Arial" w:hAnsi="Arial" w:cs="Arial"/>
+        </w:rPr>
+        <w:t>Analysis questions: How similar are an individual’s calls to its own calls, compared to calls of other individuals? And the same for groups</w:t>
+      </w:r>
+    </w:p>
+    <w:p>
+      <w:pPr>
+        <w:pStyle w:val="ListParagraph"/>
+        <w:numPr>
+          <w:ilvl w:val="5"/>
+          <w:numId w:val="3"/>
+        </w:numPr>
+        <w:spacing w:after="240"/>
+        <w:contextualSpacing w:val="0"/>
+        <w:rPr>
+          <w:rFonts w:ascii="Arial" w:hAnsi="Arial" w:cs="Arial"/>
+        </w:rPr>
+      </w:pPr>
+      <w:r>
+        <w:rPr>
+          <w:rFonts w:ascii="Arial" w:hAnsi="Arial" w:cs="Arial"/>
+        </w:rPr>
+        <w:t xml:space="preserve">Consider using a Bayesian approach to model based clustering, since the analysis question above is directly related to clustering. Use an approach that allows us to measure the posterior (read Ch. 13 in </w:t>
+      </w:r>
+      <w:proofErr w:type="spellStart"/>
+      <w:r>
+        <w:rPr>
+          <w:rFonts w:ascii="Arial" w:hAnsi="Arial" w:cs="Arial"/>
+        </w:rPr>
+        <w:t>McElreath</w:t>
+      </w:r>
+      <w:proofErr w:type="spellEnd"/>
+      <w:r>
+        <w:rPr>
+          <w:rFonts w:ascii="Arial" w:hAnsi="Arial" w:cs="Arial"/>
+        </w:rPr>
+        <w:t xml:space="preserve"> book) as the magnitude of acoustic convergence at each social level</w:t>
+      </w:r>
+      <w:r>
+        <w:rPr>
+          <w:rFonts w:ascii="Arial" w:hAnsi="Arial" w:cs="Arial"/>
+        </w:rPr>
+        <w:t xml:space="preserve"> (possibly the Ch. 14 and 15 as well)</w:t>
+      </w:r>
+    </w:p>
+    <w:p>
+      <w:pPr>
+        <w:pStyle w:val="ListParagraph"/>
+        <w:numPr>
+          <w:ilvl w:val="5"/>
+          <w:numId w:val="3"/>
+        </w:numPr>
+        <w:spacing w:after="240"/>
+        <w:contextualSpacing w:val="0"/>
+        <w:rPr>
+          <w:rFonts w:ascii="Arial" w:hAnsi="Arial" w:cs="Arial"/>
+        </w:rPr>
+      </w:pPr>
+      <w:r>
+        <w:rPr>
+          <w:rFonts w:ascii="Arial" w:hAnsi="Arial" w:cs="Arial"/>
+        </w:rPr>
+        <w:t>How to get SPCC values into non-independent format for multilevel models? Is MDS appropriate? Rather than standard handpicked acoustic measurements and then PCA</w:t>
+      </w:r>
+    </w:p>
+    <w:p>
+      <w:pPr>
+        <w:pStyle w:val="ListParagraph"/>
+        <w:numPr>
+          <w:ilvl w:val="6"/>
+          <w:numId w:val="3"/>
+        </w:numPr>
+        <w:spacing w:after="240"/>
+        <w:contextualSpacing w:val="0"/>
+        <w:rPr>
+          <w:rFonts w:ascii="Arial" w:hAnsi="Arial" w:cs="Arial"/>
+        </w:rPr>
+      </w:pPr>
+      <w:r>
+        <w:rPr>
+          <w:rFonts w:ascii="Arial" w:hAnsi="Arial" w:cs="Arial"/>
+        </w:rPr>
+        <w:t xml:space="preserve">Multi-level model with varying intercepts: lets you model both an intercept per group as well as variation among groups. Ideally we want a model that allows us to do this for both the individual and group level, so we want a </w:t>
+      </w:r>
+      <w:r>
+        <w:rPr>
+          <w:rFonts w:ascii="Arial" w:hAnsi="Arial" w:cs="Arial"/>
+        </w:rPr>
+        <w:t>hierarchical</w:t>
+      </w:r>
+      <w:r>
+        <w:rPr>
+          <w:rFonts w:ascii="Arial" w:hAnsi="Arial" w:cs="Arial"/>
+        </w:rPr>
+        <w:t xml:space="preserve"> multilevel model (see Ch. 13.3 of Statistical Rethinking)</w:t>
+      </w:r>
+    </w:p>
+    <w:p>
+      <w:pPr>
+        <w:pStyle w:val="ListParagraph"/>
+        <w:numPr>
+          <w:ilvl w:val="7"/>
+          <w:numId w:val="3"/>
+        </w:numPr>
+        <w:spacing w:after="240"/>
+        <w:contextualSpacing w:val="0"/>
+        <w:rPr>
+          <w:rFonts w:ascii="Arial" w:hAnsi="Arial" w:cs="Arial"/>
+        </w:rPr>
+      </w:pPr>
+      <w:r>
+        <w:rPr>
+          <w:rFonts w:ascii="Arial" w:hAnsi="Arial" w:cs="Arial"/>
+        </w:rPr>
+        <w:t>Predictor</w:t>
+      </w:r>
+      <w:r>
+        <w:rPr>
+          <w:rFonts w:ascii="Arial" w:hAnsi="Arial" w:cs="Arial"/>
+        </w:rPr>
+        <w:t xml:space="preserve"> variable</w:t>
+      </w:r>
+      <w:r>
+        <w:rPr>
+          <w:rFonts w:ascii="Arial" w:hAnsi="Arial" w:cs="Arial"/>
+        </w:rPr>
+        <w:t>s</w:t>
+      </w:r>
+      <w:r>
+        <w:rPr>
+          <w:rFonts w:ascii="Arial" w:hAnsi="Arial" w:cs="Arial"/>
+        </w:rPr>
+        <w:t>:</w:t>
+      </w:r>
+      <w:r>
+        <w:rPr>
+          <w:rFonts w:ascii="Arial" w:hAnsi="Arial" w:cs="Arial"/>
+        </w:rPr>
+        <w:t xml:space="preserve"> individual identity and group identity</w:t>
+      </w:r>
+    </w:p>
+    <w:p>
+      <w:pPr>
+        <w:pStyle w:val="ListParagraph"/>
+        <w:numPr>
+          <w:ilvl w:val="7"/>
+          <w:numId w:val="3"/>
+        </w:numPr>
+        <w:spacing w:after="240"/>
+        <w:contextualSpacing w:val="0"/>
+        <w:rPr>
+          <w:rFonts w:ascii="Arial" w:hAnsi="Arial" w:cs="Arial"/>
+        </w:rPr>
+      </w:pPr>
+      <w:r>
+        <w:rPr>
+          <w:rFonts w:ascii="Arial" w:hAnsi="Arial" w:cs="Arial"/>
+        </w:rPr>
+        <w:t xml:space="preserve">Outcome to predict: </w:t>
+      </w:r>
+      <w:r>
+        <w:rPr>
+          <w:rFonts w:ascii="Arial" w:hAnsi="Arial" w:cs="Arial"/>
+        </w:rPr>
+        <w:t xml:space="preserve">First MDS dimension. MDS is a way of converting the non-independent SPCC similarity values to tabular format, in which each row represents an independent coordinate for each data point (e.g. call) in a low dimensional </w:t>
+      </w:r>
+      <w:r>
+        <w:rPr>
+          <w:rFonts w:ascii="Arial" w:hAnsi="Arial" w:cs="Arial"/>
+        </w:rPr>
+        <w:lastRenderedPageBreak/>
+        <w:t>space</w:t>
+      </w:r>
+      <w:r>
+        <w:rPr>
+          <w:rFonts w:ascii="Arial" w:hAnsi="Arial" w:cs="Arial"/>
+        </w:rPr>
+        <w:t>. Can also run a model for MDS dimension 2</w:t>
+      </w:r>
+    </w:p>
+    <w:p>
+      <w:pPr>
+        <w:pStyle w:val="ListParagraph"/>
+        <w:numPr>
+          <w:ilvl w:val="7"/>
+          <w:numId w:val="3"/>
+        </w:numPr>
+        <w:spacing w:after="240"/>
+        <w:contextualSpacing w:val="0"/>
+        <w:rPr>
+          <w:rFonts w:ascii="Arial" w:hAnsi="Arial" w:cs="Arial"/>
+        </w:rPr>
+      </w:pPr>
+      <w:r>
+        <w:rPr>
+          <w:rFonts w:ascii="Arial" w:hAnsi="Arial" w:cs="Arial"/>
+        </w:rPr>
+        <w:t xml:space="preserve">Actually reading up on using MDS as a response variable…seems dangerous </w:t>
+      </w:r>
+      <w:r>
+        <w:rPr>
+          <w:rFonts w:ascii="Arial" w:hAnsi="Arial" w:cs="Arial"/>
+        </w:rPr>
+        <w:t xml:space="preserve">to use a single dimension as a response variable, and possibly not meaningful to use MDS dimensions as predictors due to linear assumptions, definitely not ok to treat these dimensions as though they are the same as principal components (see this Stats Exchange </w:t>
+      </w:r>
+      <w:hyperlink r:id="rId6" w:history="1">
+        <w:r>
+          <w:rPr>
+            <w:rStyle w:val="Hyperlink"/>
+            <w:rFonts w:ascii="Arial" w:hAnsi="Arial" w:cs="Arial"/>
+          </w:rPr>
+          <w:t>discussion</w:t>
+        </w:r>
+      </w:hyperlink>
+      <w:r>
+        <w:rPr>
+          <w:rFonts w:ascii="Arial" w:hAnsi="Arial" w:cs="Arial"/>
+        </w:rPr>
+        <w:t>)</w:t>
+      </w:r>
+    </w:p>
+    <w:p>
+      <w:pPr>
+        <w:pStyle w:val="ListParagraph"/>
+        <w:numPr>
+          <w:ilvl w:val="7"/>
+          <w:numId w:val="3"/>
+        </w:numPr>
+        <w:spacing w:after="240"/>
+        <w:contextualSpacing w:val="0"/>
+        <w:rPr>
+          <w:rFonts w:ascii="Arial" w:hAnsi="Arial" w:cs="Arial"/>
+        </w:rPr>
+      </w:pPr>
+      <w:r>
+        <w:rPr>
+          <w:rFonts w:ascii="Arial" w:hAnsi="Arial" w:cs="Arial"/>
+        </w:rPr>
+        <w:t>If we use a model like this, we should stick to hand-picked acoustic measurements and using PCs as response variables</w:t>
+      </w:r>
+    </w:p>
+    <w:p>
+      <w:pPr>
+        <w:pStyle w:val="ListParagraph"/>
+        <w:numPr>
+          <w:ilvl w:val="6"/>
+          <w:numId w:val="3"/>
+        </w:numPr>
+        <w:spacing w:after="240"/>
+        <w:contextualSpacing w:val="0"/>
+        <w:rPr>
+          <w:rFonts w:ascii="Arial" w:hAnsi="Arial" w:cs="Arial"/>
+        </w:rPr>
+      </w:pPr>
+      <w:r>
+        <w:rPr>
+          <w:rFonts w:ascii="Arial" w:hAnsi="Arial" w:cs="Arial"/>
+        </w:rPr>
+        <w:t>Are there Bayesian matrix regression approaches similar to a Mantel test but which let you estimate means and variation at multiple levels?</w:t>
+      </w:r>
+    </w:p>
+    <w:p>
+      <w:pPr>
+        <w:pStyle w:val="ListParagraph"/>
+        <w:numPr>
+          <w:ilvl w:val="7"/>
+          <w:numId w:val="3"/>
+        </w:numPr>
+        <w:spacing w:after="240"/>
+        <w:contextualSpacing w:val="0"/>
+        <w:rPr>
+          <w:rFonts w:ascii="Arial" w:hAnsi="Arial" w:cs="Arial"/>
+        </w:rPr>
+      </w:pPr>
+      <w:r>
+        <w:rPr>
+          <w:rFonts w:ascii="Arial" w:hAnsi="Arial" w:cs="Arial"/>
+        </w:rPr>
+        <w:t xml:space="preserve">See this </w:t>
+      </w:r>
+      <w:hyperlink r:id="rId7" w:anchor="multilevel-correlation" w:history="1">
+        <w:r>
+          <w:rPr>
+            <w:rStyle w:val="Hyperlink"/>
+            <w:rFonts w:ascii="Arial" w:hAnsi="Arial" w:cs="Arial"/>
+          </w:rPr>
+          <w:t>data science post</w:t>
+        </w:r>
+      </w:hyperlink>
+      <w:r>
+        <w:rPr>
+          <w:rFonts w:ascii="Arial" w:hAnsi="Arial" w:cs="Arial"/>
+        </w:rPr>
+        <w:t xml:space="preserve"> on multi-level Bayesian correlation models with Pearson’s rho</w:t>
+      </w:r>
+    </w:p>
+    <w:p>
+      <w:pPr>
+        <w:pStyle w:val="ListParagraph"/>
+        <w:numPr>
+          <w:ilvl w:val="7"/>
+          <w:numId w:val="3"/>
+        </w:numPr>
+        <w:spacing w:after="240"/>
+        <w:contextualSpacing w:val="0"/>
+        <w:rPr>
+          <w:rFonts w:ascii="Arial" w:hAnsi="Arial" w:cs="Arial"/>
+        </w:rPr>
+      </w:pPr>
+      <w:r>
+        <w:rPr>
+          <w:rFonts w:ascii="Arial" w:hAnsi="Arial" w:cs="Arial"/>
+        </w:rPr>
+        <w:t>It might be possible to use these approaches with SPCC similarity matrices and binary identity matrices similar to Mantel tests, but these tests don’t have the permutation component of some Mantel test implementations, so the issue of non-independence remains</w:t>
+      </w:r>
+      <w:r>
+        <w:rPr>
+          <w:rFonts w:ascii="Arial" w:hAnsi="Arial" w:cs="Arial"/>
+        </w:rPr>
+        <w:t>…still looking into whether or not a Bayesian model can be built to predict a similarity score for a given comparison at different levels</w:t>
+      </w:r>
+      <w:r>
+        <w:rPr>
+          <w:rFonts w:ascii="Arial" w:hAnsi="Arial" w:cs="Arial"/>
+        </w:rPr>
+        <w:t xml:space="preserve"> of social organization</w:t>
+      </w:r>
+    </w:p>
+    <w:p>
+      <w:pPr>
+        <w:pStyle w:val="ListParagraph"/>
+        <w:numPr>
+          <w:ilvl w:val="4"/>
+          <w:numId w:val="3"/>
+        </w:numPr>
+        <w:spacing w:after="240"/>
+        <w:contextualSpacing w:val="0"/>
+        <w:rPr>
+          <w:rFonts w:ascii="Arial" w:hAnsi="Arial" w:cs="Arial"/>
+        </w:rPr>
+      </w:pPr>
+      <w:r>
+        <w:rPr>
+          <w:rFonts w:ascii="Arial" w:hAnsi="Arial" w:cs="Arial"/>
+        </w:rPr>
+        <w:t xml:space="preserve">These models allow us to address the statistical significance of the degree or magnitude of </w:t>
+      </w:r>
+      <w:r>
+        <w:rPr>
+          <w:rFonts w:ascii="Arial" w:hAnsi="Arial" w:cs="Arial"/>
+        </w:rPr>
+        <w:lastRenderedPageBreak/>
+        <w:t>convergence</w:t>
+      </w:r>
+      <w:r>
+        <w:rPr>
+          <w:rFonts w:ascii="Arial" w:hAnsi="Arial" w:cs="Arial"/>
+        </w:rPr>
+        <w:t xml:space="preserve"> (which we originally encoded using </w:t>
+      </w:r>
+      <w:proofErr w:type="spellStart"/>
+      <w:r>
+        <w:rPr>
+          <w:rFonts w:ascii="Arial" w:hAnsi="Arial" w:cs="Arial"/>
+        </w:rPr>
+        <w:t>paRsynth</w:t>
+      </w:r>
+      <w:proofErr w:type="spellEnd"/>
+      <w:r>
+        <w:rPr>
+          <w:rFonts w:ascii="Arial" w:hAnsi="Arial" w:cs="Arial"/>
+        </w:rPr>
+        <w:t>)</w:t>
+      </w:r>
+      <w:r>
+        <w:rPr>
+          <w:rFonts w:ascii="Arial" w:hAnsi="Arial" w:cs="Arial"/>
+        </w:rPr>
+        <w:t>. The inferential statistics layer to validate that the information we originally encoded can be recov</w:t>
+      </w:r>
+      <w:r>
+        <w:rPr>
+          <w:rFonts w:ascii="Arial" w:hAnsi="Arial" w:cs="Arial"/>
+        </w:rPr>
+        <w:t>er</w:t>
+      </w:r>
+      <w:r>
+        <w:rPr>
+          <w:rFonts w:ascii="Arial" w:hAnsi="Arial" w:cs="Arial"/>
+        </w:rPr>
+        <w:t>ed</w:t>
+      </w:r>
+    </w:p>
+    <w:p>
+      <w:pPr>
+        <w:pStyle w:val="ListParagraph"/>
+        <w:numPr>
+          <w:ilvl w:val="4"/>
+          <w:numId w:val="3"/>
+        </w:numPr>
+        <w:spacing w:after="240"/>
+        <w:contextualSpacing w:val="0"/>
+        <w:rPr>
+          <w:rFonts w:ascii="Arial" w:hAnsi="Arial" w:cs="Arial"/>
+        </w:rPr>
+      </w:pPr>
+      <w:r>
+        <w:rPr>
+          <w:rFonts w:ascii="Arial" w:hAnsi="Arial" w:cs="Arial"/>
+        </w:rPr>
+        <w:t>A receiver standpoint on information recovery, in which we simulated signaler information encoding</w:t>
+      </w:r>
+      <w:r>
+        <w:rPr>
+          <w:rFonts w:ascii="Arial" w:hAnsi="Arial" w:cs="Arial"/>
+        </w:rPr>
+        <w:t>. Does the variation that we encoded actually matter???</w:t>
+      </w:r>
+    </w:p>
+    <w:p>
+      <w:pPr>
+        <w:pStyle w:val="ListParagraph"/>
+        <w:numPr>
+          <w:ilvl w:val="3"/>
+          <w:numId w:val="3"/>
+        </w:numPr>
+        <w:spacing w:after="240"/>
+        <w:contextualSpacing w:val="0"/>
+        <w:rPr>
+          <w:rFonts w:ascii="Arial" w:hAnsi="Arial" w:cs="Arial"/>
+        </w:rPr>
+      </w:pPr>
+      <w:r>
+        <w:rPr>
+          <w:rFonts w:ascii="Arial" w:hAnsi="Arial" w:cs="Arial"/>
+        </w:rPr>
+        <w:t xml:space="preserve">Because we have repeated sampling at both social levels with known </w:t>
+      </w:r>
+      <w:r>
+        <w:rPr>
+          <w:rFonts w:ascii="Arial" w:hAnsi="Arial" w:cs="Arial"/>
+        </w:rPr>
+        <w:t xml:space="preserve">individuals, we can actually model variation in convergence within and between categories (individuals, groups) </w:t>
+      </w:r>
+      <w:r>
+        <w:rPr>
+          <w:rFonts w:ascii="Arial" w:hAnsi="Arial" w:cs="Arial"/>
+        </w:rPr>
+        <w:t>at each social level</w:t>
       </w:r>
     </w:p>
     <w:p>
@@ -1279,34 +2353,318 @@
         <w:rPr>
           <w:rFonts w:ascii="Arial" w:hAnsi="Arial" w:cs="Arial"/>
         </w:rPr>
-        <w:t xml:space="preserve">Social environment variation (number of groups and individuals), information encoding at two social levels </w:t>
-      </w:r>
-    </w:p>
-    <w:p>
-      <w:pPr>
-        <w:pStyle w:val="ListParagraph"/>
-        <w:numPr>
-          <w:ilvl w:val="2"/>
-          <w:numId w:val="3"/>
-        </w:numPr>
-        <w:spacing w:after="240"/>
-        <w:contextualSpacing w:val="0"/>
-        <w:rPr>
-          <w:rFonts w:ascii="Arial" w:hAnsi="Arial" w:cs="Arial"/>
-        </w:rPr>
-      </w:pPr>
-      <w:r>
-        <w:rPr>
-          <w:rFonts w:ascii="Arial" w:hAnsi="Arial" w:cs="Arial"/>
-        </w:rPr>
-        <w:t>Set some upper maximum for total number of SPCC comparisons, think about this. For some social environment treatments, subsample a single call per individual</w:t>
-      </w:r>
-    </w:p>
-    <w:p>
-      <w:pPr>
-        <w:pStyle w:val="ListParagraph"/>
-        <w:numPr>
-          <w:ilvl w:val="2"/>
+        <w:t>Frequency contour tracing</w:t>
+      </w:r>
+      <w:r>
+        <w:rPr>
+          <w:rFonts w:ascii="Arial" w:hAnsi="Arial" w:cs="Arial"/>
+        </w:rPr>
+        <w:t xml:space="preserve"> based</w:t>
+      </w:r>
+      <w:r>
+        <w:rPr>
+          <w:rFonts w:ascii="Arial" w:hAnsi="Arial" w:cs="Arial"/>
+        </w:rPr>
+        <w:t xml:space="preserve"> (</w:t>
+      </w:r>
+      <w:r>
+        <w:rPr>
+          <w:rFonts w:ascii="Arial" w:hAnsi="Arial" w:cs="Arial"/>
+        </w:rPr>
+        <w:t>b</w:t>
+      </w:r>
+      <w:r>
+        <w:rPr>
+          <w:rFonts w:ascii="Arial" w:hAnsi="Arial" w:cs="Arial"/>
+        </w:rPr>
+        <w:t>ecause we are encoding information in frequency modulation patterns</w:t>
+      </w:r>
+      <w:r>
+        <w:rPr>
+          <w:rFonts w:ascii="Arial" w:hAnsi="Arial" w:cs="Arial"/>
+        </w:rPr>
+        <w:t>)</w:t>
+      </w:r>
+    </w:p>
+    <w:p>
+      <w:pPr>
+        <w:pStyle w:val="ListParagraph"/>
+        <w:numPr>
+          <w:ilvl w:val="3"/>
+          <w:numId w:val="3"/>
+        </w:numPr>
+        <w:spacing w:after="240"/>
+        <w:contextualSpacing w:val="0"/>
+        <w:rPr>
+          <w:rFonts w:ascii="Arial" w:hAnsi="Arial" w:cs="Arial"/>
+        </w:rPr>
+      </w:pPr>
+      <w:r>
+        <w:rPr>
+          <w:rFonts w:ascii="Arial" w:hAnsi="Arial" w:cs="Arial"/>
+        </w:rPr>
+        <w:t>Frequency contour extraction</w:t>
+      </w:r>
+      <w:r>
+        <w:rPr>
+          <w:rFonts w:ascii="Arial" w:hAnsi="Arial" w:cs="Arial"/>
+        </w:rPr>
+        <w:t xml:space="preserve"> with semi-automated approaches</w:t>
+      </w:r>
+      <w:r>
+        <w:rPr>
+          <w:rFonts w:ascii="Arial" w:hAnsi="Arial" w:cs="Arial"/>
+        </w:rPr>
+        <w:t>: easily the hardest part of this pipeline because it can be very time-consuming and subjective</w:t>
+      </w:r>
+    </w:p>
+    <w:p>
+      <w:pPr>
+        <w:pStyle w:val="ListParagraph"/>
+        <w:numPr>
+          <w:ilvl w:val="4"/>
+          <w:numId w:val="3"/>
+        </w:numPr>
+        <w:spacing w:after="240"/>
+        <w:contextualSpacing w:val="0"/>
+        <w:rPr>
+          <w:rFonts w:ascii="Arial" w:hAnsi="Arial" w:cs="Arial"/>
+        </w:rPr>
+      </w:pPr>
+      <w:r>
+        <w:rPr>
+          <w:rFonts w:ascii="Arial" w:hAnsi="Arial" w:cs="Arial"/>
+        </w:rPr>
+        <w:t>We would only run this analysis with a subsample of the audio files and experimental treatments</w:t>
+      </w:r>
+    </w:p>
+    <w:p>
+      <w:pPr>
+        <w:pStyle w:val="ListParagraph"/>
+        <w:numPr>
+          <w:ilvl w:val="4"/>
+          <w:numId w:val="3"/>
+        </w:numPr>
+        <w:spacing w:after="240"/>
+        <w:contextualSpacing w:val="0"/>
+        <w:rPr>
+          <w:rFonts w:ascii="Arial" w:hAnsi="Arial" w:cs="Arial"/>
+        </w:rPr>
+      </w:pPr>
+      <w:r>
+        <w:rPr>
+          <w:rFonts w:ascii="Arial" w:hAnsi="Arial" w:cs="Arial"/>
+        </w:rPr>
+        <w:t>Pilot frequency contour tracing:</w:t>
+      </w:r>
+    </w:p>
+    <w:p>
+      <w:pPr>
+        <w:pStyle w:val="ListParagraph"/>
+        <w:numPr>
+          <w:ilvl w:val="4"/>
+          <w:numId w:val="3"/>
+        </w:numPr>
+        <w:spacing w:after="240"/>
+        <w:contextualSpacing w:val="0"/>
+        <w:rPr>
+          <w:rFonts w:ascii="Arial" w:hAnsi="Arial" w:cs="Arial"/>
+        </w:rPr>
+      </w:pPr>
+      <w:proofErr w:type="spellStart"/>
+      <w:r>
+        <w:rPr>
+          <w:rFonts w:ascii="Arial" w:hAnsi="Arial" w:cs="Arial"/>
+        </w:rPr>
+        <w:t>soundgen</w:t>
+      </w:r>
+      <w:proofErr w:type="spellEnd"/>
+      <w:r>
+        <w:rPr>
+          <w:rFonts w:ascii="Arial" w:hAnsi="Arial" w:cs="Arial"/>
+        </w:rPr>
+        <w:t>::</w:t>
+      </w:r>
+      <w:proofErr w:type="spellStart"/>
+      <w:r>
+        <w:rPr>
+          <w:rFonts w:ascii="Arial" w:hAnsi="Arial" w:cs="Arial"/>
+        </w:rPr>
+        <w:t>soundgen</w:t>
+      </w:r>
+      <w:proofErr w:type="spellEnd"/>
+      <w:r>
+        <w:rPr>
+          <w:rFonts w:ascii="Arial" w:hAnsi="Arial" w:cs="Arial"/>
+        </w:rPr>
+        <w:t>()</w:t>
+      </w:r>
+      <w:r>
+        <w:rPr>
+          <w:rFonts w:ascii="Arial" w:hAnsi="Arial" w:cs="Arial"/>
+        </w:rPr>
+        <w:t>, test whether frequency contours are accurate</w:t>
+      </w:r>
+    </w:p>
+    <w:p>
+      <w:pPr>
+        <w:pStyle w:val="ListParagraph"/>
+        <w:numPr>
+          <w:ilvl w:val="4"/>
+          <w:numId w:val="3"/>
+        </w:numPr>
+        <w:spacing w:after="240"/>
+        <w:contextualSpacing w:val="0"/>
+        <w:rPr>
+          <w:rFonts w:ascii="Arial" w:hAnsi="Arial" w:cs="Arial"/>
+        </w:rPr>
+      </w:pPr>
+      <w:r>
+        <w:rPr>
+          <w:rFonts w:ascii="Arial" w:hAnsi="Arial" w:cs="Arial"/>
+        </w:rPr>
+        <w:t xml:space="preserve">Create spectrograms for 50 audio files, feed them to </w:t>
+      </w:r>
+      <w:proofErr w:type="spellStart"/>
+      <w:r>
+        <w:rPr>
+          <w:rFonts w:ascii="Arial" w:hAnsi="Arial" w:cs="Arial"/>
+        </w:rPr>
+        <w:t>soundgen</w:t>
+      </w:r>
+      <w:proofErr w:type="spellEnd"/>
+      <w:r>
+        <w:rPr>
+          <w:rFonts w:ascii="Arial" w:hAnsi="Arial" w:cs="Arial"/>
+        </w:rPr>
+        <w:t xml:space="preserve"> using code that Grace has already to pull out the estimated fundamental frequency contour, create spectrograms again with the frequency contour overlaid to check the accuracy of the tracing</w:t>
+      </w:r>
+    </w:p>
+    <w:p>
+      <w:pPr>
+        <w:pStyle w:val="ListParagraph"/>
+        <w:numPr>
+          <w:ilvl w:val="5"/>
+          <w:numId w:val="3"/>
+        </w:numPr>
+        <w:spacing w:after="240"/>
+        <w:contextualSpacing w:val="0"/>
+        <w:rPr>
+          <w:rFonts w:ascii="Arial" w:hAnsi="Arial" w:cs="Arial"/>
+        </w:rPr>
+      </w:pPr>
+      <w:r>
+        <w:rPr>
+          <w:rFonts w:ascii="Arial" w:hAnsi="Arial" w:cs="Arial"/>
+        </w:rPr>
+        <w:t>When I’ve done the latter in warbler the frequency contours are always off</w:t>
+      </w:r>
+    </w:p>
+    <w:p>
+      <w:pPr>
+        <w:pStyle w:val="ListParagraph"/>
+        <w:numPr>
+          <w:ilvl w:val="5"/>
+          <w:numId w:val="3"/>
+        </w:numPr>
+        <w:spacing w:after="240"/>
+        <w:contextualSpacing w:val="0"/>
+        <w:rPr>
+          <w:rFonts w:ascii="Arial" w:hAnsi="Arial" w:cs="Arial"/>
+        </w:rPr>
+      </w:pPr>
+      <w:r>
+        <w:rPr>
+          <w:rFonts w:ascii="Arial" w:hAnsi="Arial" w:cs="Arial"/>
+        </w:rPr>
+        <w:t xml:space="preserve">But when I create spectrograms in </w:t>
+      </w:r>
+      <w:proofErr w:type="spellStart"/>
+      <w:r>
+        <w:rPr>
+          <w:rFonts w:ascii="Arial" w:hAnsi="Arial" w:cs="Arial"/>
+        </w:rPr>
+        <w:t>soundgen</w:t>
+      </w:r>
+      <w:proofErr w:type="spellEnd"/>
+      <w:r>
+        <w:rPr>
+          <w:rFonts w:ascii="Arial" w:hAnsi="Arial" w:cs="Arial"/>
+        </w:rPr>
+        <w:t>, the contours look great</w:t>
+      </w:r>
+    </w:p>
+    <w:p>
+      <w:pPr>
+        <w:pStyle w:val="ListParagraph"/>
+        <w:numPr>
+          <w:ilvl w:val="4"/>
+          <w:numId w:val="3"/>
+        </w:numPr>
+        <w:spacing w:after="240"/>
+        <w:contextualSpacing w:val="0"/>
+        <w:rPr>
+          <w:rFonts w:ascii="Arial" w:hAnsi="Arial" w:cs="Arial"/>
+        </w:rPr>
+      </w:pPr>
+      <w:proofErr w:type="spellStart"/>
+      <w:r>
+        <w:rPr>
+          <w:rFonts w:ascii="Arial" w:hAnsi="Arial" w:cs="Arial"/>
+        </w:rPr>
+        <w:t>Soundgen</w:t>
+      </w:r>
+      <w:proofErr w:type="spellEnd"/>
+      <w:r>
+        <w:rPr>
+          <w:rFonts w:ascii="Arial" w:hAnsi="Arial" w:cs="Arial"/>
+        </w:rPr>
+        <w:t xml:space="preserve"> has a Shiny app in which you can upload audio files and do manual correction of the frequency contour online</w:t>
+      </w:r>
+      <w:r>
+        <w:rPr>
+          <w:rFonts w:ascii="Arial" w:hAnsi="Arial" w:cs="Arial"/>
+        </w:rPr>
+        <w:t xml:space="preserve"> (semi-automated)</w:t>
+      </w:r>
+    </w:p>
+    <w:p>
+      <w:pPr>
+        <w:pStyle w:val="ListParagraph"/>
+        <w:numPr>
+          <w:ilvl w:val="3"/>
+          <w:numId w:val="3"/>
+        </w:numPr>
+        <w:spacing w:after="240"/>
+        <w:contextualSpacing w:val="0"/>
+        <w:rPr>
+          <w:rFonts w:ascii="Arial" w:hAnsi="Arial" w:cs="Arial"/>
+        </w:rPr>
+      </w:pPr>
+      <w:r>
+        <w:rPr>
+          <w:rFonts w:ascii="Arial" w:hAnsi="Arial" w:cs="Arial"/>
+        </w:rPr>
+        <w:t>Dynamic time warping</w:t>
+      </w:r>
+      <w:r>
+        <w:rPr>
+          <w:rFonts w:ascii="Arial" w:hAnsi="Arial" w:cs="Arial"/>
+        </w:rPr>
+        <w:t xml:space="preserve"> (DTW)</w:t>
+      </w:r>
+      <w:r>
+        <w:rPr>
+          <w:rFonts w:ascii="Arial" w:hAnsi="Arial" w:cs="Arial"/>
+        </w:rPr>
+        <w:t xml:space="preserve"> to compare the time series of the frequency contours</w:t>
+      </w:r>
+    </w:p>
+    <w:p>
+      <w:pPr>
+        <w:pStyle w:val="ListParagraph"/>
+        <w:numPr>
+          <w:ilvl w:val="3"/>
           <w:numId w:val="3"/>
         </w:numPr>
         <w:spacing w:after="240"/>
@@ -1320,105 +2678,91 @@
           <w:rFonts w:ascii="Arial" w:hAnsi="Arial" w:cs="Arial"/>
         </w:rPr>
         <w:lastRenderedPageBreak/>
-        <w:t xml:space="preserve">Or add a subsampling approach to this paper? Keep thinking about this, because Bayesian modeling of group and individual level variation is </w:t>
-      </w:r>
-      <w:proofErr w:type="gramStart"/>
-      <w:r>
-        <w:rPr>
-          <w:rFonts w:ascii="Arial" w:hAnsi="Arial" w:cs="Arial"/>
-        </w:rPr>
-        <w:t>really useful</w:t>
-      </w:r>
-      <w:proofErr w:type="gramEnd"/>
-      <w:r>
-        <w:rPr>
-          <w:rFonts w:ascii="Arial" w:hAnsi="Arial" w:cs="Arial"/>
-        </w:rPr>
-        <w:t xml:space="preserve"> and use fewer numbers of groups and individuals in the social environment</w:t>
-      </w:r>
-    </w:p>
-    <w:p>
-      <w:pPr>
-        <w:pStyle w:val="ListParagraph"/>
-        <w:numPr>
-          <w:ilvl w:val="1"/>
-          <w:numId w:val="3"/>
-        </w:numPr>
-        <w:spacing w:after="240"/>
-        <w:contextualSpacing w:val="0"/>
-        <w:rPr>
-          <w:rFonts w:ascii="Arial" w:hAnsi="Arial" w:cs="Arial"/>
-        </w:rPr>
-      </w:pPr>
-      <w:r>
-        <w:rPr>
-          <w:rFonts w:ascii="Arial" w:hAnsi="Arial" w:cs="Arial"/>
-        </w:rPr>
-        <w:t>Create the synthetic call datasets</w:t>
-      </w:r>
-      <w:r>
-        <w:rPr>
-          <w:rFonts w:ascii="Arial" w:hAnsi="Arial" w:cs="Arial"/>
-        </w:rPr>
-        <w:t xml:space="preserve"> </w:t>
-      </w:r>
-      <w:r>
-        <w:rPr>
-          <w:rFonts w:ascii="Arial" w:hAnsi="Arial" w:cs="Arial"/>
-        </w:rPr>
-        <w:t xml:space="preserve">with </w:t>
+        <w:t xml:space="preserve">Run </w:t>
+      </w:r>
+      <w:r>
+        <w:rPr>
+          <w:rFonts w:ascii="Arial" w:hAnsi="Arial" w:cs="Arial"/>
+        </w:rPr>
+        <w:t xml:space="preserve">univariate </w:t>
+      </w:r>
+      <w:r>
+        <w:rPr>
+          <w:rFonts w:ascii="Arial" w:hAnsi="Arial" w:cs="Arial"/>
+        </w:rPr>
+        <w:t>DTW</w:t>
+      </w:r>
+      <w:r>
+        <w:rPr>
+          <w:rFonts w:ascii="Arial" w:hAnsi="Arial" w:cs="Arial"/>
+        </w:rPr>
+        <w:t xml:space="preserve"> on the fundamental frequency contours</w:t>
+      </w:r>
+      <w:r>
+        <w:rPr>
+          <w:rFonts w:ascii="Arial" w:hAnsi="Arial" w:cs="Arial"/>
+        </w:rPr>
+        <w:t xml:space="preserve"> using code that Grace has </w:t>
+      </w:r>
+      <w:r>
+        <w:rPr>
+          <w:rFonts w:ascii="Arial" w:hAnsi="Arial" w:cs="Arial"/>
+        </w:rPr>
+        <w:t xml:space="preserve">used with the </w:t>
       </w:r>
       <w:proofErr w:type="spellStart"/>
       <w:r>
         <w:rPr>
           <w:rFonts w:ascii="Arial" w:hAnsi="Arial" w:cs="Arial"/>
         </w:rPr>
-        <w:t>paRsynth</w:t>
+        <w:t>dtw</w:t>
       </w:r>
       <w:proofErr w:type="spellEnd"/>
       <w:r>
         <w:rPr>
           <w:rFonts w:ascii="Arial" w:hAnsi="Arial" w:cs="Arial"/>
         </w:rPr>
-        <w:t xml:space="preserve"> (character strings and metadata to audio files)</w:t>
-      </w:r>
-    </w:p>
-    <w:p>
-      <w:pPr>
-        <w:pStyle w:val="ListParagraph"/>
-        <w:numPr>
-          <w:ilvl w:val="1"/>
-          <w:numId w:val="3"/>
-        </w:numPr>
-        <w:spacing w:after="240"/>
-        <w:contextualSpacing w:val="0"/>
-        <w:rPr>
-          <w:rFonts w:ascii="Arial" w:hAnsi="Arial" w:cs="Arial"/>
-        </w:rPr>
-      </w:pPr>
-      <w:r>
-        <w:rPr>
-          <w:rFonts w:ascii="Arial" w:hAnsi="Arial" w:cs="Arial"/>
-        </w:rPr>
-        <w:t>SPCC</w:t>
-      </w:r>
-      <w:r>
-        <w:rPr>
-          <w:rFonts w:ascii="Arial" w:hAnsi="Arial" w:cs="Arial"/>
-        </w:rPr>
-        <w:t>-based</w:t>
-      </w:r>
-      <w:r>
-        <w:rPr>
-          <w:rFonts w:ascii="Arial" w:hAnsi="Arial" w:cs="Arial"/>
-        </w:rPr>
-        <w:t xml:space="preserve"> </w:t>
-      </w:r>
-      <w:r>
-        <w:rPr>
-          <w:rFonts w:ascii="Arial" w:hAnsi="Arial" w:cs="Arial"/>
-        </w:rPr>
-        <w:t>(a mix of traditional bioacoustics tools and information theory perspective</w:t>
+        <w:t xml:space="preserve"> package in R</w:t>
+      </w:r>
+    </w:p>
+    <w:p>
+      <w:pPr>
+        <w:pStyle w:val="ListParagraph"/>
+        <w:numPr>
+          <w:ilvl w:val="3"/>
+          <w:numId w:val="3"/>
+        </w:numPr>
+        <w:spacing w:after="240"/>
+        <w:contextualSpacing w:val="0"/>
+        <w:rPr>
+          <w:rFonts w:ascii="Arial" w:hAnsi="Arial" w:cs="Arial"/>
+        </w:rPr>
+      </w:pPr>
+      <w:r>
+        <w:rPr>
+          <w:rFonts w:ascii="Arial" w:hAnsi="Arial" w:cs="Arial"/>
+        </w:rPr>
+        <w:t>Returns a distance matrix that can be used in downstream analysis</w:t>
+      </w:r>
+    </w:p>
+    <w:p>
+      <w:pPr>
+        <w:pStyle w:val="ListParagraph"/>
+        <w:numPr>
+          <w:ilvl w:val="3"/>
+          <w:numId w:val="3"/>
+        </w:numPr>
+        <w:spacing w:after="240"/>
+        <w:contextualSpacing w:val="0"/>
+        <w:rPr>
+          <w:rFonts w:ascii="Arial" w:hAnsi="Arial" w:cs="Arial"/>
+        </w:rPr>
+      </w:pPr>
+      <w:r>
+        <w:rPr>
+          <w:rFonts w:ascii="Arial" w:hAnsi="Arial" w:cs="Arial"/>
+        </w:rPr>
+        <w:t>Multi-dimensional scaling acoustic space, clustering and Normalized Mutual Information</w:t>
       </w:r>
       <w:r>
         <w:rPr>
@@ -1430,89 +2774,13 @@
         <w:rPr>
           <w:rFonts w:ascii="Arial" w:hAnsi="Arial" w:cs="Arial"/>
         </w:rPr>
-        <w:t>plus newer tools for inferential statistics</w:t>
-      </w:r>
-      <w:r>
-        <w:rPr>
-          <w:rFonts w:ascii="Arial" w:hAnsi="Arial" w:cs="Arial"/>
-        </w:rPr>
-        <w:t>)</w:t>
-      </w:r>
-      <w:r>
-        <w:rPr>
-          <w:rFonts w:ascii="Arial" w:hAnsi="Arial" w:cs="Arial"/>
-        </w:rPr>
-        <w:t>:</w:t>
-      </w:r>
-    </w:p>
-    <w:p>
-      <w:pPr>
-        <w:pStyle w:val="ListParagraph"/>
-        <w:numPr>
-          <w:ilvl w:val="2"/>
-          <w:numId w:val="3"/>
-        </w:numPr>
-        <w:spacing w:after="240"/>
-        <w:contextualSpacing w:val="0"/>
-        <w:rPr>
-          <w:rFonts w:ascii="Arial" w:hAnsi="Arial" w:cs="Arial"/>
-        </w:rPr>
-      </w:pPr>
-      <w:r>
-        <w:rPr>
-          <w:rFonts w:ascii="Arial" w:hAnsi="Arial" w:cs="Arial"/>
-        </w:rPr>
-        <w:t>Run SPCC</w:t>
-      </w:r>
-      <w:r>
-        <w:rPr>
-          <w:rFonts w:ascii="Arial" w:hAnsi="Arial" w:cs="Arial"/>
-        </w:rPr>
-        <w:t xml:space="preserve"> to measure acoustic similarity of all calls in the dataset generated for a given set of experimental treatments</w:t>
-      </w:r>
-    </w:p>
-    <w:p>
-      <w:pPr>
-        <w:pStyle w:val="ListParagraph"/>
-        <w:numPr>
-          <w:ilvl w:val="2"/>
-          <w:numId w:val="3"/>
-        </w:numPr>
-        <w:spacing w:after="240"/>
-        <w:contextualSpacing w:val="0"/>
-        <w:rPr>
-          <w:rFonts w:ascii="Arial" w:hAnsi="Arial" w:cs="Arial"/>
-        </w:rPr>
-      </w:pPr>
-      <w:r>
-        <w:rPr>
-          <w:rFonts w:ascii="Arial" w:hAnsi="Arial" w:cs="Arial"/>
-        </w:rPr>
-        <w:t>Reduce</w:t>
-      </w:r>
-      <w:r>
-        <w:rPr>
-          <w:rFonts w:ascii="Arial" w:hAnsi="Arial" w:cs="Arial"/>
-        </w:rPr>
-        <w:t xml:space="preserve"> dimensionality of the SPCC matrix with </w:t>
-      </w:r>
-      <w:r>
-        <w:rPr>
-          <w:rFonts w:ascii="Arial" w:hAnsi="Arial" w:cs="Arial"/>
-        </w:rPr>
-        <w:t>m</w:t>
-      </w:r>
-      <w:r>
-        <w:rPr>
-          <w:rFonts w:ascii="Arial" w:hAnsi="Arial" w:cs="Arial"/>
-        </w:rPr>
-        <w:t xml:space="preserve">ulti-dimensional scaling </w:t>
-      </w:r>
-      <w:r>
-        <w:rPr>
-          <w:rFonts w:ascii="Arial" w:hAnsi="Arial" w:cs="Arial"/>
-        </w:rPr>
-        <w:t>acoustic space</w:t>
+        <w:t xml:space="preserve">Bayesian hierarchical </w:t>
+      </w:r>
+      <w:r>
+        <w:rPr>
+          <w:rFonts w:ascii="Arial" w:hAnsi="Arial" w:cs="Arial"/>
+        </w:rPr>
+        <w:t>models</w:t>
       </w:r>
     </w:p>
     <w:p>
@@ -1532,969 +2800,7 @@
         <w:rPr>
           <w:rFonts w:ascii="Arial" w:hAnsi="Arial" w:cs="Arial"/>
         </w:rPr>
-        <w:t>Use a high number of dimensions for the MDS solution that reduces stress to &lt;= 5%</w:t>
-      </w:r>
-    </w:p>
-    <w:p>
-      <w:pPr>
-        <w:pStyle w:val="ListParagraph"/>
-        <w:numPr>
-          <w:ilvl w:val="2"/>
-          <w:numId w:val="3"/>
-        </w:numPr>
-        <w:spacing w:after="240"/>
-        <w:contextualSpacing w:val="0"/>
-        <w:rPr>
-          <w:rFonts w:ascii="Arial" w:hAnsi="Arial" w:cs="Arial"/>
-        </w:rPr>
-      </w:pPr>
-      <w:r>
-        <w:rPr>
-          <w:rFonts w:ascii="Arial" w:hAnsi="Arial" w:cs="Arial"/>
-        </w:rPr>
-        <w:t>Run k-means or other unsupervised c</w:t>
-      </w:r>
-      <w:r>
-        <w:rPr>
-          <w:rFonts w:ascii="Arial" w:hAnsi="Arial" w:cs="Arial"/>
-        </w:rPr>
-        <w:t xml:space="preserve">lustering </w:t>
-      </w:r>
-      <w:r>
-        <w:rPr>
-          <w:rFonts w:ascii="Arial" w:hAnsi="Arial" w:cs="Arial"/>
-        </w:rPr>
-        <w:t xml:space="preserve">on the first </w:t>
-      </w:r>
-      <w:r>
-        <w:rPr>
-          <w:rFonts w:ascii="Arial" w:hAnsi="Arial" w:cs="Arial"/>
-        </w:rPr>
-        <w:t>2 MDS dimensions</w:t>
-      </w:r>
-    </w:p>
-    <w:p>
-      <w:pPr>
-        <w:pStyle w:val="ListParagraph"/>
-        <w:numPr>
-          <w:ilvl w:val="2"/>
-          <w:numId w:val="3"/>
-        </w:numPr>
-        <w:spacing w:after="240"/>
-        <w:contextualSpacing w:val="0"/>
-        <w:rPr>
-          <w:rFonts w:ascii="Arial" w:hAnsi="Arial" w:cs="Arial"/>
-        </w:rPr>
-      </w:pPr>
-      <w:r>
-        <w:rPr>
-          <w:rFonts w:ascii="Arial" w:hAnsi="Arial" w:cs="Arial"/>
-        </w:rPr>
-        <w:t xml:space="preserve">Compute </w:t>
-      </w:r>
-      <w:r>
-        <w:rPr>
-          <w:rFonts w:ascii="Arial" w:hAnsi="Arial" w:cs="Arial"/>
-        </w:rPr>
-        <w:t>Normalized Mutual</w:t>
-      </w:r>
-      <w:r>
-        <w:rPr>
-          <w:rFonts w:ascii="Arial" w:hAnsi="Arial" w:cs="Arial"/>
-        </w:rPr>
-        <w:t xml:space="preserve"> Information </w:t>
-      </w:r>
-      <w:r>
-        <w:rPr>
-          <w:rFonts w:ascii="Arial" w:hAnsi="Arial" w:cs="Arial"/>
-        </w:rPr>
-        <w:t>between the cluster labels</w:t>
-      </w:r>
-      <w:r>
-        <w:rPr>
-          <w:rFonts w:ascii="Arial" w:hAnsi="Arial" w:cs="Arial"/>
-        </w:rPr>
-        <w:t xml:space="preserve"> and the original labels at each social level</w:t>
-      </w:r>
-    </w:p>
-    <w:p>
-      <w:pPr>
-        <w:pStyle w:val="ListParagraph"/>
-        <w:numPr>
-          <w:ilvl w:val="3"/>
-          <w:numId w:val="3"/>
-        </w:numPr>
-        <w:spacing w:after="240"/>
-        <w:contextualSpacing w:val="0"/>
-        <w:rPr>
-          <w:rFonts w:ascii="Arial" w:hAnsi="Arial" w:cs="Arial"/>
-        </w:rPr>
-      </w:pPr>
-      <w:r>
-        <w:rPr>
-          <w:rFonts w:ascii="Arial" w:hAnsi="Arial" w:cs="Arial"/>
-        </w:rPr>
-        <w:t xml:space="preserve">NMI should be calculated </w:t>
-      </w:r>
-      <w:r>
-        <w:rPr>
-          <w:rFonts w:ascii="Arial" w:hAnsi="Arial" w:cs="Arial"/>
-        </w:rPr>
-        <w:t>in 3 ways: group-level (original group IDs)</w:t>
-      </w:r>
-      <w:r>
-        <w:rPr>
-          <w:rFonts w:ascii="Arial" w:hAnsi="Arial" w:cs="Arial"/>
-        </w:rPr>
-        <w:t xml:space="preserve">, individuals within groups </w:t>
-      </w:r>
-      <w:r>
-        <w:rPr>
-          <w:rFonts w:ascii="Arial" w:hAnsi="Arial" w:cs="Arial"/>
-        </w:rPr>
-        <w:t>(</w:t>
-      </w:r>
-      <w:r>
-        <w:rPr>
-          <w:rFonts w:ascii="Arial" w:hAnsi="Arial" w:cs="Arial"/>
-        </w:rPr>
-        <w:t>NMI at the individual level within groups</w:t>
-      </w:r>
-      <w:r>
-        <w:rPr>
-          <w:rFonts w:ascii="Arial" w:hAnsi="Arial" w:cs="Arial"/>
-        </w:rPr>
-        <w:t>)</w:t>
-      </w:r>
-      <w:r>
-        <w:rPr>
-          <w:rFonts w:ascii="Arial" w:hAnsi="Arial" w:cs="Arial"/>
-        </w:rPr>
-        <w:t>, all individuals (group plus individual ID as a unique identifier)</w:t>
-      </w:r>
-      <w:r>
-        <w:rPr>
-          <w:rFonts w:ascii="Arial" w:hAnsi="Arial" w:cs="Arial"/>
-        </w:rPr>
-        <w:t>. Keep thinking about the last calculation, since it doesn’t follow the original information encoding logic in which individuals are unique within groups</w:t>
-      </w:r>
-    </w:p>
-    <w:p>
-      <w:pPr>
-        <w:pStyle w:val="ListParagraph"/>
-        <w:numPr>
-          <w:ilvl w:val="2"/>
-          <w:numId w:val="3"/>
-        </w:numPr>
-        <w:spacing w:after="240"/>
-        <w:contextualSpacing w:val="0"/>
-        <w:rPr>
-          <w:rFonts w:ascii="Arial" w:hAnsi="Arial" w:cs="Arial"/>
-        </w:rPr>
-      </w:pPr>
-      <w:r>
-        <w:rPr>
-          <w:rFonts w:ascii="Arial" w:hAnsi="Arial" w:cs="Arial"/>
-        </w:rPr>
-        <w:t>Bayesian hierarchical models</w:t>
-      </w:r>
-      <w:r>
-        <w:rPr>
-          <w:rFonts w:ascii="Arial" w:hAnsi="Arial" w:cs="Arial"/>
-        </w:rPr>
-        <w:t xml:space="preserve"> for inferential statistics</w:t>
-      </w:r>
-      <w:r>
-        <w:rPr>
-          <w:rFonts w:ascii="Arial" w:hAnsi="Arial" w:cs="Arial"/>
-        </w:rPr>
-        <w:t xml:space="preserve"> (TODO)</w:t>
-      </w:r>
-    </w:p>
-    <w:p>
-      <w:pPr>
-        <w:pStyle w:val="ListParagraph"/>
-        <w:numPr>
-          <w:ilvl w:val="3"/>
-          <w:numId w:val="3"/>
-        </w:numPr>
-        <w:spacing w:after="240"/>
-        <w:contextualSpacing w:val="0"/>
-        <w:rPr>
-          <w:rFonts w:ascii="Arial" w:hAnsi="Arial" w:cs="Arial"/>
-        </w:rPr>
-      </w:pPr>
-      <w:r>
-        <w:rPr>
-          <w:rFonts w:ascii="Arial" w:hAnsi="Arial" w:cs="Arial"/>
-        </w:rPr>
-        <w:t xml:space="preserve">Ask whether acoustic convergence is statistically significant at each social level </w:t>
-      </w:r>
-      <w:r>
-        <w:rPr>
-          <w:rFonts w:ascii="Arial" w:hAnsi="Arial" w:cs="Arial"/>
-        </w:rPr>
-        <w:t>across experimental treatments</w:t>
-      </w:r>
-    </w:p>
-    <w:p>
-      <w:pPr>
-        <w:pStyle w:val="ListParagraph"/>
-        <w:numPr>
-          <w:ilvl w:val="4"/>
-          <w:numId w:val="3"/>
-        </w:numPr>
-        <w:spacing w:after="240"/>
-        <w:contextualSpacing w:val="0"/>
-        <w:rPr>
-          <w:rFonts w:ascii="Arial" w:hAnsi="Arial" w:cs="Arial"/>
-        </w:rPr>
-      </w:pPr>
-      <w:r>
-        <w:rPr>
-          <w:rFonts w:ascii="Arial" w:hAnsi="Arial" w:cs="Arial"/>
-        </w:rPr>
-        <w:t>Bayesian models should use the SPCC matrix values as input data</w:t>
-      </w:r>
-      <w:r>
-        <w:rPr>
-          <w:rFonts w:ascii="Arial" w:hAnsi="Arial" w:cs="Arial"/>
-        </w:rPr>
-        <w:t>, very similar to Mantel test</w:t>
-      </w:r>
-    </w:p>
-    <w:p>
-      <w:pPr>
-        <w:pStyle w:val="ListParagraph"/>
-        <w:numPr>
-          <w:ilvl w:val="5"/>
-          <w:numId w:val="3"/>
-        </w:numPr>
-        <w:spacing w:after="240"/>
-        <w:contextualSpacing w:val="0"/>
-        <w:rPr>
-          <w:rFonts w:ascii="Arial" w:hAnsi="Arial" w:cs="Arial"/>
-        </w:rPr>
-      </w:pPr>
-      <w:r>
-        <w:rPr>
-          <w:rFonts w:ascii="Arial" w:hAnsi="Arial" w:cs="Arial"/>
-        </w:rPr>
-        <w:t>Analysis questions: How similar are an individual’s calls to its own calls, compared to calls of other individuals? And the same for groups</w:t>
-      </w:r>
-    </w:p>
-    <w:p>
-      <w:pPr>
-        <w:pStyle w:val="ListParagraph"/>
-        <w:numPr>
-          <w:ilvl w:val="5"/>
-          <w:numId w:val="3"/>
-        </w:numPr>
-        <w:spacing w:after="240"/>
-        <w:contextualSpacing w:val="0"/>
-        <w:rPr>
-          <w:rFonts w:ascii="Arial" w:hAnsi="Arial" w:cs="Arial"/>
-        </w:rPr>
-      </w:pPr>
-      <w:r>
-        <w:rPr>
-          <w:rFonts w:ascii="Arial" w:hAnsi="Arial" w:cs="Arial"/>
-        </w:rPr>
-        <w:t xml:space="preserve">Consider using a Bayesian approach to </w:t>
-      </w:r>
-      <w:proofErr w:type="gramStart"/>
-      <w:r>
-        <w:rPr>
-          <w:rFonts w:ascii="Arial" w:hAnsi="Arial" w:cs="Arial"/>
-        </w:rPr>
-        <w:t>model based</w:t>
-      </w:r>
-      <w:proofErr w:type="gramEnd"/>
-      <w:r>
-        <w:rPr>
-          <w:rFonts w:ascii="Arial" w:hAnsi="Arial" w:cs="Arial"/>
-        </w:rPr>
-        <w:t xml:space="preserve"> clustering, since the analysis question </w:t>
-      </w:r>
-      <w:r>
-        <w:rPr>
-          <w:rFonts w:ascii="Arial" w:hAnsi="Arial" w:cs="Arial"/>
-        </w:rPr>
-        <w:lastRenderedPageBreak/>
-        <w:t xml:space="preserve">above is directly related to clustering. Use an approach that allows us to measure the posterior (read Ch. 13 in </w:t>
-      </w:r>
-      <w:proofErr w:type="spellStart"/>
-      <w:r>
-        <w:rPr>
-          <w:rFonts w:ascii="Arial" w:hAnsi="Arial" w:cs="Arial"/>
-        </w:rPr>
-        <w:t>McElreath</w:t>
-      </w:r>
-      <w:proofErr w:type="spellEnd"/>
-      <w:r>
-        <w:rPr>
-          <w:rFonts w:ascii="Arial" w:hAnsi="Arial" w:cs="Arial"/>
-        </w:rPr>
-        <w:t xml:space="preserve"> book) as the magnitude of acoustic convergence at each social level</w:t>
-      </w:r>
-      <w:r>
-        <w:rPr>
-          <w:rFonts w:ascii="Arial" w:hAnsi="Arial" w:cs="Arial"/>
-        </w:rPr>
-        <w:t xml:space="preserve"> (possibly the Ch. 14 and 15 as well)</w:t>
-      </w:r>
-    </w:p>
-    <w:p>
-      <w:pPr>
-        <w:pStyle w:val="ListParagraph"/>
-        <w:numPr>
-          <w:ilvl w:val="5"/>
-          <w:numId w:val="3"/>
-        </w:numPr>
-        <w:spacing w:after="240"/>
-        <w:contextualSpacing w:val="0"/>
-        <w:rPr>
-          <w:rFonts w:ascii="Arial" w:hAnsi="Arial" w:cs="Arial"/>
-        </w:rPr>
-      </w:pPr>
-      <w:r>
-        <w:rPr>
-          <w:rFonts w:ascii="Arial" w:hAnsi="Arial" w:cs="Arial"/>
-        </w:rPr>
-        <w:t>How to get SPCC values into non-independent format for multilevel models? Is MDS appropriate? Rather than standard handpicked acoustic ,measurements and then PCA</w:t>
-      </w:r>
-    </w:p>
-    <w:p>
-      <w:pPr>
-        <w:pStyle w:val="ListParagraph"/>
-        <w:numPr>
-          <w:ilvl w:val="4"/>
-          <w:numId w:val="3"/>
-        </w:numPr>
-        <w:spacing w:after="240"/>
-        <w:contextualSpacing w:val="0"/>
-        <w:rPr>
-          <w:rFonts w:ascii="Arial" w:hAnsi="Arial" w:cs="Arial"/>
-        </w:rPr>
-      </w:pPr>
-      <w:r>
-        <w:rPr>
-          <w:rFonts w:ascii="Arial" w:hAnsi="Arial" w:cs="Arial"/>
-        </w:rPr>
-        <w:t>These models allow us to address the statistical significance of the degree or magnitude of convergence</w:t>
-      </w:r>
-      <w:r>
-        <w:rPr>
-          <w:rFonts w:ascii="Arial" w:hAnsi="Arial" w:cs="Arial"/>
-        </w:rPr>
-        <w:t xml:space="preserve"> (which we originally encoded using </w:t>
-      </w:r>
-      <w:proofErr w:type="spellStart"/>
-      <w:r>
-        <w:rPr>
-          <w:rFonts w:ascii="Arial" w:hAnsi="Arial" w:cs="Arial"/>
-        </w:rPr>
-        <w:t>paRsynth</w:t>
-      </w:r>
-      <w:proofErr w:type="spellEnd"/>
-      <w:r>
-        <w:rPr>
-          <w:rFonts w:ascii="Arial" w:hAnsi="Arial" w:cs="Arial"/>
-        </w:rPr>
-        <w:t>)</w:t>
-      </w:r>
-      <w:r>
-        <w:rPr>
-          <w:rFonts w:ascii="Arial" w:hAnsi="Arial" w:cs="Arial"/>
-        </w:rPr>
-        <w:t>. The inferential statistics layer to validate that the information we originally encoded can be recov</w:t>
-      </w:r>
-      <w:r>
-        <w:rPr>
-          <w:rFonts w:ascii="Arial" w:hAnsi="Arial" w:cs="Arial"/>
-        </w:rPr>
-        <w:t>er</w:t>
-      </w:r>
-      <w:r>
-        <w:rPr>
-          <w:rFonts w:ascii="Arial" w:hAnsi="Arial" w:cs="Arial"/>
-        </w:rPr>
-        <w:t>ed</w:t>
-      </w:r>
-    </w:p>
-    <w:p>
-      <w:pPr>
-        <w:pStyle w:val="ListParagraph"/>
-        <w:numPr>
-          <w:ilvl w:val="4"/>
-          <w:numId w:val="3"/>
-        </w:numPr>
-        <w:spacing w:after="240"/>
-        <w:contextualSpacing w:val="0"/>
-        <w:rPr>
-          <w:rFonts w:ascii="Arial" w:hAnsi="Arial" w:cs="Arial"/>
-        </w:rPr>
-      </w:pPr>
-      <w:r>
-        <w:rPr>
-          <w:rFonts w:ascii="Arial" w:hAnsi="Arial" w:cs="Arial"/>
-        </w:rPr>
-        <w:t>A receiver standpoint on information recovery, in which we simulated signaler information encoding</w:t>
-      </w:r>
-      <w:r>
-        <w:rPr>
-          <w:rFonts w:ascii="Arial" w:hAnsi="Arial" w:cs="Arial"/>
-        </w:rPr>
-        <w:t xml:space="preserve">. Does the variation that we encoded </w:t>
-      </w:r>
-      <w:proofErr w:type="gramStart"/>
-      <w:r>
-        <w:rPr>
-          <w:rFonts w:ascii="Arial" w:hAnsi="Arial" w:cs="Arial"/>
-        </w:rPr>
-        <w:t>actually matter</w:t>
-      </w:r>
-      <w:proofErr w:type="gramEnd"/>
-      <w:r>
-        <w:rPr>
-          <w:rFonts w:ascii="Arial" w:hAnsi="Arial" w:cs="Arial"/>
-        </w:rPr>
-        <w:t>???</w:t>
-      </w:r>
-    </w:p>
-    <w:p>
-      <w:pPr>
-        <w:pStyle w:val="ListParagraph"/>
-        <w:numPr>
-          <w:ilvl w:val="3"/>
-          <w:numId w:val="3"/>
-        </w:numPr>
-        <w:spacing w:after="240"/>
-        <w:contextualSpacing w:val="0"/>
-        <w:rPr>
-          <w:rFonts w:ascii="Arial" w:hAnsi="Arial" w:cs="Arial"/>
-        </w:rPr>
-      </w:pPr>
-      <w:r>
-        <w:rPr>
-          <w:rFonts w:ascii="Arial" w:hAnsi="Arial" w:cs="Arial"/>
-        </w:rPr>
-        <w:t xml:space="preserve">Because we have repeated sampling at both social levels with known </w:t>
-      </w:r>
-      <w:r>
-        <w:rPr>
-          <w:rFonts w:ascii="Arial" w:hAnsi="Arial" w:cs="Arial"/>
-        </w:rPr>
-        <w:t xml:space="preserve">individuals, we can </w:t>
-      </w:r>
-      <w:proofErr w:type="gramStart"/>
-      <w:r>
-        <w:rPr>
-          <w:rFonts w:ascii="Arial" w:hAnsi="Arial" w:cs="Arial"/>
-        </w:rPr>
-        <w:t>actually model</w:t>
-      </w:r>
-      <w:proofErr w:type="gramEnd"/>
-      <w:r>
-        <w:rPr>
-          <w:rFonts w:ascii="Arial" w:hAnsi="Arial" w:cs="Arial"/>
-        </w:rPr>
-        <w:t xml:space="preserve"> variation in convergence within and between categories (individuals, groups) </w:t>
-      </w:r>
-      <w:r>
-        <w:rPr>
-          <w:rFonts w:ascii="Arial" w:hAnsi="Arial" w:cs="Arial"/>
-        </w:rPr>
-        <w:t>at each social level</w:t>
-      </w:r>
-    </w:p>
-    <w:p>
-      <w:pPr>
-        <w:pStyle w:val="ListParagraph"/>
-        <w:numPr>
-          <w:ilvl w:val="1"/>
-          <w:numId w:val="3"/>
-        </w:numPr>
-        <w:spacing w:after="240"/>
-        <w:contextualSpacing w:val="0"/>
-        <w:rPr>
-          <w:rFonts w:ascii="Arial" w:hAnsi="Arial" w:cs="Arial"/>
-        </w:rPr>
-      </w:pPr>
-      <w:r>
-        <w:rPr>
-          <w:rFonts w:ascii="Arial" w:hAnsi="Arial" w:cs="Arial"/>
-        </w:rPr>
-        <w:t>Frequency contour tracing</w:t>
-      </w:r>
-      <w:r>
-        <w:rPr>
-          <w:rFonts w:ascii="Arial" w:hAnsi="Arial" w:cs="Arial"/>
-        </w:rPr>
-        <w:t xml:space="preserve"> based</w:t>
-      </w:r>
-      <w:r>
-        <w:rPr>
-          <w:rFonts w:ascii="Arial" w:hAnsi="Arial" w:cs="Arial"/>
-        </w:rPr>
-        <w:t xml:space="preserve"> (</w:t>
-      </w:r>
-      <w:r>
-        <w:rPr>
-          <w:rFonts w:ascii="Arial" w:hAnsi="Arial" w:cs="Arial"/>
-        </w:rPr>
-        <w:t>b</w:t>
-      </w:r>
-      <w:r>
-        <w:rPr>
-          <w:rFonts w:ascii="Arial" w:hAnsi="Arial" w:cs="Arial"/>
-        </w:rPr>
-        <w:t>ecause we are encoding information in frequency modulation patterns</w:t>
-      </w:r>
-      <w:r>
-        <w:rPr>
-          <w:rFonts w:ascii="Arial" w:hAnsi="Arial" w:cs="Arial"/>
-        </w:rPr>
-        <w:t>)</w:t>
-      </w:r>
-    </w:p>
-    <w:p>
-      <w:pPr>
-        <w:pStyle w:val="ListParagraph"/>
-        <w:numPr>
-          <w:ilvl w:val="2"/>
-          <w:numId w:val="3"/>
-        </w:numPr>
-        <w:spacing w:after="240"/>
-        <w:contextualSpacing w:val="0"/>
-        <w:rPr>
-          <w:rFonts w:ascii="Arial" w:hAnsi="Arial" w:cs="Arial"/>
-        </w:rPr>
-      </w:pPr>
-      <w:r>
-        <w:rPr>
-          <w:rFonts w:ascii="Arial" w:hAnsi="Arial" w:cs="Arial"/>
-        </w:rPr>
-        <w:t>Frequency contour extraction</w:t>
-      </w:r>
-      <w:r>
-        <w:rPr>
-          <w:rFonts w:ascii="Arial" w:hAnsi="Arial" w:cs="Arial"/>
-        </w:rPr>
-        <w:t xml:space="preserve"> with semi-automated approaches</w:t>
-      </w:r>
-      <w:r>
-        <w:rPr>
-          <w:rFonts w:ascii="Arial" w:hAnsi="Arial" w:cs="Arial"/>
-        </w:rPr>
-        <w:t>: easily the hardest part of this pipeline because it can be very time-consuming and subjective</w:t>
-      </w:r>
-    </w:p>
-    <w:p>
-      <w:pPr>
-        <w:pStyle w:val="ListParagraph"/>
-        <w:numPr>
-          <w:ilvl w:val="3"/>
-          <w:numId w:val="3"/>
-        </w:numPr>
-        <w:spacing w:after="240"/>
-        <w:contextualSpacing w:val="0"/>
-        <w:rPr>
-          <w:rFonts w:ascii="Arial" w:hAnsi="Arial" w:cs="Arial"/>
-        </w:rPr>
-      </w:pPr>
-      <w:r>
-        <w:rPr>
-          <w:rFonts w:ascii="Arial" w:hAnsi="Arial" w:cs="Arial"/>
-        </w:rPr>
-        <w:t>We would only run this analysis with a subsample of the audio files and experimental treatments</w:t>
-      </w:r>
-    </w:p>
-    <w:p>
-      <w:pPr>
-        <w:pStyle w:val="ListParagraph"/>
-        <w:numPr>
-          <w:ilvl w:val="3"/>
-          <w:numId w:val="3"/>
-        </w:numPr>
-        <w:spacing w:after="240"/>
-        <w:contextualSpacing w:val="0"/>
-        <w:rPr>
-          <w:rFonts w:ascii="Arial" w:hAnsi="Arial" w:cs="Arial"/>
-        </w:rPr>
-      </w:pPr>
-      <w:r>
-        <w:rPr>
-          <w:rFonts w:ascii="Arial" w:hAnsi="Arial" w:cs="Arial"/>
-        </w:rPr>
-        <w:t>Pilot frequency contour tracing:</w:t>
-      </w:r>
-    </w:p>
-    <w:p>
-      <w:pPr>
-        <w:pStyle w:val="ListParagraph"/>
-        <w:numPr>
-          <w:ilvl w:val="4"/>
-          <w:numId w:val="3"/>
-        </w:numPr>
-        <w:spacing w:after="240"/>
-        <w:contextualSpacing w:val="0"/>
-        <w:rPr>
-          <w:rFonts w:ascii="Arial" w:hAnsi="Arial" w:cs="Arial"/>
-        </w:rPr>
-      </w:pPr>
-      <w:proofErr w:type="spellStart"/>
-      <w:proofErr w:type="gramStart"/>
-      <w:r>
-        <w:rPr>
-          <w:rFonts w:ascii="Arial" w:hAnsi="Arial" w:cs="Arial"/>
-        </w:rPr>
-        <w:t>soundgen</w:t>
-      </w:r>
-      <w:proofErr w:type="spellEnd"/>
-      <w:r>
-        <w:rPr>
-          <w:rFonts w:ascii="Arial" w:hAnsi="Arial" w:cs="Arial"/>
-        </w:rPr>
-        <w:t>::</w:t>
-      </w:r>
-      <w:proofErr w:type="spellStart"/>
-      <w:proofErr w:type="gramEnd"/>
-      <w:r>
-        <w:rPr>
-          <w:rFonts w:ascii="Arial" w:hAnsi="Arial" w:cs="Arial"/>
-        </w:rPr>
-        <w:t>soundgen</w:t>
-      </w:r>
-      <w:proofErr w:type="spellEnd"/>
-      <w:r>
-        <w:rPr>
-          <w:rFonts w:ascii="Arial" w:hAnsi="Arial" w:cs="Arial"/>
-        </w:rPr>
-        <w:t>()</w:t>
-      </w:r>
-      <w:r>
-        <w:rPr>
-          <w:rFonts w:ascii="Arial" w:hAnsi="Arial" w:cs="Arial"/>
-        </w:rPr>
-        <w:t>, test whether frequency contours are accurate</w:t>
-      </w:r>
-    </w:p>
-    <w:p>
-      <w:pPr>
-        <w:pStyle w:val="ListParagraph"/>
-        <w:numPr>
-          <w:ilvl w:val="4"/>
-          <w:numId w:val="3"/>
-        </w:numPr>
-        <w:spacing w:after="240"/>
-        <w:contextualSpacing w:val="0"/>
-        <w:rPr>
-          <w:rFonts w:ascii="Arial" w:hAnsi="Arial" w:cs="Arial"/>
-        </w:rPr>
-      </w:pPr>
-      <w:r>
-        <w:rPr>
-          <w:rFonts w:ascii="Arial" w:hAnsi="Arial" w:cs="Arial"/>
-        </w:rPr>
-        <w:t xml:space="preserve">Create spectrograms for 50 audio files, feed them to </w:t>
-      </w:r>
-      <w:proofErr w:type="spellStart"/>
-      <w:r>
-        <w:rPr>
-          <w:rFonts w:ascii="Arial" w:hAnsi="Arial" w:cs="Arial"/>
-        </w:rPr>
-        <w:t>soundgen</w:t>
-      </w:r>
-      <w:proofErr w:type="spellEnd"/>
-      <w:r>
-        <w:rPr>
-          <w:rFonts w:ascii="Arial" w:hAnsi="Arial" w:cs="Arial"/>
-        </w:rPr>
-        <w:t xml:space="preserve"> using code that Grace has already to pull out the estimated fundamental frequency contour, </w:t>
-      </w:r>
-      <w:r>
-        <w:rPr>
-          <w:rFonts w:ascii="Arial" w:hAnsi="Arial" w:cs="Arial"/>
-        </w:rPr>
-        <w:lastRenderedPageBreak/>
-        <w:t>create spectrograms again with the frequency contour overlaid to check the accuracy of the tracing</w:t>
-      </w:r>
-    </w:p>
-    <w:p>
-      <w:pPr>
-        <w:pStyle w:val="ListParagraph"/>
-        <w:numPr>
-          <w:ilvl w:val="5"/>
-          <w:numId w:val="3"/>
-        </w:numPr>
-        <w:spacing w:after="240"/>
-        <w:contextualSpacing w:val="0"/>
-        <w:rPr>
-          <w:rFonts w:ascii="Arial" w:hAnsi="Arial" w:cs="Arial"/>
-        </w:rPr>
-      </w:pPr>
-      <w:r>
-        <w:rPr>
-          <w:rFonts w:ascii="Arial" w:hAnsi="Arial" w:cs="Arial"/>
-        </w:rPr>
-        <w:t>When I’ve done the latter in warbler the frequency contours are always off</w:t>
-      </w:r>
-    </w:p>
-    <w:p>
-      <w:pPr>
-        <w:pStyle w:val="ListParagraph"/>
-        <w:numPr>
-          <w:ilvl w:val="5"/>
-          <w:numId w:val="3"/>
-        </w:numPr>
-        <w:spacing w:after="240"/>
-        <w:contextualSpacing w:val="0"/>
-        <w:rPr>
-          <w:rFonts w:ascii="Arial" w:hAnsi="Arial" w:cs="Arial"/>
-        </w:rPr>
-      </w:pPr>
-      <w:r>
-        <w:rPr>
-          <w:rFonts w:ascii="Arial" w:hAnsi="Arial" w:cs="Arial"/>
-        </w:rPr>
-        <w:t xml:space="preserve">But when I create spectrograms in </w:t>
-      </w:r>
-      <w:proofErr w:type="spellStart"/>
-      <w:r>
-        <w:rPr>
-          <w:rFonts w:ascii="Arial" w:hAnsi="Arial" w:cs="Arial"/>
-        </w:rPr>
-        <w:t>soundgen</w:t>
-      </w:r>
-      <w:proofErr w:type="spellEnd"/>
-      <w:r>
-        <w:rPr>
-          <w:rFonts w:ascii="Arial" w:hAnsi="Arial" w:cs="Arial"/>
-        </w:rPr>
-        <w:t>, the contours look great</w:t>
-      </w:r>
-    </w:p>
-    <w:p>
-      <w:pPr>
-        <w:pStyle w:val="ListParagraph"/>
-        <w:numPr>
-          <w:ilvl w:val="4"/>
-          <w:numId w:val="3"/>
-        </w:numPr>
-        <w:spacing w:after="240"/>
-        <w:contextualSpacing w:val="0"/>
-        <w:rPr>
-          <w:rFonts w:ascii="Arial" w:hAnsi="Arial" w:cs="Arial"/>
-        </w:rPr>
-      </w:pPr>
-      <w:proofErr w:type="spellStart"/>
-      <w:r>
-        <w:rPr>
-          <w:rFonts w:ascii="Arial" w:hAnsi="Arial" w:cs="Arial"/>
-        </w:rPr>
-        <w:t>Soundgen</w:t>
-      </w:r>
-      <w:proofErr w:type="spellEnd"/>
-      <w:r>
-        <w:rPr>
-          <w:rFonts w:ascii="Arial" w:hAnsi="Arial" w:cs="Arial"/>
-        </w:rPr>
-        <w:t xml:space="preserve"> has a Shiny app in which you can upload audio files and do manual correction of the frequency contour online</w:t>
-      </w:r>
-      <w:r>
-        <w:rPr>
-          <w:rFonts w:ascii="Arial" w:hAnsi="Arial" w:cs="Arial"/>
-        </w:rPr>
-        <w:t xml:space="preserve"> (semi-automated)</w:t>
-      </w:r>
-    </w:p>
-    <w:p>
-      <w:pPr>
-        <w:pStyle w:val="ListParagraph"/>
-        <w:numPr>
-          <w:ilvl w:val="2"/>
-          <w:numId w:val="3"/>
-        </w:numPr>
-        <w:spacing w:after="240"/>
-        <w:contextualSpacing w:val="0"/>
-        <w:rPr>
-          <w:rFonts w:ascii="Arial" w:hAnsi="Arial" w:cs="Arial"/>
-        </w:rPr>
-      </w:pPr>
-      <w:r>
-        <w:rPr>
-          <w:rFonts w:ascii="Arial" w:hAnsi="Arial" w:cs="Arial"/>
-        </w:rPr>
-        <w:t>Dynamic time warping</w:t>
-      </w:r>
-      <w:r>
-        <w:rPr>
-          <w:rFonts w:ascii="Arial" w:hAnsi="Arial" w:cs="Arial"/>
-        </w:rPr>
-        <w:t xml:space="preserve"> (DTW)</w:t>
-      </w:r>
-      <w:r>
-        <w:rPr>
-          <w:rFonts w:ascii="Arial" w:hAnsi="Arial" w:cs="Arial"/>
-        </w:rPr>
-        <w:t xml:space="preserve"> to compare the time series of the frequency contours</w:t>
-      </w:r>
-    </w:p>
-    <w:p>
-      <w:pPr>
-        <w:pStyle w:val="ListParagraph"/>
-        <w:numPr>
-          <w:ilvl w:val="3"/>
-          <w:numId w:val="3"/>
-        </w:numPr>
-        <w:spacing w:after="240"/>
-        <w:contextualSpacing w:val="0"/>
-        <w:rPr>
-          <w:rFonts w:ascii="Arial" w:hAnsi="Arial" w:cs="Arial"/>
-        </w:rPr>
-      </w:pPr>
-      <w:r>
-        <w:rPr>
-          <w:rFonts w:ascii="Arial" w:hAnsi="Arial" w:cs="Arial"/>
-        </w:rPr>
-        <w:t xml:space="preserve">Run </w:t>
-      </w:r>
-      <w:r>
-        <w:rPr>
-          <w:rFonts w:ascii="Arial" w:hAnsi="Arial" w:cs="Arial"/>
-        </w:rPr>
-        <w:t xml:space="preserve">univariate </w:t>
-      </w:r>
-      <w:r>
-        <w:rPr>
-          <w:rFonts w:ascii="Arial" w:hAnsi="Arial" w:cs="Arial"/>
-        </w:rPr>
-        <w:t>DTW</w:t>
-      </w:r>
-      <w:r>
-        <w:rPr>
-          <w:rFonts w:ascii="Arial" w:hAnsi="Arial" w:cs="Arial"/>
-        </w:rPr>
-        <w:t xml:space="preserve"> on the fundamental frequency contours</w:t>
-      </w:r>
-      <w:r>
-        <w:rPr>
-          <w:rFonts w:ascii="Arial" w:hAnsi="Arial" w:cs="Arial"/>
-        </w:rPr>
-        <w:t xml:space="preserve"> using code that Grace has </w:t>
-      </w:r>
-      <w:r>
-        <w:rPr>
-          <w:rFonts w:ascii="Arial" w:hAnsi="Arial" w:cs="Arial"/>
-        </w:rPr>
-        <w:t xml:space="preserve">used with the </w:t>
-      </w:r>
-      <w:proofErr w:type="spellStart"/>
-      <w:r>
-        <w:rPr>
-          <w:rFonts w:ascii="Arial" w:hAnsi="Arial" w:cs="Arial"/>
-        </w:rPr>
-        <w:t>dtw</w:t>
-      </w:r>
-      <w:proofErr w:type="spellEnd"/>
-      <w:r>
-        <w:rPr>
-          <w:rFonts w:ascii="Arial" w:hAnsi="Arial" w:cs="Arial"/>
-        </w:rPr>
-        <w:t xml:space="preserve"> package in R</w:t>
-      </w:r>
-    </w:p>
-    <w:p>
-      <w:pPr>
-        <w:pStyle w:val="ListParagraph"/>
-        <w:numPr>
-          <w:ilvl w:val="3"/>
-          <w:numId w:val="3"/>
-        </w:numPr>
-        <w:spacing w:after="240"/>
-        <w:contextualSpacing w:val="0"/>
-        <w:rPr>
-          <w:rFonts w:ascii="Arial" w:hAnsi="Arial" w:cs="Arial"/>
-        </w:rPr>
-      </w:pPr>
-      <w:r>
-        <w:rPr>
-          <w:rFonts w:ascii="Arial" w:hAnsi="Arial" w:cs="Arial"/>
-        </w:rPr>
-        <w:t>Returns a distance matrix that can be used in downstream analysis</w:t>
-      </w:r>
-    </w:p>
-    <w:p>
-      <w:pPr>
-        <w:pStyle w:val="ListParagraph"/>
-        <w:numPr>
-          <w:ilvl w:val="2"/>
-          <w:numId w:val="3"/>
-        </w:numPr>
-        <w:spacing w:after="240"/>
-        <w:contextualSpacing w:val="0"/>
-        <w:rPr>
-          <w:rFonts w:ascii="Arial" w:hAnsi="Arial" w:cs="Arial"/>
-        </w:rPr>
-      </w:pPr>
-      <w:r>
-        <w:rPr>
-          <w:rFonts w:ascii="Arial" w:hAnsi="Arial" w:cs="Arial"/>
-        </w:rPr>
-        <w:t>Multi-dimensional scaling acoustic space, clustering and Normalized Mutual Information</w:t>
-      </w:r>
-      <w:r>
-        <w:rPr>
-          <w:rFonts w:ascii="Arial" w:hAnsi="Arial" w:cs="Arial"/>
-        </w:rPr>
-        <w:t xml:space="preserve">, </w:t>
-      </w:r>
-      <w:r>
-        <w:rPr>
-          <w:rFonts w:ascii="Arial" w:hAnsi="Arial" w:cs="Arial"/>
-        </w:rPr>
-        <w:t xml:space="preserve">Bayesian hierarchical </w:t>
-      </w:r>
-      <w:r>
-        <w:rPr>
-          <w:rFonts w:ascii="Arial" w:hAnsi="Arial" w:cs="Arial"/>
-        </w:rPr>
-        <w:t>models</w:t>
-      </w:r>
-    </w:p>
-    <w:p>
-      <w:pPr>
-        <w:pStyle w:val="ListParagraph"/>
-        <w:numPr>
-          <w:ilvl w:val="3"/>
-          <w:numId w:val="3"/>
-        </w:numPr>
-        <w:spacing w:after="240"/>
-        <w:contextualSpacing w:val="0"/>
-        <w:rPr>
-          <w:rFonts w:ascii="Arial" w:hAnsi="Arial" w:cs="Arial"/>
-        </w:rPr>
-      </w:pPr>
-      <w:r>
-        <w:rPr>
-          <w:rFonts w:ascii="Arial" w:hAnsi="Arial" w:cs="Arial"/>
-        </w:rPr>
-        <w:t xml:space="preserve">This part of the pipeline will be really </w:t>
-      </w:r>
-      <w:proofErr w:type="gramStart"/>
-      <w:r>
-        <w:rPr>
-          <w:rFonts w:ascii="Arial" w:hAnsi="Arial" w:cs="Arial"/>
-        </w:rPr>
-        <w:t>similar to</w:t>
-      </w:r>
-      <w:proofErr w:type="gramEnd"/>
-      <w:r>
-        <w:rPr>
-          <w:rFonts w:ascii="Arial" w:hAnsi="Arial" w:cs="Arial"/>
-        </w:rPr>
-        <w:t xml:space="preserve"> the SPCC pipeline above</w:t>
+        <w:t>This part of the pipeline will be really similar to the SPCC pipeline above</w:t>
       </w:r>
     </w:p>
     <w:p>
@@ -2790,7 +3096,7 @@
         <w:ind w:left="4320" w:hanging="180"/>
       </w:pPr>
     </w:lvl>
-    <w:lvl w:ilvl="6" w:tplc="0409000F" w:tentative="1">
+    <w:lvl w:ilvl="6" w:tplc="0409000F">
       <w:start w:val="1"/>
       <w:numFmt w:val="decimal"/>
       <w:lvlText w:val="%7."/>
@@ -2799,7 +3105,7 @@
         <w:ind w:left="5040" w:hanging="360"/>
       </w:pPr>
     </w:lvl>
-    <w:lvl w:ilvl="7" w:tplc="04090019" w:tentative="1">
+    <w:lvl w:ilvl="7" w:tplc="04090019">
       <w:start w:val="1"/>
       <w:numFmt w:val="lowerLetter"/>
       <w:lvlText w:val="%8."/>

</xml_diff>